<commit_message>
Added agg further code
</commit_message>
<xml_diff>
--- a/BycatchEstimator_App_User_Guide.docx
+++ b/BycatchEstimator_App_User_Guide.docx
@@ -201,7 +201,7 @@
           <w:r>
             <w:fldChar w:fldCharType="separate"/>
           </w:r>
-          <w:hyperlink w:anchor="_Toc243047552" w:history="1">
+          <w:hyperlink w:anchor="_Toc244093384" w:history="1">
             <w:r>
               <w:rPr>
                 <w:rStyle w:val="Hyperlink"/>
@@ -225,7 +225,7 @@
               <w:rPr>
                 <w:noProof/>
               </w:rPr>
-              <w:instrText xml:space="preserve"> PAGEREF _Toc243047552 \h </w:instrText>
+              <w:instrText xml:space="preserve"> PAGEREF _Toc244093384 \h </w:instrText>
             </w:r>
             <w:r>
               <w:rPr>
@@ -267,7 +267,7 @@
               <w14:ligatures w14:val="standardContextual"/>
             </w:rPr>
           </w:pPr>
-          <w:hyperlink w:anchor="_Toc243047553" w:history="1">
+          <w:hyperlink w:anchor="_Toc244093385" w:history="1">
             <w:r>
               <w:rPr>
                 <w:rStyle w:val="Hyperlink"/>
@@ -291,7 +291,7 @@
               <w:rPr>
                 <w:noProof/>
               </w:rPr>
-              <w:instrText xml:space="preserve"> PAGEREF _Toc243047553 \h </w:instrText>
+              <w:instrText xml:space="preserve"> PAGEREF _Toc244093385 \h </w:instrText>
             </w:r>
             <w:r>
               <w:rPr>
@@ -333,7 +333,7 @@
               <w14:ligatures w14:val="standardContextual"/>
             </w:rPr>
           </w:pPr>
-          <w:hyperlink w:anchor="_Toc243047554" w:history="1">
+          <w:hyperlink w:anchor="_Toc244093386" w:history="1">
             <w:r>
               <w:rPr>
                 <w:rStyle w:val="Hyperlink"/>
@@ -357,7 +357,7 @@
               <w:rPr>
                 <w:noProof/>
               </w:rPr>
-              <w:instrText xml:space="preserve"> PAGEREF _Toc243047554 \h </w:instrText>
+              <w:instrText xml:space="preserve"> PAGEREF _Toc244093386 \h </w:instrText>
             </w:r>
             <w:r>
               <w:rPr>
@@ -399,7 +399,7 @@
               <w14:ligatures w14:val="standardContextual"/>
             </w:rPr>
           </w:pPr>
-          <w:hyperlink w:anchor="_Toc243047555" w:history="1">
+          <w:hyperlink w:anchor="_Toc244093387" w:history="1">
             <w:r>
               <w:rPr>
                 <w:rStyle w:val="Hyperlink"/>
@@ -423,7 +423,7 @@
               <w:rPr>
                 <w:noProof/>
               </w:rPr>
-              <w:instrText xml:space="preserve"> PAGEREF _Toc243047555 \h </w:instrText>
+              <w:instrText xml:space="preserve"> PAGEREF _Toc244093387 \h </w:instrText>
             </w:r>
             <w:r>
               <w:rPr>
@@ -465,7 +465,7 @@
               <w14:ligatures w14:val="standardContextual"/>
             </w:rPr>
           </w:pPr>
-          <w:hyperlink w:anchor="_Toc243047556" w:history="1">
+          <w:hyperlink w:anchor="_Toc244093388" w:history="1">
             <w:r>
               <w:rPr>
                 <w:rStyle w:val="Hyperlink"/>
@@ -489,7 +489,7 @@
               <w:rPr>
                 <w:noProof/>
               </w:rPr>
-              <w:instrText xml:space="preserve"> PAGEREF _Toc243047556 \h </w:instrText>
+              <w:instrText xml:space="preserve"> PAGEREF _Toc244093388 \h </w:instrText>
             </w:r>
             <w:r>
               <w:rPr>
@@ -531,7 +531,7 @@
               <w14:ligatures w14:val="standardContextual"/>
             </w:rPr>
           </w:pPr>
-          <w:hyperlink w:anchor="_Toc243047557" w:history="1">
+          <w:hyperlink w:anchor="_Toc244093389" w:history="1">
             <w:r>
               <w:rPr>
                 <w:rStyle w:val="Hyperlink"/>
@@ -555,7 +555,7 @@
               <w:rPr>
                 <w:noProof/>
               </w:rPr>
-              <w:instrText xml:space="preserve"> PAGEREF _Toc243047557 \h </w:instrText>
+              <w:instrText xml:space="preserve"> PAGEREF _Toc244093389 \h </w:instrText>
             </w:r>
             <w:r>
               <w:rPr>
@@ -597,7 +597,7 @@
               <w14:ligatures w14:val="standardContextual"/>
             </w:rPr>
           </w:pPr>
-          <w:hyperlink w:anchor="_Toc243047558" w:history="1">
+          <w:hyperlink w:anchor="_Toc244093390" w:history="1">
             <w:r>
               <w:rPr>
                 <w:rStyle w:val="Hyperlink"/>
@@ -621,7 +621,7 @@
               <w:rPr>
                 <w:noProof/>
               </w:rPr>
-              <w:instrText xml:space="preserve"> PAGEREF _Toc243047558 \h </w:instrText>
+              <w:instrText xml:space="preserve"> PAGEREF _Toc244093390 \h </w:instrText>
             </w:r>
             <w:r>
               <w:rPr>
@@ -663,7 +663,7 @@
               <w14:ligatures w14:val="standardContextual"/>
             </w:rPr>
           </w:pPr>
-          <w:hyperlink w:anchor="_Toc243047559" w:history="1">
+          <w:hyperlink w:anchor="_Toc244093391" w:history="1">
             <w:r>
               <w:rPr>
                 <w:rStyle w:val="Hyperlink"/>
@@ -687,7 +687,7 @@
               <w:rPr>
                 <w:noProof/>
               </w:rPr>
-              <w:instrText xml:space="preserve"> PAGEREF _Toc243047559 \h </w:instrText>
+              <w:instrText xml:space="preserve"> PAGEREF _Toc244093391 \h </w:instrText>
             </w:r>
             <w:r>
               <w:rPr>
@@ -729,7 +729,7 @@
               <w14:ligatures w14:val="standardContextual"/>
             </w:rPr>
           </w:pPr>
-          <w:hyperlink w:anchor="_Toc243047560" w:history="1">
+          <w:hyperlink w:anchor="_Toc244093392" w:history="1">
             <w:r>
               <w:rPr>
                 <w:rStyle w:val="Hyperlink"/>
@@ -753,7 +753,7 @@
               <w:rPr>
                 <w:noProof/>
               </w:rPr>
-              <w:instrText xml:space="preserve"> PAGEREF _Toc243047560 \h </w:instrText>
+              <w:instrText xml:space="preserve"> PAGEREF _Toc244093392 \h </w:instrText>
             </w:r>
             <w:r>
               <w:rPr>
@@ -795,7 +795,7 @@
               <w14:ligatures w14:val="standardContextual"/>
             </w:rPr>
           </w:pPr>
-          <w:hyperlink w:anchor="_Toc243047561" w:history="1">
+          <w:hyperlink w:anchor="_Toc244093393" w:history="1">
             <w:r>
               <w:rPr>
                 <w:rStyle w:val="Hyperlink"/>
@@ -819,7 +819,7 @@
               <w:rPr>
                 <w:noProof/>
               </w:rPr>
-              <w:instrText xml:space="preserve"> PAGEREF _Toc243047561 \h </w:instrText>
+              <w:instrText xml:space="preserve"> PAGEREF _Toc244093393 \h </w:instrText>
             </w:r>
             <w:r>
               <w:rPr>
@@ -861,7 +861,7 @@
               <w14:ligatures w14:val="standardContextual"/>
             </w:rPr>
           </w:pPr>
-          <w:hyperlink w:anchor="_Toc243047562" w:history="1">
+          <w:hyperlink w:anchor="_Toc244093394" w:history="1">
             <w:r>
               <w:rPr>
                 <w:rStyle w:val="Hyperlink"/>
@@ -885,7 +885,7 @@
               <w:rPr>
                 <w:noProof/>
               </w:rPr>
-              <w:instrText xml:space="preserve"> PAGEREF _Toc243047562 \h </w:instrText>
+              <w:instrText xml:space="preserve"> PAGEREF _Toc244093394 \h </w:instrText>
             </w:r>
             <w:r>
               <w:rPr>
@@ -927,7 +927,7 @@
               <w14:ligatures w14:val="standardContextual"/>
             </w:rPr>
           </w:pPr>
-          <w:hyperlink w:anchor="_Toc243047563" w:history="1">
+          <w:hyperlink w:anchor="_Toc244093395" w:history="1">
             <w:r>
               <w:rPr>
                 <w:rStyle w:val="Hyperlink"/>
@@ -951,7 +951,7 @@
               <w:rPr>
                 <w:noProof/>
               </w:rPr>
-              <w:instrText xml:space="preserve"> PAGEREF _Toc243047563 \h </w:instrText>
+              <w:instrText xml:space="preserve"> PAGEREF _Toc244093395 \h </w:instrText>
             </w:r>
             <w:r>
               <w:rPr>
@@ -993,7 +993,7 @@
               <w14:ligatures w14:val="standardContextual"/>
             </w:rPr>
           </w:pPr>
-          <w:hyperlink w:anchor="_Toc243047564" w:history="1">
+          <w:hyperlink w:anchor="_Toc244093396" w:history="1">
             <w:r>
               <w:rPr>
                 <w:rStyle w:val="Hyperlink"/>
@@ -1017,7 +1017,7 @@
               <w:rPr>
                 <w:noProof/>
               </w:rPr>
-              <w:instrText xml:space="preserve"> PAGEREF _Toc243047564 \h </w:instrText>
+              <w:instrText xml:space="preserve"> PAGEREF _Toc244093396 \h </w:instrText>
             </w:r>
             <w:r>
               <w:rPr>
@@ -1059,7 +1059,7 @@
               <w14:ligatures w14:val="standardContextual"/>
             </w:rPr>
           </w:pPr>
-          <w:hyperlink w:anchor="_Toc243047565" w:history="1">
+          <w:hyperlink w:anchor="_Toc244093397" w:history="1">
             <w:r>
               <w:rPr>
                 <w:rStyle w:val="Hyperlink"/>
@@ -1083,7 +1083,7 @@
               <w:rPr>
                 <w:noProof/>
               </w:rPr>
-              <w:instrText xml:space="preserve"> PAGEREF _Toc243047565 \h </w:instrText>
+              <w:instrText xml:space="preserve"> PAGEREF _Toc244093397 \h </w:instrText>
             </w:r>
             <w:r>
               <w:rPr>
@@ -1125,7 +1125,7 @@
               <w14:ligatures w14:val="standardContextual"/>
             </w:rPr>
           </w:pPr>
-          <w:hyperlink w:anchor="_Toc243047566" w:history="1">
+          <w:hyperlink w:anchor="_Toc244093398" w:history="1">
             <w:r>
               <w:rPr>
                 <w:rStyle w:val="Hyperlink"/>
@@ -1149,7 +1149,7 @@
               <w:rPr>
                 <w:noProof/>
               </w:rPr>
-              <w:instrText xml:space="preserve"> PAGEREF _Toc243047566 \h </w:instrText>
+              <w:instrText xml:space="preserve"> PAGEREF _Toc244093398 \h </w:instrText>
             </w:r>
             <w:r>
               <w:rPr>
@@ -1191,7 +1191,7 @@
               <w14:ligatures w14:val="standardContextual"/>
             </w:rPr>
           </w:pPr>
-          <w:hyperlink w:anchor="_Toc243047567" w:history="1">
+          <w:hyperlink w:anchor="_Toc244093399" w:history="1">
             <w:r>
               <w:rPr>
                 <w:rStyle w:val="Hyperlink"/>
@@ -1215,7 +1215,7 @@
               <w:rPr>
                 <w:noProof/>
               </w:rPr>
-              <w:instrText xml:space="preserve"> PAGEREF _Toc243047567 \h </w:instrText>
+              <w:instrText xml:space="preserve"> PAGEREF _Toc244093399 \h </w:instrText>
             </w:r>
             <w:r>
               <w:rPr>
@@ -1257,7 +1257,7 @@
               <w14:ligatures w14:val="standardContextual"/>
             </w:rPr>
           </w:pPr>
-          <w:hyperlink w:anchor="_Toc243047568" w:history="1">
+          <w:hyperlink w:anchor="_Toc244093400" w:history="1">
             <w:r>
               <w:rPr>
                 <w:rStyle w:val="Hyperlink"/>
@@ -1281,7 +1281,7 @@
               <w:rPr>
                 <w:noProof/>
               </w:rPr>
-              <w:instrText xml:space="preserve"> PAGEREF _Toc243047568 \h </w:instrText>
+              <w:instrText xml:space="preserve"> PAGEREF _Toc244093400 \h </w:instrText>
             </w:r>
             <w:r>
               <w:rPr>
@@ -1324,7 +1324,7 @@
               <w14:ligatures w14:val="standardContextual"/>
             </w:rPr>
           </w:pPr>
-          <w:hyperlink w:anchor="_Toc243047569" w:history="1">
+          <w:hyperlink w:anchor="_Toc244093401" w:history="1">
             <w:r>
               <w:rPr>
                 <w:rStyle w:val="Hyperlink"/>
@@ -1366,7 +1366,7 @@
               <w:rPr>
                 <w:noProof/>
               </w:rPr>
-              <w:instrText xml:space="preserve"> PAGEREF _Toc243047569 \h </w:instrText>
+              <w:instrText xml:space="preserve"> PAGEREF _Toc244093401 \h </w:instrText>
             </w:r>
             <w:r>
               <w:rPr>
@@ -1408,7 +1408,7 @@
               <w14:ligatures w14:val="standardContextual"/>
             </w:rPr>
           </w:pPr>
-          <w:hyperlink w:anchor="_Toc243047570" w:history="1">
+          <w:hyperlink w:anchor="_Toc244093402" w:history="1">
             <w:r>
               <w:rPr>
                 <w:rStyle w:val="Hyperlink"/>
@@ -1432,7 +1432,7 @@
               <w:rPr>
                 <w:noProof/>
               </w:rPr>
-              <w:instrText xml:space="preserve"> PAGEREF _Toc243047570 \h </w:instrText>
+              <w:instrText xml:space="preserve"> PAGEREF _Toc244093402 \h </w:instrText>
             </w:r>
             <w:r>
               <w:rPr>
@@ -1474,7 +1474,7 @@
               <w14:ligatures w14:val="standardContextual"/>
             </w:rPr>
           </w:pPr>
-          <w:hyperlink w:anchor="_Toc243047571" w:history="1">
+          <w:hyperlink w:anchor="_Toc244093403" w:history="1">
             <w:r>
               <w:rPr>
                 <w:rStyle w:val="Hyperlink"/>
@@ -1498,7 +1498,7 @@
               <w:rPr>
                 <w:noProof/>
               </w:rPr>
-              <w:instrText xml:space="preserve"> PAGEREF _Toc243047571 \h </w:instrText>
+              <w:instrText xml:space="preserve"> PAGEREF _Toc244093403 \h </w:instrText>
             </w:r>
             <w:r>
               <w:rPr>
@@ -1515,7 +1515,13 @@
               <w:rPr>
                 <w:noProof/>
               </w:rPr>
-              <w:t>20</w:t>
+              <w:t>2</w:t>
+            </w:r>
+            <w:r>
+              <w:rPr>
+                <w:noProof/>
+              </w:rPr>
+              <w:t>0</w:t>
             </w:r>
             <w:r>
               <w:rPr>
@@ -1540,7 +1546,7 @@
               <w14:ligatures w14:val="standardContextual"/>
             </w:rPr>
           </w:pPr>
-          <w:hyperlink w:anchor="_Toc243047572" w:history="1">
+          <w:hyperlink w:anchor="_Toc244093404" w:history="1">
             <w:r>
               <w:rPr>
                 <w:rStyle w:val="Hyperlink"/>
@@ -1564,7 +1570,7 @@
               <w:rPr>
                 <w:noProof/>
               </w:rPr>
-              <w:instrText xml:space="preserve"> PAGEREF _Toc243047572 \h </w:instrText>
+              <w:instrText xml:space="preserve"> PAGEREF _Toc244093404 \h </w:instrText>
             </w:r>
             <w:r>
               <w:rPr>
@@ -1606,7 +1612,7 @@
               <w14:ligatures w14:val="standardContextual"/>
             </w:rPr>
           </w:pPr>
-          <w:hyperlink w:anchor="_Toc243047573" w:history="1">
+          <w:hyperlink w:anchor="_Toc244093405" w:history="1">
             <w:r>
               <w:rPr>
                 <w:rStyle w:val="Hyperlink"/>
@@ -1630,7 +1636,7 @@
               <w:rPr>
                 <w:noProof/>
               </w:rPr>
-              <w:instrText xml:space="preserve"> PAGEREF _Toc243047573 \h </w:instrText>
+              <w:instrText xml:space="preserve"> PAGEREF _Toc244093405 \h </w:instrText>
             </w:r>
             <w:r>
               <w:rPr>
@@ -1672,7 +1678,7 @@
               <w14:ligatures w14:val="standardContextual"/>
             </w:rPr>
           </w:pPr>
-          <w:hyperlink w:anchor="_Toc243047574" w:history="1">
+          <w:hyperlink w:anchor="_Toc244093406" w:history="1">
             <w:r>
               <w:rPr>
                 <w:rStyle w:val="Hyperlink"/>
@@ -1696,7 +1702,7 @@
               <w:rPr>
                 <w:noProof/>
               </w:rPr>
-              <w:instrText xml:space="preserve"> PAGEREF _Toc243047574 \h </w:instrText>
+              <w:instrText xml:space="preserve"> PAGEREF _Toc244093406 \h </w:instrText>
             </w:r>
             <w:r>
               <w:rPr>
@@ -1738,7 +1744,7 @@
               <w14:ligatures w14:val="standardContextual"/>
             </w:rPr>
           </w:pPr>
-          <w:hyperlink w:anchor="_Toc243047575" w:history="1">
+          <w:hyperlink w:anchor="_Toc244093407" w:history="1">
             <w:r>
               <w:rPr>
                 <w:rStyle w:val="Hyperlink"/>
@@ -1762,7 +1768,7 @@
               <w:rPr>
                 <w:noProof/>
               </w:rPr>
-              <w:instrText xml:space="preserve"> PAGEREF _Toc243047575 \h </w:instrText>
+              <w:instrText xml:space="preserve"> PAGEREF _Toc244093407 \h </w:instrText>
             </w:r>
             <w:r>
               <w:rPr>
@@ -1804,7 +1810,7 @@
               <w14:ligatures w14:val="standardContextual"/>
             </w:rPr>
           </w:pPr>
-          <w:hyperlink w:anchor="_Toc243047576" w:history="1">
+          <w:hyperlink w:anchor="_Toc244093408" w:history="1">
             <w:r>
               <w:rPr>
                 <w:rStyle w:val="Hyperlink"/>
@@ -1828,7 +1834,7 @@
               <w:rPr>
                 <w:noProof/>
               </w:rPr>
-              <w:instrText xml:space="preserve"> PAGEREF _Toc243047576 \h </w:instrText>
+              <w:instrText xml:space="preserve"> PAGEREF _Toc244093408 \h </w:instrText>
             </w:r>
             <w:r>
               <w:rPr>
@@ -1870,7 +1876,7 @@
               <w14:ligatures w14:val="standardContextual"/>
             </w:rPr>
           </w:pPr>
-          <w:hyperlink w:anchor="_Toc243047577" w:history="1">
+          <w:hyperlink w:anchor="_Toc244093409" w:history="1">
             <w:r>
               <w:rPr>
                 <w:rStyle w:val="Hyperlink"/>
@@ -1894,7 +1900,7 @@
               <w:rPr>
                 <w:noProof/>
               </w:rPr>
-              <w:instrText xml:space="preserve"> PAGEREF _Toc243047577 \h </w:instrText>
+              <w:instrText xml:space="preserve"> PAGEREF _Toc244093409 \h </w:instrText>
             </w:r>
             <w:r>
               <w:rPr>
@@ -1936,7 +1942,7 @@
               <w14:ligatures w14:val="standardContextual"/>
             </w:rPr>
           </w:pPr>
-          <w:hyperlink w:anchor="_Toc243047578" w:history="1">
+          <w:hyperlink w:anchor="_Toc244093410" w:history="1">
             <w:r>
               <w:rPr>
                 <w:rStyle w:val="Hyperlink"/>
@@ -1960,7 +1966,7 @@
               <w:rPr>
                 <w:noProof/>
               </w:rPr>
-              <w:instrText xml:space="preserve"> PAGEREF _Toc243047578 \h </w:instrText>
+              <w:instrText xml:space="preserve"> PAGEREF _Toc244093410 \h </w:instrText>
             </w:r>
             <w:r>
               <w:rPr>
@@ -2003,7 +2009,7 @@
       <w:pPr>
         <w:pStyle w:val="Heading1"/>
       </w:pPr>
-      <w:bookmarkStart w:id="0" w:name="_Toc243047552"/>
+      <w:bookmarkStart w:id="0" w:name="_Toc244093384"/>
       <w:r>
         <w:lastRenderedPageBreak/>
         <w:t>1. Introduction</w:t>
@@ -2014,7 +2020,7 @@
       <w:pPr>
         <w:pStyle w:val="Heading2"/>
       </w:pPr>
-      <w:bookmarkStart w:id="1" w:name="_Toc243047553"/>
+      <w:bookmarkStart w:id="1" w:name="_Toc244093385"/>
       <w:r>
         <w:t>1.1 About this guide</w:t>
       </w:r>
@@ -2170,7 +2176,7 @@
       <w:pPr>
         <w:pStyle w:val="Heading2"/>
       </w:pPr>
-      <w:bookmarkStart w:id="2" w:name="_Toc243047554"/>
+      <w:bookmarkStart w:id="2" w:name="_Toc244093386"/>
       <w:r>
         <w:t>1.2 What the app does</w:t>
       </w:r>
@@ -2301,6 +2307,9 @@
         <w:spacing w:after="60" w:line="276" w:lineRule="auto"/>
       </w:pPr>
       <w:r>
+        <w:rPr>
+          <w:noProof/>
+        </w:rPr>
         <w:lastRenderedPageBreak/>
         <w:drawing>
           <wp:inline distT="0" distB="0" distL="0" distR="0" wp14:anchorId="3E5BFBAC" wp14:editId="7A03FEEE">
@@ -2421,7 +2430,7 @@
       <w:pPr>
         <w:pStyle w:val="Heading2"/>
       </w:pPr>
-      <w:bookmarkStart w:id="3" w:name="_Toc243047555"/>
+      <w:bookmarkStart w:id="3" w:name="_Toc244093387"/>
       <w:r>
         <w:t>1.3 Before you begin</w:t>
       </w:r>
@@ -2607,7 +2616,7 @@
       <w:pPr>
         <w:pStyle w:val="Heading2"/>
       </w:pPr>
-      <w:bookmarkStart w:id="4" w:name="_Toc243047556"/>
+      <w:bookmarkStart w:id="4" w:name="_Toc244093388"/>
       <w:r>
         <w:t>1.4 Installing and starting the app</w:t>
       </w:r>
@@ -3031,7 +3040,7 @@
       <w:pPr>
         <w:pStyle w:val="Heading2"/>
       </w:pPr>
-      <w:bookmarkStart w:id="5" w:name="_Toc243047557"/>
+      <w:bookmarkStart w:id="5" w:name="_Toc244093389"/>
       <w:r>
         <w:t>1.5 Finding your way around</w:t>
       </w:r>
@@ -3283,6 +3292,9 @@
         <w:spacing w:after="60" w:line="276" w:lineRule="auto"/>
       </w:pPr>
       <w:r>
+        <w:rPr>
+          <w:noProof/>
+        </w:rPr>
         <w:lastRenderedPageBreak/>
         <w:drawing>
           <wp:anchor distT="0" distB="0" distL="114300" distR="114300" simplePos="0" relativeHeight="251657216" behindDoc="0" locked="0" layoutInCell="1" allowOverlap="1" wp14:anchorId="3EC75710" wp14:editId="3A80CEEA">
@@ -3502,7 +3514,7 @@
       <w:pPr>
         <w:pStyle w:val="Heading2"/>
       </w:pPr>
-      <w:bookmarkStart w:id="6" w:name="_Toc243047558"/>
+      <w:bookmarkStart w:id="6" w:name="_Toc244093390"/>
       <w:r>
         <w:lastRenderedPageBreak/>
         <w:t>1.6 Quick start</w:t>
@@ -3724,7 +3736,7 @@
       <w:pPr>
         <w:pStyle w:val="Heading1"/>
       </w:pPr>
-      <w:bookmarkStart w:id="7" w:name="_Toc243047559"/>
+      <w:bookmarkStart w:id="7" w:name="_Toc244093391"/>
       <w:r>
         <w:lastRenderedPageBreak/>
         <w:t>2. Preparing your data</w:t>
@@ -3743,7 +3755,7 @@
       <w:pPr>
         <w:pStyle w:val="Heading2"/>
       </w:pPr>
-      <w:bookmarkStart w:id="8" w:name="_Toc243047560"/>
+      <w:bookmarkStart w:id="8" w:name="_Toc244093392"/>
       <w:r>
         <w:t>2.1 File requirements</w:t>
       </w:r>
@@ -3771,12 +3783,6 @@
         <w:gridCol w:w="6760"/>
       </w:tblGrid>
       <w:tr>
-        <w:tblPrEx>
-          <w:tblCellMar>
-            <w:top w:w="0" w:type="dxa"/>
-            <w:bottom w:w="0" w:type="dxa"/>
-          </w:tblCellMar>
-        </w:tblPrEx>
         <w:trPr>
           <w:tblHeader/>
         </w:trPr>
@@ -3848,12 +3854,6 @@
         </w:tc>
       </w:tr>
       <w:tr>
-        <w:tblPrEx>
-          <w:tblCellMar>
-            <w:top w:w="0" w:type="dxa"/>
-            <w:bottom w:w="0" w:type="dxa"/>
-          </w:tblCellMar>
-        </w:tblPrEx>
         <w:trPr>
           <w:cantSplit/>
         </w:trPr>
@@ -3917,12 +3917,6 @@
         </w:tc>
       </w:tr>
       <w:tr>
-        <w:tblPrEx>
-          <w:tblCellMar>
-            <w:top w:w="0" w:type="dxa"/>
-            <w:bottom w:w="0" w:type="dxa"/>
-          </w:tblCellMar>
-        </w:tblPrEx>
         <w:trPr>
           <w:cantSplit/>
         </w:trPr>
@@ -3988,12 +3982,6 @@
         </w:tc>
       </w:tr>
       <w:tr>
-        <w:tblPrEx>
-          <w:tblCellMar>
-            <w:top w:w="0" w:type="dxa"/>
-            <w:bottom w:w="0" w:type="dxa"/>
-          </w:tblCellMar>
-        </w:tblPrEx>
         <w:trPr>
           <w:cantSplit/>
         </w:trPr>
@@ -4057,12 +4045,6 @@
         </w:tc>
       </w:tr>
       <w:tr>
-        <w:tblPrEx>
-          <w:tblCellMar>
-            <w:top w:w="0" w:type="dxa"/>
-            <w:bottom w:w="0" w:type="dxa"/>
-          </w:tblCellMar>
-        </w:tblPrEx>
         <w:trPr>
           <w:cantSplit/>
         </w:trPr>
@@ -4137,7 +4119,7 @@
       <w:pPr>
         <w:pStyle w:val="Heading2"/>
       </w:pPr>
-      <w:bookmarkStart w:id="9" w:name="_Toc243047561"/>
+      <w:bookmarkStart w:id="9" w:name="_Toc244093393"/>
       <w:r>
         <w:t>2.2 What each dataset should contain</w:t>
       </w:r>
@@ -4166,12 +4148,6 @@
         <w:gridCol w:w="3860"/>
       </w:tblGrid>
       <w:tr>
-        <w:tblPrEx>
-          <w:tblCellMar>
-            <w:top w:w="0" w:type="dxa"/>
-            <w:bottom w:w="0" w:type="dxa"/>
-          </w:tblCellMar>
-        </w:tblPrEx>
         <w:trPr>
           <w:tblHeader/>
         </w:trPr>
@@ -4266,12 +4242,6 @@
         </w:tc>
       </w:tr>
       <w:tr>
-        <w:tblPrEx>
-          <w:tblCellMar>
-            <w:top w:w="0" w:type="dxa"/>
-            <w:bottom w:w="0" w:type="dxa"/>
-          </w:tblCellMar>
-        </w:tblPrEx>
         <w:trPr>
           <w:cantSplit/>
         </w:trPr>
@@ -4366,12 +4336,6 @@
         </w:tc>
       </w:tr>
       <w:tr>
-        <w:tblPrEx>
-          <w:tblCellMar>
-            <w:top w:w="0" w:type="dxa"/>
-            <w:bottom w:w="0" w:type="dxa"/>
-          </w:tblCellMar>
-        </w:tblPrEx>
         <w:trPr>
           <w:cantSplit/>
         </w:trPr>
@@ -4469,12 +4433,6 @@
         </w:tc>
       </w:tr>
       <w:tr>
-        <w:tblPrEx>
-          <w:tblCellMar>
-            <w:top w:w="0" w:type="dxa"/>
-            <w:bottom w:w="0" w:type="dxa"/>
-          </w:tblCellMar>
-        </w:tblPrEx>
         <w:trPr>
           <w:cantSplit/>
         </w:trPr>
@@ -4569,12 +4527,6 @@
         </w:tc>
       </w:tr>
       <w:tr>
-        <w:tblPrEx>
-          <w:tblCellMar>
-            <w:top w:w="0" w:type="dxa"/>
-            <w:bottom w:w="0" w:type="dxa"/>
-          </w:tblCellMar>
-        </w:tblPrEx>
         <w:trPr>
           <w:cantSplit/>
         </w:trPr>
@@ -4672,12 +4624,6 @@
         </w:tc>
       </w:tr>
       <w:tr>
-        <w:tblPrEx>
-          <w:tblCellMar>
-            <w:top w:w="0" w:type="dxa"/>
-            <w:bottom w:w="0" w:type="dxa"/>
-          </w:tblCellMar>
-        </w:tblPrEx>
         <w:trPr>
           <w:cantSplit/>
         </w:trPr>
@@ -4779,12 +4725,6 @@
         </w:tc>
       </w:tr>
       <w:tr>
-        <w:tblPrEx>
-          <w:tblCellMar>
-            <w:top w:w="0" w:type="dxa"/>
-            <w:bottom w:w="0" w:type="dxa"/>
-          </w:tblCellMar>
-        </w:tblPrEx>
         <w:trPr>
           <w:cantSplit/>
         </w:trPr>
@@ -4911,7 +4851,7 @@
       <w:pPr>
         <w:pStyle w:val="Heading2"/>
       </w:pPr>
-      <w:bookmarkStart w:id="10" w:name="_Toc243047562"/>
+      <w:bookmarkStart w:id="10" w:name="_Toc244093394"/>
       <w:r>
         <w:t>2.3 Reserved column names</w:t>
       </w:r>
@@ -4979,6 +4919,9 @@
         <w:spacing w:after="120" w:line="276" w:lineRule="auto"/>
       </w:pPr>
       <w:r>
+        <w:rPr>
+          <w:noProof/>
+        </w:rPr>
         <w:drawing>
           <wp:inline distT="0" distB="0" distL="0" distR="0" wp14:anchorId="73C63A12" wp14:editId="5B15C2E7">
             <wp:extent cx="5943600" cy="1346835"/>
@@ -5050,12 +4993,6 @@
         <w:gridCol w:w="3760"/>
       </w:tblGrid>
       <w:tr>
-        <w:tblPrEx>
-          <w:tblCellMar>
-            <w:top w:w="0" w:type="dxa"/>
-            <w:bottom w:w="0" w:type="dxa"/>
-          </w:tblCellMar>
-        </w:tblPrEx>
         <w:trPr>
           <w:tblHeader/>
         </w:trPr>
@@ -5163,12 +5100,6 @@
         </w:tc>
       </w:tr>
       <w:tr>
-        <w:tblPrEx>
-          <w:tblCellMar>
-            <w:top w:w="0" w:type="dxa"/>
-            <w:bottom w:w="0" w:type="dxa"/>
-          </w:tblCellMar>
-        </w:tblPrEx>
         <w:trPr>
           <w:cantSplit/>
         </w:trPr>
@@ -5261,12 +5192,6 @@
         </w:tc>
       </w:tr>
       <w:tr>
-        <w:tblPrEx>
-          <w:tblCellMar>
-            <w:top w:w="0" w:type="dxa"/>
-            <w:bottom w:w="0" w:type="dxa"/>
-          </w:tblCellMar>
-        </w:tblPrEx>
         <w:trPr>
           <w:cantSplit/>
         </w:trPr>
@@ -5362,12 +5287,6 @@
         </w:tc>
       </w:tr>
       <w:tr>
-        <w:tblPrEx>
-          <w:tblCellMar>
-            <w:top w:w="0" w:type="dxa"/>
-            <w:bottom w:w="0" w:type="dxa"/>
-          </w:tblCellMar>
-        </w:tblPrEx>
         <w:trPr>
           <w:cantSplit/>
         </w:trPr>
@@ -5460,12 +5379,6 @@
         </w:tc>
       </w:tr>
       <w:tr>
-        <w:tblPrEx>
-          <w:tblCellMar>
-            <w:top w:w="0" w:type="dxa"/>
-            <w:bottom w:w="0" w:type="dxa"/>
-          </w:tblCellMar>
-        </w:tblPrEx>
         <w:trPr>
           <w:cantSplit/>
         </w:trPr>
@@ -5570,7 +5483,7 @@
       <w:pPr>
         <w:pStyle w:val="Heading2"/>
       </w:pPr>
-      <w:bookmarkStart w:id="11" w:name="_Toc243047563"/>
+      <w:bookmarkStart w:id="11" w:name="_Toc244093395"/>
       <w:r>
         <w:t>2.4 Practice datasets</w:t>
       </w:r>
@@ -5694,7 +5607,7 @@
       <w:pPr>
         <w:pStyle w:val="Heading1"/>
       </w:pPr>
-      <w:bookmarkStart w:id="13" w:name="_Toc243047564"/>
+      <w:bookmarkStart w:id="13" w:name="_Toc244093396"/>
       <w:r>
         <w:lastRenderedPageBreak/>
         <w:t xml:space="preserve">3. </w:t>
@@ -5791,7 +5704,7 @@
       <w:pPr>
         <w:pStyle w:val="Heading2"/>
       </w:pPr>
-      <w:bookmarkStart w:id="14" w:name="_Toc243047565"/>
+      <w:bookmarkStart w:id="14" w:name="_Toc244093397"/>
       <w:r>
         <w:t>3.1 Part 1: Gather observer data</w:t>
       </w:r>
@@ -5969,6 +5882,9 @@
         <w:spacing w:after="80" w:line="276" w:lineRule="auto"/>
       </w:pPr>
       <w:r>
+        <w:rPr>
+          <w:noProof/>
+        </w:rPr>
         <w:drawing>
           <wp:inline distT="0" distB="0" distL="0" distR="0" wp14:anchorId="0A485B94" wp14:editId="4FCD680B">
             <wp:extent cx="5943600" cy="2713355"/>
@@ -6030,6 +5946,9 @@
         <w:spacing w:after="80" w:line="276" w:lineRule="auto"/>
       </w:pPr>
       <w:r>
+        <w:rPr>
+          <w:noProof/>
+        </w:rPr>
         <w:lastRenderedPageBreak/>
         <w:drawing>
           <wp:inline distT="0" distB="0" distL="0" distR="0" wp14:anchorId="028AC938" wp14:editId="724DC24F">
@@ -6115,12 +6034,6 @@
         <w:gridCol w:w="5160"/>
       </w:tblGrid>
       <w:tr>
-        <w:tblPrEx>
-          <w:tblCellMar>
-            <w:top w:w="0" w:type="dxa"/>
-            <w:bottom w:w="0" w:type="dxa"/>
-          </w:tblCellMar>
-        </w:tblPrEx>
         <w:trPr>
           <w:tblHeader/>
         </w:trPr>
@@ -6225,12 +6138,6 @@
         </w:tc>
       </w:tr>
       <w:tr>
-        <w:tblPrEx>
-          <w:tblCellMar>
-            <w:top w:w="0" w:type="dxa"/>
-            <w:bottom w:w="0" w:type="dxa"/>
-          </w:tblCellMar>
-        </w:tblPrEx>
         <w:trPr>
           <w:cantSplit/>
         </w:trPr>
@@ -6323,12 +6230,6 @@
         </w:tc>
       </w:tr>
       <w:tr>
-        <w:tblPrEx>
-          <w:tblCellMar>
-            <w:top w:w="0" w:type="dxa"/>
-            <w:bottom w:w="0" w:type="dxa"/>
-          </w:tblCellMar>
-        </w:tblPrEx>
         <w:trPr>
           <w:cantSplit/>
         </w:trPr>
@@ -6424,12 +6325,6 @@
         </w:tc>
       </w:tr>
       <w:tr>
-        <w:tblPrEx>
-          <w:tblCellMar>
-            <w:top w:w="0" w:type="dxa"/>
-            <w:bottom w:w="0" w:type="dxa"/>
-          </w:tblCellMar>
-        </w:tblPrEx>
         <w:trPr>
           <w:cantSplit/>
         </w:trPr>
@@ -6522,12 +6417,6 @@
         </w:tc>
       </w:tr>
       <w:tr>
-        <w:tblPrEx>
-          <w:tblCellMar>
-            <w:top w:w="0" w:type="dxa"/>
-            <w:bottom w:w="0" w:type="dxa"/>
-          </w:tblCellMar>
-        </w:tblPrEx>
         <w:trPr>
           <w:cantSplit/>
         </w:trPr>
@@ -6623,12 +6512,6 @@
         </w:tc>
       </w:tr>
       <w:tr>
-        <w:tblPrEx>
-          <w:tblCellMar>
-            <w:top w:w="0" w:type="dxa"/>
-            <w:bottom w:w="0" w:type="dxa"/>
-          </w:tblCellMar>
-        </w:tblPrEx>
         <w:trPr>
           <w:cantSplit/>
         </w:trPr>
@@ -6721,12 +6604,6 @@
         </w:tc>
       </w:tr>
       <w:tr>
-        <w:tblPrEx>
-          <w:tblCellMar>
-            <w:top w:w="0" w:type="dxa"/>
-            <w:bottom w:w="0" w:type="dxa"/>
-          </w:tblCellMar>
-        </w:tblPrEx>
         <w:trPr>
           <w:cantSplit/>
         </w:trPr>
@@ -6883,7 +6760,7 @@
       <w:pPr>
         <w:pStyle w:val="Heading2"/>
       </w:pPr>
-      <w:bookmarkStart w:id="15" w:name="_Toc243047566"/>
+      <w:bookmarkStart w:id="15" w:name="_Toc244093398"/>
       <w:r>
         <w:t>3.2 Part 2: Gather logbook data</w:t>
       </w:r>
@@ -7016,6 +6893,9 @@
         <w:spacing w:after="80" w:line="276" w:lineRule="auto"/>
       </w:pPr>
       <w:r>
+        <w:rPr>
+          <w:noProof/>
+        </w:rPr>
         <w:drawing>
           <wp:inline distT="0" distB="0" distL="0" distR="0" wp14:anchorId="7CE2616F" wp14:editId="7AEBA932">
             <wp:extent cx="5943600" cy="2371725"/>
@@ -7070,13 +6950,7 @@
         <w:t xml:space="preserve"> </w:t>
       </w:r>
       <w:r>
-        <w:t xml:space="preserve">Gather </w:t>
-      </w:r>
-      <w:r>
-        <w:t>logbook</w:t>
-      </w:r>
-      <w:r>
-        <w:t xml:space="preserve"> data, showing attached dataset and data review table.</w:t>
+        <w:t>Gather logbook data, showing attached dataset and data review table.</w:t>
       </w:r>
     </w:p>
     <w:p>
@@ -7089,6 +6963,9 @@
         <w:spacing w:after="80" w:line="276" w:lineRule="auto"/>
       </w:pPr>
       <w:r>
+        <w:rPr>
+          <w:noProof/>
+        </w:rPr>
         <w:drawing>
           <wp:inline distT="0" distB="0" distL="0" distR="0" wp14:anchorId="2E4B7737" wp14:editId="532CD318">
             <wp:extent cx="5943600" cy="728345"/>
@@ -7137,13 +7014,7 @@
         <w:t>8</w:t>
       </w:r>
       <w:r>
-        <w:t xml:space="preserve">. </w:t>
-      </w:r>
-      <w:r>
-        <w:t>Completed selection of Year</w:t>
-      </w:r>
-      <w:r>
-        <w:t>.</w:t>
+        <w:t>. Completed selection of Year.</w:t>
       </w:r>
     </w:p>
     <w:p>
@@ -7168,7 +7039,7 @@
       <w:pPr>
         <w:pStyle w:val="Heading2"/>
       </w:pPr>
-      <w:bookmarkStart w:id="16" w:name="_Toc243047567"/>
+      <w:bookmarkStart w:id="16" w:name="_Toc244093399"/>
       <w:r>
         <w:t>3.3 Part 3: Align data &amp; activate</w:t>
       </w:r>
@@ -7192,6 +7063,9 @@
         <w:spacing w:after="120" w:line="276" w:lineRule="auto"/>
       </w:pPr>
       <w:r>
+        <w:rPr>
+          <w:noProof/>
+        </w:rPr>
         <w:drawing>
           <wp:inline distT="0" distB="0" distL="0" distR="0" wp14:anchorId="4C9A0FE4" wp14:editId="23D5B2F3">
             <wp:extent cx="5943600" cy="1054735"/>
@@ -7247,10 +7121,7 @@
         <w:t xml:space="preserve">. </w:t>
       </w:r>
       <w:r>
-        <w:t>Grey “not available” banner</w:t>
-      </w:r>
-      <w:r>
-        <w:t xml:space="preserve"> </w:t>
+        <w:t xml:space="preserve">Grey “not available” banner </w:t>
       </w:r>
       <w:r>
         <w:t>that is displayed when Parts 1 and 2 are incomplete.</w:t>
@@ -7301,12 +7172,6 @@
         <w:gridCol w:w="4560"/>
       </w:tblGrid>
       <w:tr>
-        <w:tblPrEx>
-          <w:tblCellMar>
-            <w:top w:w="0" w:type="dxa"/>
-            <w:bottom w:w="0" w:type="dxa"/>
-          </w:tblCellMar>
-        </w:tblPrEx>
         <w:trPr>
           <w:tblHeader/>
         </w:trPr>
@@ -7411,12 +7276,6 @@
         </w:tc>
       </w:tr>
       <w:tr>
-        <w:tblPrEx>
-          <w:tblCellMar>
-            <w:top w:w="0" w:type="dxa"/>
-            <w:bottom w:w="0" w:type="dxa"/>
-          </w:tblCellMar>
-        </w:tblPrEx>
         <w:trPr>
           <w:cantSplit/>
         </w:trPr>
@@ -7509,12 +7368,6 @@
         </w:tc>
       </w:tr>
       <w:tr>
-        <w:tblPrEx>
-          <w:tblCellMar>
-            <w:top w:w="0" w:type="dxa"/>
-            <w:bottom w:w="0" w:type="dxa"/>
-          </w:tblCellMar>
-        </w:tblPrEx>
         <w:trPr>
           <w:cantSplit/>
         </w:trPr>
@@ -7635,12 +7488,6 @@
         </w:tc>
       </w:tr>
       <w:tr>
-        <w:tblPrEx>
-          <w:tblCellMar>
-            <w:top w:w="0" w:type="dxa"/>
-            <w:bottom w:w="0" w:type="dxa"/>
-          </w:tblCellMar>
-        </w:tblPrEx>
         <w:trPr>
           <w:cantSplit/>
         </w:trPr>
@@ -7733,12 +7580,6 @@
         </w:tc>
       </w:tr>
       <w:tr>
-        <w:tblPrEx>
-          <w:tblCellMar>
-            <w:top w:w="0" w:type="dxa"/>
-            <w:bottom w:w="0" w:type="dxa"/>
-          </w:tblCellMar>
-        </w:tblPrEx>
         <w:trPr>
           <w:cantSplit/>
         </w:trPr>
@@ -7859,12 +7700,6 @@
         </w:tc>
       </w:tr>
       <w:tr>
-        <w:tblPrEx>
-          <w:tblCellMar>
-            <w:top w:w="0" w:type="dxa"/>
-            <w:bottom w:w="0" w:type="dxa"/>
-          </w:tblCellMar>
-        </w:tblPrEx>
         <w:trPr>
           <w:cantSplit/>
         </w:trPr>
@@ -8017,7 +7852,7 @@
         <mc:AlternateContent>
           <mc:Choice Requires="wpg">
             <w:drawing>
-              <wp:anchor distT="0" distB="0" distL="114300" distR="114300" simplePos="0" relativeHeight="251670528" behindDoc="0" locked="0" layoutInCell="1" allowOverlap="1" wp14:anchorId="6E8BF001" wp14:editId="60A6C080">
+              <wp:anchor distT="0" distB="0" distL="114300" distR="114300" simplePos="0" relativeHeight="251670528" behindDoc="0" locked="0" layoutInCell="1" allowOverlap="1" wp14:anchorId="6E8BF001" wp14:editId="4CF42343">
                 <wp:simplePos x="0" y="0"/>
                 <wp:positionH relativeFrom="column">
                   <wp:posOffset>66502</wp:posOffset>
@@ -8217,13 +8052,7 @@
                           <w:txbxContent>
                             <w:p>
                               <w:r>
-                                <w:t>(</w:t>
-                              </w:r>
-                              <w:r>
-                                <w:t>B</w:t>
-                              </w:r>
-                              <w:r>
-                                <w:t>)</w:t>
+                                <w:t>(B)</w:t>
                               </w:r>
                             </w:p>
                           </w:txbxContent>
@@ -8257,13 +8086,7 @@
                           <w:txbxContent>
                             <w:p>
                               <w:r>
-                                <w:t>(</w:t>
-                              </w:r>
-                              <w:r>
-                                <w:t>C</w:t>
-                              </w:r>
-                              <w:r>
-                                <w:t>)</w:t>
+                                <w:t>(C)</w:t>
                               </w:r>
                             </w:p>
                           </w:txbxContent>
@@ -8297,13 +8120,7 @@
                           <w:txbxContent>
                             <w:p>
                               <w:r>
-                                <w:t>(</w:t>
-                              </w:r>
-                              <w:r>
-                                <w:t>D</w:t>
-                              </w:r>
-                              <w:r>
-                                <w:t>)</w:t>
+                                <w:t>(D)</w:t>
                               </w:r>
                             </w:p>
                           </w:txbxContent>
@@ -8372,13 +8189,7 @@
                     <w:txbxContent>
                       <w:p>
                         <w:r>
-                          <w:t>(</w:t>
-                        </w:r>
-                        <w:r>
-                          <w:t>B</w:t>
-                        </w:r>
-                        <w:r>
-                          <w:t>)</w:t>
+                          <w:t>(B)</w:t>
                         </w:r>
                       </w:p>
                     </w:txbxContent>
@@ -8389,13 +8200,7 @@
                     <w:txbxContent>
                       <w:p>
                         <w:r>
-                          <w:t>(</w:t>
-                        </w:r>
-                        <w:r>
-                          <w:t>C</w:t>
-                        </w:r>
-                        <w:r>
-                          <w:t>)</w:t>
+                          <w:t>(C)</w:t>
                         </w:r>
                       </w:p>
                     </w:txbxContent>
@@ -8406,13 +8211,7 @@
                     <w:txbxContent>
                       <w:p>
                         <w:r>
-                          <w:t>(</w:t>
-                        </w:r>
-                        <w:r>
-                          <w:t>D</w:t>
-                        </w:r>
-                        <w:r>
-                          <w:t>)</w:t>
+                          <w:t>(D)</w:t>
                         </w:r>
                       </w:p>
                     </w:txbxContent>
@@ -8649,12 +8448,6 @@
         <w:gridCol w:w="2373"/>
       </w:tblGrid>
       <w:tr>
-        <w:tblPrEx>
-          <w:tblCellMar>
-            <w:top w:w="0" w:type="dxa"/>
-            <w:bottom w:w="0" w:type="dxa"/>
-          </w:tblCellMar>
-        </w:tblPrEx>
         <w:trPr>
           <w:tblHeader/>
         </w:trPr>
@@ -8799,12 +8592,6 @@
         </w:tc>
       </w:tr>
       <w:tr>
-        <w:tblPrEx>
-          <w:tblCellMar>
-            <w:top w:w="0" w:type="dxa"/>
-            <w:bottom w:w="0" w:type="dxa"/>
-          </w:tblCellMar>
-        </w:tblPrEx>
         <w:trPr>
           <w:cantSplit/>
         </w:trPr>
@@ -8922,12 +8709,6 @@
         </w:tc>
       </w:tr>
       <w:tr>
-        <w:tblPrEx>
-          <w:tblCellMar>
-            <w:top w:w="0" w:type="dxa"/>
-            <w:bottom w:w="0" w:type="dxa"/>
-          </w:tblCellMar>
-        </w:tblPrEx>
         <w:trPr>
           <w:cantSplit/>
         </w:trPr>
@@ -9049,12 +8830,6 @@
         </w:tc>
       </w:tr>
       <w:tr>
-        <w:tblPrEx>
-          <w:tblCellMar>
-            <w:top w:w="0" w:type="dxa"/>
-            <w:bottom w:w="0" w:type="dxa"/>
-          </w:tblCellMar>
-        </w:tblPrEx>
         <w:trPr>
           <w:cantSplit/>
         </w:trPr>
@@ -9172,12 +8947,6 @@
         </w:tc>
       </w:tr>
       <w:tr>
-        <w:tblPrEx>
-          <w:tblCellMar>
-            <w:top w:w="0" w:type="dxa"/>
-            <w:bottom w:w="0" w:type="dxa"/>
-          </w:tblCellMar>
-        </w:tblPrEx>
         <w:trPr>
           <w:cantSplit/>
         </w:trPr>
@@ -9312,6 +9081,7 @@
         <w:rPr>
           <w:i/>
           <w:iCs/>
+          <w:noProof/>
         </w:rPr>
         <w:drawing>
           <wp:inline distT="0" distB="0" distL="0" distR="0" wp14:anchorId="2D3DD502" wp14:editId="51E46357">
@@ -9552,6 +9322,9 @@
         <w:spacing w:after="60" w:line="276" w:lineRule="auto"/>
       </w:pPr>
       <w:r>
+        <w:rPr>
+          <w:noProof/>
+        </w:rPr>
         <w:drawing>
           <wp:inline distT="0" distB="0" distL="0" distR="0" wp14:anchorId="739FC82C" wp14:editId="2D16C289">
             <wp:extent cx="5943600" cy="1939290"/>
@@ -9658,13 +9431,7 @@
         <w:ind w:right="100"/>
       </w:pPr>
       <w:r>
-        <w:t>If they differ, the app renames the logbook column to match the observer name.</w:t>
-      </w:r>
-      <w:r>
-        <w:t xml:space="preserve"> </w:t>
-      </w:r>
-      <w:r>
-        <w:t>Renaming can occasionally cause processing errors, so use it with care.</w:t>
+        <w:t>If they differ, the app renames the logbook column to match the observer name. Renaming can occasionally cause processing errors, so use it with care.</w:t>
       </w:r>
     </w:p>
     <w:p>
@@ -9974,6 +9741,9 @@
         <w:spacing w:after="80" w:line="276" w:lineRule="auto"/>
       </w:pPr>
       <w:r>
+        <w:rPr>
+          <w:noProof/>
+        </w:rPr>
         <w:drawing>
           <wp:inline distT="0" distB="0" distL="0" distR="0" wp14:anchorId="2E45D3A2" wp14:editId="6F2D3601">
             <wp:extent cx="5943600" cy="2912110"/>
@@ -10232,6 +10002,9 @@
         <w:spacing w:after="120" w:line="276" w:lineRule="auto"/>
       </w:pPr>
       <w:r>
+        <w:rPr>
+          <w:noProof/>
+        </w:rPr>
         <w:drawing>
           <wp:anchor distT="0" distB="0" distL="114300" distR="114300" simplePos="0" relativeHeight="251671552" behindDoc="0" locked="0" layoutInCell="1" allowOverlap="1" wp14:anchorId="6C5080A3" wp14:editId="11E7CF3F">
             <wp:simplePos x="0" y="0"/>
@@ -10348,7 +10121,7 @@
       <w:pPr>
         <w:pStyle w:val="Heading1"/>
       </w:pPr>
-      <w:bookmarkStart w:id="17" w:name="_Toc243047568"/>
+      <w:bookmarkStart w:id="17" w:name="_Toc244093400"/>
       <w:r>
         <w:lastRenderedPageBreak/>
         <w:t xml:space="preserve">4. </w:t>
@@ -10440,7 +10213,7 @@
       <w:r>
         <w:t xml:space="preserve"> </w:t>
       </w:r>
-      <w:bookmarkStart w:id="18" w:name="_Toc243047569"/>
+      <w:bookmarkStart w:id="18" w:name="_Toc244093401"/>
       <w:r>
         <w:t>Diagnostics &amp; summary</w:t>
       </w:r>
@@ -10482,19 +10255,6 @@
       </w:pPr>
       <w:r>
         <w:t>The report includes warning messages about missing data or NAs; figures and tables showing sample sizes and the presence or absence of the bycatch species across levels of exploratory variables; observer coverage levels; raw trends in catch per unit effort (CPUE); and a summary of the available data.</w:t>
-      </w:r>
-    </w:p>
-    <w:p>
-      <w:pPr>
-        <w:spacing w:before="80" w:after="160" w:line="276" w:lineRule="auto"/>
-      </w:pPr>
-      <w:r>
-        <w:rPr>
-          <w:i/>
-          <w:iCs/>
-          <w:highlight w:val="yellow"/>
-        </w:rPr>
-        <w:t>[ADD CONTEXT: How to interpret the report: what the warnings mean, what observer coverage is acceptable, how to read the CPUE trends, and what to do if problems appear (for example, return to setup or fix the source data).]</w:t>
       </w:r>
     </w:p>
     <w:p>
@@ -10527,7 +10287,7 @@
       <w:pPr>
         <w:pStyle w:val="Heading1"/>
       </w:pPr>
-      <w:bookmarkStart w:id="19" w:name="_Toc243047570"/>
+      <w:bookmarkStart w:id="19" w:name="_Toc244093402"/>
       <w:r>
         <w:lastRenderedPageBreak/>
         <w:t xml:space="preserve">5. </w:t>
@@ -10612,20 +10372,12 @@
       <w:pPr>
         <w:spacing w:before="80" w:after="160" w:line="276" w:lineRule="auto"/>
       </w:pPr>
-      <w:r>
-        <w:rPr>
-          <w:i/>
-          <w:iCs/>
-          <w:highlight w:val="yellow"/>
-        </w:rPr>
-        <w:t>[ADD CONTEXT: A plain-language description of the Ratio and Delta methods, when each is appropriate, and their key assumptions. Link to the R package guide for technical detail.]</w:t>
-      </w:r>
     </w:p>
     <w:p>
       <w:pPr>
         <w:pStyle w:val="Heading2"/>
       </w:pPr>
-      <w:bookmarkStart w:id="20" w:name="_Toc243047571"/>
+      <w:bookmarkStart w:id="20" w:name="_Toc244093403"/>
       <w:r>
         <w:t>5.1 Specifications</w:t>
       </w:r>
@@ -10633,11 +10385,6 @@
     </w:p>
     <w:p>
       <w:pPr>
-        <w:pStyle w:val="ListParagraph"/>
-        <w:numPr>
-          <w:ilvl w:val="0"/>
-          <w:numId w:val="12"/>
-        </w:numPr>
         <w:spacing w:after="80" w:line="276" w:lineRule="auto"/>
       </w:pPr>
       <w:r>
@@ -10656,676 +10403,8 @@
     </w:p>
     <w:p>
       <w:pPr>
-        <w:pStyle w:val="ListParagraph"/>
-        <w:numPr>
-          <w:ilvl w:val="0"/>
-          <w:numId w:val="12"/>
-        </w:numPr>
         <w:spacing w:after="80" w:line="276" w:lineRule="auto"/>
       </w:pPr>
-      <w:r>
-        <w:t xml:space="preserve">Select one or more </w:t>
-      </w:r>
-      <w:r>
-        <w:rPr>
-          <w:b/>
-          <w:bCs/>
-        </w:rPr>
-        <w:t>design stratification variables</w:t>
-      </w:r>
-      <w:r>
-        <w:t xml:space="preserve"> (mandatory).</w:t>
-      </w:r>
-    </w:p>
-    <w:p>
-      <w:pPr>
-        <w:pStyle w:val="ListParagraph"/>
-        <w:numPr>
-          <w:ilvl w:val="0"/>
-          <w:numId w:val="12"/>
-        </w:numPr>
-        <w:spacing w:after="80" w:line="276" w:lineRule="auto"/>
-      </w:pPr>
-      <w:r>
-        <w:t xml:space="preserve">Optionally, select </w:t>
-      </w:r>
-      <w:r>
-        <w:rPr>
-          <w:b/>
-          <w:bCs/>
-        </w:rPr>
-        <w:t>grouping variables</w:t>
-      </w:r>
-      <w:r>
-        <w:t>.</w:t>
-      </w:r>
-    </w:p>
-    <w:p>
-      <w:pPr>
-        <w:pStyle w:val="ListParagraph"/>
-        <w:numPr>
-          <w:ilvl w:val="0"/>
-          <w:numId w:val="12"/>
-        </w:numPr>
-        <w:spacing w:after="80" w:line="276" w:lineRule="auto"/>
-      </w:pPr>
-      <w:r>
-        <w:t xml:space="preserve">Select one or both </w:t>
-      </w:r>
-      <w:r>
-        <w:rPr>
-          <w:b/>
-          <w:bCs/>
-        </w:rPr>
-        <w:t>analysis methods</w:t>
-      </w:r>
-      <w:r>
-        <w:t>.</w:t>
-      </w:r>
-    </w:p>
-    <w:p>
-      <w:pPr>
-        <w:pStyle w:val="ListParagraph"/>
-        <w:numPr>
-          <w:ilvl w:val="0"/>
-          <w:numId w:val="12"/>
-        </w:numPr>
-        <w:spacing w:after="80" w:line="276" w:lineRule="auto"/>
-      </w:pPr>
-      <w:r>
-        <w:t xml:space="preserve">Enter a </w:t>
-      </w:r>
-      <w:r>
-        <w:rPr>
-          <w:b/>
-          <w:bCs/>
-        </w:rPr>
-        <w:t>scenario name</w:t>
-      </w:r>
-      <w:r>
-        <w:t xml:space="preserve"> (maximum 100 characters).</w:t>
-      </w:r>
-    </w:p>
-    <w:p>
-      <w:pPr>
-        <w:pStyle w:val="ListParagraph"/>
-        <w:numPr>
-          <w:ilvl w:val="0"/>
-          <w:numId w:val="12"/>
-        </w:numPr>
-        <w:spacing w:after="80" w:line="276" w:lineRule="auto"/>
-      </w:pPr>
-      <w:r>
-        <w:t xml:space="preserve">Click </w:t>
-      </w:r>
-      <w:r>
-        <w:rPr>
-          <w:b/>
-          <w:bCs/>
-        </w:rPr>
-        <w:t>Run analysis</w:t>
-      </w:r>
-      <w:r>
-        <w:t>.</w:t>
-      </w:r>
-    </w:p>
-    <w:tbl>
-      <w:tblPr>
-        <w:tblW w:w="9360" w:type="dxa"/>
-        <w:tblBorders>
-          <w:top w:val="single" w:sz="4" w:space="0" w:color="auto"/>
-          <w:left w:val="single" w:sz="4" w:space="0" w:color="auto"/>
-          <w:bottom w:val="single" w:sz="4" w:space="0" w:color="auto"/>
-          <w:right w:val="single" w:sz="4" w:space="0" w:color="auto"/>
-          <w:insideH w:val="single" w:sz="4" w:space="0" w:color="auto"/>
-          <w:insideV w:val="single" w:sz="4" w:space="0" w:color="auto"/>
-        </w:tblBorders>
-        <w:tblCellMar>
-          <w:left w:w="10" w:type="dxa"/>
-          <w:right w:w="10" w:type="dxa"/>
-        </w:tblCellMar>
-        <w:tblLook w:val="04A0" w:firstRow="1" w:lastRow="0" w:firstColumn="1" w:lastColumn="0" w:noHBand="0" w:noVBand="1"/>
-      </w:tblPr>
-      <w:tblGrid>
-        <w:gridCol w:w="2400"/>
-        <w:gridCol w:w="1200"/>
-        <w:gridCol w:w="5760"/>
-      </w:tblGrid>
-      <w:tr>
-        <w:tblPrEx>
-          <w:tblCellMar>
-            <w:top w:w="0" w:type="dxa"/>
-            <w:bottom w:w="0" w:type="dxa"/>
-          </w:tblCellMar>
-        </w:tblPrEx>
-        <w:trPr>
-          <w:tblHeader/>
-        </w:trPr>
-        <w:tc>
-          <w:tcPr>
-            <w:tcW w:w="2400" w:type="dxa"/>
-            <w:tcBorders>
-              <w:top w:val="single" w:sz="4" w:space="0" w:color="BFBFBF"/>
-              <w:left w:val="single" w:sz="4" w:space="0" w:color="BFBFBF"/>
-              <w:bottom w:val="single" w:sz="4" w:space="0" w:color="BFBFBF"/>
-              <w:right w:val="single" w:sz="4" w:space="0" w:color="BFBFBF"/>
-            </w:tcBorders>
-            <w:shd w:val="clear" w:color="auto" w:fill="1F3864"/>
-            <w:tcMar>
-              <w:top w:w="60" w:type="dxa"/>
-              <w:left w:w="100" w:type="dxa"/>
-              <w:bottom w:w="60" w:type="dxa"/>
-              <w:right w:w="100" w:type="dxa"/>
-            </w:tcMar>
-          </w:tcPr>
-          <w:p>
-            <w:pPr>
-              <w:spacing w:after="40"/>
-            </w:pPr>
-            <w:r>
-              <w:rPr>
-                <w:b/>
-                <w:bCs/>
-                <w:color w:val="FFFFFF"/>
-                <w:sz w:val="20"/>
-                <w:szCs w:val="20"/>
-              </w:rPr>
-              <w:t>Field</w:t>
-            </w:r>
-          </w:p>
-        </w:tc>
-        <w:tc>
-          <w:tcPr>
-            <w:tcW w:w="1200" w:type="dxa"/>
-            <w:tcBorders>
-              <w:top w:val="single" w:sz="4" w:space="0" w:color="BFBFBF"/>
-              <w:left w:val="single" w:sz="4" w:space="0" w:color="BFBFBF"/>
-              <w:bottom w:val="single" w:sz="4" w:space="0" w:color="BFBFBF"/>
-              <w:right w:val="single" w:sz="4" w:space="0" w:color="BFBFBF"/>
-            </w:tcBorders>
-            <w:shd w:val="clear" w:color="auto" w:fill="1F3864"/>
-            <w:tcMar>
-              <w:top w:w="60" w:type="dxa"/>
-              <w:left w:w="100" w:type="dxa"/>
-              <w:bottom w:w="60" w:type="dxa"/>
-              <w:right w:w="100" w:type="dxa"/>
-            </w:tcMar>
-          </w:tcPr>
-          <w:p>
-            <w:pPr>
-              <w:spacing w:after="40"/>
-            </w:pPr>
-            <w:r>
-              <w:rPr>
-                <w:b/>
-                <w:bCs/>
-                <w:color w:val="FFFFFF"/>
-                <w:sz w:val="20"/>
-                <w:szCs w:val="20"/>
-              </w:rPr>
-              <w:t>Required</w:t>
-            </w:r>
-          </w:p>
-        </w:tc>
-        <w:tc>
-          <w:tcPr>
-            <w:tcW w:w="5760" w:type="dxa"/>
-            <w:tcBorders>
-              <w:top w:val="single" w:sz="4" w:space="0" w:color="BFBFBF"/>
-              <w:left w:val="single" w:sz="4" w:space="0" w:color="BFBFBF"/>
-              <w:bottom w:val="single" w:sz="4" w:space="0" w:color="BFBFBF"/>
-              <w:right w:val="single" w:sz="4" w:space="0" w:color="BFBFBF"/>
-            </w:tcBorders>
-            <w:shd w:val="clear" w:color="auto" w:fill="1F3864"/>
-            <w:tcMar>
-              <w:top w:w="60" w:type="dxa"/>
-              <w:left w:w="100" w:type="dxa"/>
-              <w:bottom w:w="60" w:type="dxa"/>
-              <w:right w:w="100" w:type="dxa"/>
-            </w:tcMar>
-          </w:tcPr>
-          <w:p>
-            <w:pPr>
-              <w:spacing w:after="40"/>
-            </w:pPr>
-            <w:r>
-              <w:rPr>
-                <w:b/>
-                <w:bCs/>
-                <w:color w:val="FFFFFF"/>
-                <w:sz w:val="20"/>
-                <w:szCs w:val="20"/>
-              </w:rPr>
-              <w:t>What it does</w:t>
-            </w:r>
-          </w:p>
-        </w:tc>
-      </w:tr>
-      <w:tr>
-        <w:tblPrEx>
-          <w:tblCellMar>
-            <w:top w:w="0" w:type="dxa"/>
-            <w:bottom w:w="0" w:type="dxa"/>
-          </w:tblCellMar>
-        </w:tblPrEx>
-        <w:trPr>
-          <w:cantSplit/>
-        </w:trPr>
-        <w:tc>
-          <w:tcPr>
-            <w:tcW w:w="2400" w:type="dxa"/>
-            <w:tcBorders>
-              <w:top w:val="single" w:sz="4" w:space="0" w:color="BFBFBF"/>
-              <w:left w:val="single" w:sz="4" w:space="0" w:color="BFBFBF"/>
-              <w:bottom w:val="single" w:sz="4" w:space="0" w:color="BFBFBF"/>
-              <w:right w:val="single" w:sz="4" w:space="0" w:color="BFBFBF"/>
-            </w:tcBorders>
-            <w:tcMar>
-              <w:top w:w="60" w:type="dxa"/>
-              <w:left w:w="100" w:type="dxa"/>
-              <w:bottom w:w="60" w:type="dxa"/>
-              <w:right w:w="100" w:type="dxa"/>
-            </w:tcMar>
-          </w:tcPr>
-          <w:p>
-            <w:pPr>
-              <w:spacing w:after="40"/>
-            </w:pPr>
-            <w:r>
-              <w:rPr>
-                <w:sz w:val="20"/>
-                <w:szCs w:val="20"/>
-              </w:rPr>
-              <w:t>Stratification variable(s)</w:t>
-            </w:r>
-          </w:p>
-        </w:tc>
-        <w:tc>
-          <w:tcPr>
-            <w:tcW w:w="1200" w:type="dxa"/>
-            <w:tcBorders>
-              <w:top w:val="single" w:sz="4" w:space="0" w:color="BFBFBF"/>
-              <w:left w:val="single" w:sz="4" w:space="0" w:color="BFBFBF"/>
-              <w:bottom w:val="single" w:sz="4" w:space="0" w:color="BFBFBF"/>
-              <w:right w:val="single" w:sz="4" w:space="0" w:color="BFBFBF"/>
-            </w:tcBorders>
-            <w:tcMar>
-              <w:top w:w="60" w:type="dxa"/>
-              <w:left w:w="100" w:type="dxa"/>
-              <w:bottom w:w="60" w:type="dxa"/>
-              <w:right w:w="100" w:type="dxa"/>
-            </w:tcMar>
-          </w:tcPr>
-          <w:p>
-            <w:pPr>
-              <w:spacing w:after="40"/>
-            </w:pPr>
-            <w:r>
-              <w:rPr>
-                <w:sz w:val="20"/>
-                <w:szCs w:val="20"/>
-              </w:rPr>
-              <w:t>Yes</w:t>
-            </w:r>
-          </w:p>
-        </w:tc>
-        <w:tc>
-          <w:tcPr>
-            <w:tcW w:w="5760" w:type="dxa"/>
-            <w:tcBorders>
-              <w:top w:val="single" w:sz="4" w:space="0" w:color="BFBFBF"/>
-              <w:left w:val="single" w:sz="4" w:space="0" w:color="BFBFBF"/>
-              <w:bottom w:val="single" w:sz="4" w:space="0" w:color="BFBFBF"/>
-              <w:right w:val="single" w:sz="4" w:space="0" w:color="BFBFBF"/>
-            </w:tcBorders>
-            <w:tcMar>
-              <w:top w:w="60" w:type="dxa"/>
-              <w:left w:w="100" w:type="dxa"/>
-              <w:bottom w:w="60" w:type="dxa"/>
-              <w:right w:w="100" w:type="dxa"/>
-            </w:tcMar>
-          </w:tcPr>
-          <w:p>
-            <w:pPr>
-              <w:spacing w:after="40"/>
-            </w:pPr>
-            <w:r>
-              <w:rPr>
-                <w:sz w:val="20"/>
-                <w:szCs w:val="20"/>
-              </w:rPr>
-              <w:t>Total bycatch is estimated separately at each level of the variables you select. Choices come from the factor variables you set up in Bycatch setup (including Year).</w:t>
-            </w:r>
-          </w:p>
-        </w:tc>
-      </w:tr>
-      <w:tr>
-        <w:tblPrEx>
-          <w:tblCellMar>
-            <w:top w:w="0" w:type="dxa"/>
-            <w:bottom w:w="0" w:type="dxa"/>
-          </w:tblCellMar>
-        </w:tblPrEx>
-        <w:trPr>
-          <w:cantSplit/>
-        </w:trPr>
-        <w:tc>
-          <w:tcPr>
-            <w:tcW w:w="2400" w:type="dxa"/>
-            <w:tcBorders>
-              <w:top w:val="single" w:sz="4" w:space="0" w:color="BFBFBF"/>
-              <w:left w:val="single" w:sz="4" w:space="0" w:color="BFBFBF"/>
-              <w:bottom w:val="single" w:sz="4" w:space="0" w:color="BFBFBF"/>
-              <w:right w:val="single" w:sz="4" w:space="0" w:color="BFBFBF"/>
-            </w:tcBorders>
-            <w:shd w:val="clear" w:color="auto" w:fill="F5F7FA"/>
-            <w:tcMar>
-              <w:top w:w="60" w:type="dxa"/>
-              <w:left w:w="100" w:type="dxa"/>
-              <w:bottom w:w="60" w:type="dxa"/>
-              <w:right w:w="100" w:type="dxa"/>
-            </w:tcMar>
-          </w:tcPr>
-          <w:p>
-            <w:pPr>
-              <w:spacing w:after="40"/>
-            </w:pPr>
-            <w:r>
-              <w:rPr>
-                <w:sz w:val="20"/>
-                <w:szCs w:val="20"/>
-              </w:rPr>
-              <w:t>Grouping variable(s)</w:t>
-            </w:r>
-          </w:p>
-        </w:tc>
-        <w:tc>
-          <w:tcPr>
-            <w:tcW w:w="1200" w:type="dxa"/>
-            <w:tcBorders>
-              <w:top w:val="single" w:sz="4" w:space="0" w:color="BFBFBF"/>
-              <w:left w:val="single" w:sz="4" w:space="0" w:color="BFBFBF"/>
-              <w:bottom w:val="single" w:sz="4" w:space="0" w:color="BFBFBF"/>
-              <w:right w:val="single" w:sz="4" w:space="0" w:color="BFBFBF"/>
-            </w:tcBorders>
-            <w:shd w:val="clear" w:color="auto" w:fill="F5F7FA"/>
-            <w:tcMar>
-              <w:top w:w="60" w:type="dxa"/>
-              <w:left w:w="100" w:type="dxa"/>
-              <w:bottom w:w="60" w:type="dxa"/>
-              <w:right w:w="100" w:type="dxa"/>
-            </w:tcMar>
-          </w:tcPr>
-          <w:p>
-            <w:pPr>
-              <w:spacing w:after="40"/>
-            </w:pPr>
-            <w:r>
-              <w:rPr>
-                <w:sz w:val="20"/>
-                <w:szCs w:val="20"/>
-              </w:rPr>
-              <w:t>No</w:t>
-            </w:r>
-          </w:p>
-        </w:tc>
-        <w:tc>
-          <w:tcPr>
-            <w:tcW w:w="5760" w:type="dxa"/>
-            <w:tcBorders>
-              <w:top w:val="single" w:sz="4" w:space="0" w:color="BFBFBF"/>
-              <w:left w:val="single" w:sz="4" w:space="0" w:color="BFBFBF"/>
-              <w:bottom w:val="single" w:sz="4" w:space="0" w:color="BFBFBF"/>
-              <w:right w:val="single" w:sz="4" w:space="0" w:color="BFBFBF"/>
-            </w:tcBorders>
-            <w:shd w:val="clear" w:color="auto" w:fill="F5F7FA"/>
-            <w:tcMar>
-              <w:top w:w="60" w:type="dxa"/>
-              <w:left w:w="100" w:type="dxa"/>
-              <w:bottom w:w="60" w:type="dxa"/>
-              <w:right w:w="100" w:type="dxa"/>
-            </w:tcMar>
-          </w:tcPr>
-          <w:p>
-            <w:pPr>
-              <w:spacing w:after="40"/>
-            </w:pPr>
-            <w:r>
-              <w:rPr>
-                <w:sz w:val="20"/>
-                <w:szCs w:val="20"/>
-              </w:rPr>
-              <w:t>Factor variables used to summarise the estimates, for example total bycatch by statistical area in each year, or a summary by a variable other than Year. A grouping variable does not have to be a stratification variable. If it is not, the estimates are allocated across its levels in proportion to total logbook effort.</w:t>
-            </w:r>
-          </w:p>
-        </w:tc>
-      </w:tr>
-      <w:tr>
-        <w:tblPrEx>
-          <w:tblCellMar>
-            <w:top w:w="0" w:type="dxa"/>
-            <w:bottom w:w="0" w:type="dxa"/>
-          </w:tblCellMar>
-        </w:tblPrEx>
-        <w:trPr>
-          <w:cantSplit/>
-        </w:trPr>
-        <w:tc>
-          <w:tcPr>
-            <w:tcW w:w="2400" w:type="dxa"/>
-            <w:tcBorders>
-              <w:top w:val="single" w:sz="4" w:space="0" w:color="BFBFBF"/>
-              <w:left w:val="single" w:sz="4" w:space="0" w:color="BFBFBF"/>
-              <w:bottom w:val="single" w:sz="4" w:space="0" w:color="BFBFBF"/>
-              <w:right w:val="single" w:sz="4" w:space="0" w:color="BFBFBF"/>
-            </w:tcBorders>
-            <w:tcMar>
-              <w:top w:w="60" w:type="dxa"/>
-              <w:left w:w="100" w:type="dxa"/>
-              <w:bottom w:w="60" w:type="dxa"/>
-              <w:right w:w="100" w:type="dxa"/>
-            </w:tcMar>
-          </w:tcPr>
-          <w:p>
-            <w:pPr>
-              <w:spacing w:after="40"/>
-            </w:pPr>
-            <w:r>
-              <w:rPr>
-                <w:sz w:val="20"/>
-                <w:szCs w:val="20"/>
-              </w:rPr>
-              <w:t>Analysis methods</w:t>
-            </w:r>
-          </w:p>
-        </w:tc>
-        <w:tc>
-          <w:tcPr>
-            <w:tcW w:w="1200" w:type="dxa"/>
-            <w:tcBorders>
-              <w:top w:val="single" w:sz="4" w:space="0" w:color="BFBFBF"/>
-              <w:left w:val="single" w:sz="4" w:space="0" w:color="BFBFBF"/>
-              <w:bottom w:val="single" w:sz="4" w:space="0" w:color="BFBFBF"/>
-              <w:right w:val="single" w:sz="4" w:space="0" w:color="BFBFBF"/>
-            </w:tcBorders>
-            <w:tcMar>
-              <w:top w:w="60" w:type="dxa"/>
-              <w:left w:w="100" w:type="dxa"/>
-              <w:bottom w:w="60" w:type="dxa"/>
-              <w:right w:w="100" w:type="dxa"/>
-            </w:tcMar>
-          </w:tcPr>
-          <w:p>
-            <w:pPr>
-              <w:spacing w:after="40"/>
-            </w:pPr>
-            <w:r>
-              <w:rPr>
-                <w:sz w:val="20"/>
-                <w:szCs w:val="20"/>
-              </w:rPr>
-              <w:t>Yes</w:t>
-            </w:r>
-          </w:p>
-        </w:tc>
-        <w:tc>
-          <w:tcPr>
-            <w:tcW w:w="5760" w:type="dxa"/>
-            <w:tcBorders>
-              <w:top w:val="single" w:sz="4" w:space="0" w:color="BFBFBF"/>
-              <w:left w:val="single" w:sz="4" w:space="0" w:color="BFBFBF"/>
-              <w:bottom w:val="single" w:sz="4" w:space="0" w:color="BFBFBF"/>
-              <w:right w:val="single" w:sz="4" w:space="0" w:color="BFBFBF"/>
-            </w:tcBorders>
-            <w:tcMar>
-              <w:top w:w="60" w:type="dxa"/>
-              <w:left w:w="100" w:type="dxa"/>
-              <w:bottom w:w="60" w:type="dxa"/>
-              <w:right w:w="100" w:type="dxa"/>
-            </w:tcMar>
-          </w:tcPr>
-          <w:p>
-            <w:pPr>
-              <w:spacing w:after="40"/>
-            </w:pPr>
-            <w:r>
-              <w:rPr>
-                <w:sz w:val="20"/>
-                <w:szCs w:val="20"/>
-              </w:rPr>
-              <w:t>Ratio, Delta, or both. Both are selected by default.</w:t>
-            </w:r>
-          </w:p>
-        </w:tc>
-      </w:tr>
-      <w:tr>
-        <w:tblPrEx>
-          <w:tblCellMar>
-            <w:top w:w="0" w:type="dxa"/>
-            <w:bottom w:w="0" w:type="dxa"/>
-          </w:tblCellMar>
-        </w:tblPrEx>
-        <w:trPr>
-          <w:cantSplit/>
-        </w:trPr>
-        <w:tc>
-          <w:tcPr>
-            <w:tcW w:w="2400" w:type="dxa"/>
-            <w:tcBorders>
-              <w:top w:val="single" w:sz="4" w:space="0" w:color="BFBFBF"/>
-              <w:left w:val="single" w:sz="4" w:space="0" w:color="BFBFBF"/>
-              <w:bottom w:val="single" w:sz="4" w:space="0" w:color="BFBFBF"/>
-              <w:right w:val="single" w:sz="4" w:space="0" w:color="BFBFBF"/>
-            </w:tcBorders>
-            <w:shd w:val="clear" w:color="auto" w:fill="F5F7FA"/>
-            <w:tcMar>
-              <w:top w:w="60" w:type="dxa"/>
-              <w:left w:w="100" w:type="dxa"/>
-              <w:bottom w:w="60" w:type="dxa"/>
-              <w:right w:w="100" w:type="dxa"/>
-            </w:tcMar>
-          </w:tcPr>
-          <w:p>
-            <w:pPr>
-              <w:spacing w:after="40"/>
-            </w:pPr>
-            <w:r>
-              <w:rPr>
-                <w:sz w:val="20"/>
-                <w:szCs w:val="20"/>
-              </w:rPr>
-              <w:t>Scenario name</w:t>
-            </w:r>
-          </w:p>
-        </w:tc>
-        <w:tc>
-          <w:tcPr>
-            <w:tcW w:w="1200" w:type="dxa"/>
-            <w:tcBorders>
-              <w:top w:val="single" w:sz="4" w:space="0" w:color="BFBFBF"/>
-              <w:left w:val="single" w:sz="4" w:space="0" w:color="BFBFBF"/>
-              <w:bottom w:val="single" w:sz="4" w:space="0" w:color="BFBFBF"/>
-              <w:right w:val="single" w:sz="4" w:space="0" w:color="BFBFBF"/>
-            </w:tcBorders>
-            <w:shd w:val="clear" w:color="auto" w:fill="F5F7FA"/>
-            <w:tcMar>
-              <w:top w:w="60" w:type="dxa"/>
-              <w:left w:w="100" w:type="dxa"/>
-              <w:bottom w:w="60" w:type="dxa"/>
-              <w:right w:w="100" w:type="dxa"/>
-            </w:tcMar>
-          </w:tcPr>
-          <w:p>
-            <w:pPr>
-              <w:spacing w:after="40"/>
-            </w:pPr>
-            <w:r>
-              <w:rPr>
-                <w:sz w:val="20"/>
-                <w:szCs w:val="20"/>
-              </w:rPr>
-              <w:t>Yes</w:t>
-            </w:r>
-          </w:p>
-        </w:tc>
-        <w:tc>
-          <w:tcPr>
-            <w:tcW w:w="5760" w:type="dxa"/>
-            <w:tcBorders>
-              <w:top w:val="single" w:sz="4" w:space="0" w:color="BFBFBF"/>
-              <w:left w:val="single" w:sz="4" w:space="0" w:color="BFBFBF"/>
-              <w:bottom w:val="single" w:sz="4" w:space="0" w:color="BFBFBF"/>
-              <w:right w:val="single" w:sz="4" w:space="0" w:color="BFBFBF"/>
-            </w:tcBorders>
-            <w:shd w:val="clear" w:color="auto" w:fill="F5F7FA"/>
-            <w:tcMar>
-              <w:top w:w="60" w:type="dxa"/>
-              <w:left w:w="100" w:type="dxa"/>
-              <w:bottom w:w="60" w:type="dxa"/>
-              <w:right w:w="100" w:type="dxa"/>
-            </w:tcMar>
-          </w:tcPr>
-          <w:p>
-            <w:pPr>
-              <w:spacing w:after="40"/>
-            </w:pPr>
-            <w:r>
-              <w:rPr>
-                <w:sz w:val="20"/>
-                <w:szCs w:val="20"/>
-              </w:rPr>
-              <w:t>A name for this analysis (maximum 100 characters).</w:t>
-            </w:r>
-          </w:p>
-        </w:tc>
-      </w:tr>
-    </w:tbl>
-    <w:p>
-      <w:pPr>
-        <w:spacing w:after="120"/>
-      </w:pPr>
-    </w:p>
-    <w:p>
-      <w:pPr>
-        <w:pBdr>
-          <w:top w:val="dashed" w:sz="6" w:space="6" w:color="00838F"/>
-          <w:left w:val="dashed" w:sz="6" w:space="6" w:color="00838F"/>
-          <w:bottom w:val="dashed" w:sz="6" w:space="6" w:color="00838F"/>
-          <w:right w:val="dashed" w:sz="6" w:space="6" w:color="00838F"/>
-        </w:pBdr>
-        <w:shd w:val="clear" w:color="auto" w:fill="E0F7FA"/>
-        <w:spacing w:before="120" w:after="200" w:line="276" w:lineRule="auto"/>
-        <w:ind w:left="200" w:right="200"/>
-        <w:jc w:val="center"/>
-      </w:pPr>
-      <w:r>
-        <w:rPr>
-          <w:b/>
-          <w:bCs/>
-          <w:color w:val="00606B"/>
-        </w:rPr>
-        <w:t>[SCREENSHOT: Specifications page with selections made.]</w:t>
-      </w:r>
     </w:p>
     <w:p>
       <w:pPr>
@@ -11350,7 +10429,192 @@
     </w:p>
     <w:p>
       <w:pPr>
+        <w:spacing w:after="80" w:line="276" w:lineRule="auto"/>
+      </w:pPr>
+    </w:p>
+    <w:p>
+      <w:pPr>
+        <w:pStyle w:val="Heading3"/>
+      </w:pPr>
+      <w:r>
+        <w:t>Step 1: Select one or more design stratification variables (mandatory).</w:t>
+      </w:r>
+    </w:p>
+    <w:p>
+      <w:pPr>
+        <w:spacing w:after="120" w:line="276" w:lineRule="auto"/>
+      </w:pPr>
+      <w:r>
+        <w:t>Total bycatch is estimated separately at each level of the variables you select. Choices come from the factor variables you set up in Bycatch setup (including Year).</w:t>
+      </w:r>
+    </w:p>
+    <w:p>
+      <w:pPr>
+        <w:spacing w:after="80" w:line="276" w:lineRule="auto"/>
+      </w:pPr>
+      <w:r>
+        <w:t xml:space="preserve">This is also the step where pooling is specified, if necessary. </w:t>
+      </w:r>
+      <w:r>
+        <w:t>To deal with strata that have no observations or few observations, the user may request pooling</w:t>
+      </w:r>
+      <w:r>
+        <w:t xml:space="preserve"> for any selected stratification variable. </w:t>
+      </w:r>
+      <w:r>
+        <w:t>If pooling, the total bycatch is estimated for the observer and logbook data specified by the pooling scheme for each stratum (i.e. combination of variables) and then allocated to the stratum according to the fraction of the logbook effort in the pooled data that is in the stratum of interest. Unpooled estimates are used for strata with sufficient data. Variances are also allocated to the stratum of interest based on the fraction of total effort.</w:t>
+      </w:r>
+      <w:r>
+        <w:t xml:space="preserve"> Select ‘none’ for each stratification variable to avoid pooling.</w:t>
+      </w:r>
+    </w:p>
+    <w:p>
+      <w:pPr>
+        <w:tabs>
+          <w:tab w:val="num" w:pos="720"/>
+        </w:tabs>
+        <w:spacing w:after="80" w:line="276" w:lineRule="auto"/>
+      </w:pPr>
+      <w:r>
+        <w:t xml:space="preserve">If pooling is requested, the strata will be pooled in the order </w:t>
+      </w:r>
+      <w:r>
+        <w:t>the selected variables are displayed in this step</w:t>
+      </w:r>
+      <w:r>
+        <w:t>.</w:t>
+      </w:r>
+      <w:r>
+        <w:t xml:space="preserve"> You must also s</w:t>
+      </w:r>
+      <w:r>
+        <w:t xml:space="preserve">pecify </w:t>
+      </w:r>
+      <w:r>
+        <w:t xml:space="preserve">‘Minimum stratification unit’, which is </w:t>
+      </w:r>
+      <w:r>
+        <w:t>the minimum number of sample units needed to avoid pooling</w:t>
+      </w:r>
+      <w:r>
+        <w:t xml:space="preserve"> and must be a value greater than 0</w:t>
+      </w:r>
+      <w:r>
+        <w:t>.</w:t>
+      </w:r>
+      <w:r>
+        <w:t xml:space="preserve"> Pooling type must also be selected. </w:t>
+      </w:r>
+      <w:r>
+        <w:t>Pooling type 'pooledVar' applies an alternate variable to the selected stratification variable</w:t>
+      </w:r>
+      <w:r>
+        <w:t xml:space="preserve"> </w:t>
+      </w:r>
+      <w:r>
+        <w:t>(e.g. season rather than month)</w:t>
+      </w:r>
+      <w:r>
+        <w:t xml:space="preserve">. </w:t>
+      </w:r>
+      <w:r>
+        <w:t>If 'pooledVar' is used, the name of the alternate variable must be specified.</w:t>
+      </w:r>
+      <w:r>
+        <w:t xml:space="preserve"> </w:t>
+      </w:r>
+      <w:r>
+        <w:t xml:space="preserve">Pooling can also be carried out across ‘all’ values. </w:t>
+      </w:r>
+      <w:r>
+        <w:t>Pooling type 'adjacent' is only available for Year variable. If 'adjacent is used, ensure that Number of adjacent years is greater than 0</w:t>
+      </w:r>
+      <w:r>
+        <w:t xml:space="preserve">, </w:t>
+      </w:r>
+      <w:r>
+        <w:t>which specifies the number of adjacent years to include for the adjacent year method (e.g. 1 to include both the previous and following year).</w:t>
+      </w:r>
+    </w:p>
+    <w:p>
+      <w:pPr>
+        <w:spacing w:after="120" w:line="276" w:lineRule="auto"/>
+        <w:rPr>
+          <w:i/>
+          <w:iCs/>
+        </w:rPr>
+      </w:pPr>
+    </w:p>
+    <w:p>
+      <w:pPr>
+        <w:spacing w:after="120" w:line="276" w:lineRule="auto"/>
+      </w:pPr>
+    </w:p>
+    <w:p>
+      <w:pPr>
+        <w:pStyle w:val="Heading3"/>
+      </w:pPr>
+      <w:r>
+        <w:lastRenderedPageBreak/>
+        <w:t xml:space="preserve">Step </w:t>
+      </w:r>
+      <w:r>
+        <w:t>2</w:t>
+      </w:r>
+      <w:r>
+        <w:t xml:space="preserve">: </w:t>
+      </w:r>
+      <w:r>
+        <w:t>Optionally, select grouping variables.</w:t>
+      </w:r>
+    </w:p>
+    <w:p>
+      <w:pPr>
+        <w:rPr>
+          <w:sz w:val="20"/>
+          <w:szCs w:val="20"/>
+        </w:rPr>
+      </w:pPr>
+      <w:r>
+        <w:rPr>
+          <w:sz w:val="20"/>
+          <w:szCs w:val="20"/>
+        </w:rPr>
+        <w:t xml:space="preserve">Factor variables </w:t>
+      </w:r>
+      <w:r>
+        <w:rPr>
+          <w:sz w:val="20"/>
+          <w:szCs w:val="20"/>
+        </w:rPr>
+        <w:t xml:space="preserve">are </w:t>
+      </w:r>
+      <w:r>
+        <w:rPr>
+          <w:sz w:val="20"/>
+          <w:szCs w:val="20"/>
+        </w:rPr>
+        <w:t>used to summarise the estimates, for example total bycatch by statistical area in each year, or a summary by a variable other than Year. A grouping variable does not have to be a stratification variable. If it is not, the estimates are allocated across its levels in proportion to total logbook effort.</w:t>
+      </w:r>
+    </w:p>
+    <w:p>
+      <w:pPr>
+        <w:pStyle w:val="Heading3"/>
+      </w:pPr>
+      <w:r>
+        <w:t xml:space="preserve">Step 3: </w:t>
+      </w:r>
+      <w:r>
+        <w:t>Select one or both analysis methods</w:t>
+      </w:r>
+    </w:p>
+    <w:p>
+      <w:pPr>
         <w:spacing w:before="80" w:after="160" w:line="276" w:lineRule="auto"/>
+        <w:rPr>
+          <w:i/>
+          <w:iCs/>
+        </w:rPr>
       </w:pPr>
       <w:r>
         <w:rPr>
@@ -11358,87 +10622,92 @@
           <w:iCs/>
           <w:highlight w:val="yellow"/>
         </w:rPr>
-        <w:t>[ADD CONTEXT: Guidance on choosing stratification variables (for example, what makes a sensible stratum, and what happens when strata have very little data).]</w:t>
+        <w:t>[ADD CONTEXT: A plain-language description of the Ratio and Delta methods, when each is appropriate, and their key assumptions. Link to the R package guide for technical detail.]</w:t>
+      </w:r>
+    </w:p>
+    <w:p>
+      <w:pPr>
+        <w:pStyle w:val="Heading3"/>
+      </w:pPr>
+      <w:r>
+        <w:t xml:space="preserve">Step </w:t>
+      </w:r>
+      <w:r>
+        <w:t>4</w:t>
+      </w:r>
+      <w:r>
+        <w:t xml:space="preserve">: </w:t>
+      </w:r>
+      <w:r>
+        <w:t>Enter a scenario name (maximum 100 characters).</w:t>
+      </w:r>
+    </w:p>
+    <w:p>
+      <w:pPr>
+        <w:spacing w:after="80" w:line="276" w:lineRule="auto"/>
+      </w:pPr>
+      <w:r>
+        <w:rPr>
+          <w:sz w:val="20"/>
+          <w:szCs w:val="20"/>
+        </w:rPr>
+        <w:t>A name for this analysis (maximum 100 characters).</w:t>
+      </w:r>
+    </w:p>
+    <w:p>
+      <w:pPr>
+        <w:pStyle w:val="Heading3"/>
+      </w:pPr>
+      <w:r>
+        <w:t xml:space="preserve">Step 4: </w:t>
+      </w:r>
+      <w:r>
+        <w:t>Click Run analysis.</w:t>
       </w:r>
     </w:p>
     <w:p>
       <w:pPr>
         <w:spacing w:after="120" w:line="276" w:lineRule="auto"/>
-      </w:pPr>
-      <w:r>
-        <w:lastRenderedPageBreak/>
-        <w:t xml:space="preserve">When the analysis succeeds, </w:t>
-      </w:r>
-      <w:r>
-        <w:rPr>
-          <w:b/>
-          <w:bCs/>
-        </w:rPr>
-        <w:t>Analysis completed</w:t>
-      </w:r>
-      <w:r>
-        <w:t xml:space="preserve"> appears and the page switches to the </w:t>
-      </w:r>
-      <w:r>
-        <w:rPr>
-          <w:b/>
-          <w:bCs/>
-        </w:rPr>
-        <w:t>Analysis summary</w:t>
-      </w:r>
-      <w:r>
-        <w:t xml:space="preserve"> tab, which recaps your inputs. If it fails, a message tells you to review your fields for missing entries or warnings; a red notification gives technical details.</w:t>
-      </w:r>
-    </w:p>
-    <w:p>
-      <w:pPr>
-        <w:pBdr>
-          <w:top w:val="dashed" w:sz="6" w:space="6" w:color="00838F"/>
-          <w:left w:val="dashed" w:sz="6" w:space="6" w:color="00838F"/>
-          <w:bottom w:val="dashed" w:sz="6" w:space="6" w:color="00838F"/>
-          <w:right w:val="dashed" w:sz="6" w:space="6" w:color="00838F"/>
-        </w:pBdr>
-        <w:shd w:val="clear" w:color="auto" w:fill="E0F7FA"/>
-        <w:spacing w:before="120" w:after="200" w:line="276" w:lineRule="auto"/>
-        <w:ind w:left="200" w:right="200"/>
-        <w:jc w:val="center"/>
-      </w:pPr>
-      <w:r>
         <w:rPr>
           <w:b/>
           <w:bCs/>
           <w:color w:val="00606B"/>
         </w:rPr>
-        <w:t>[SCREENSHOT: Analysis summary tab.]</w:t>
-      </w:r>
-    </w:p>
-    <w:p>
-      <w:pPr>
-        <w:pBdr>
-          <w:top w:val="dashed" w:sz="6" w:space="6" w:color="00838F"/>
-          <w:left w:val="dashed" w:sz="6" w:space="6" w:color="00838F"/>
-          <w:bottom w:val="dashed" w:sz="6" w:space="6" w:color="00838F"/>
-          <w:right w:val="dashed" w:sz="6" w:space="6" w:color="00838F"/>
-        </w:pBdr>
-        <w:shd w:val="clear" w:color="auto" w:fill="E0F7FA"/>
-        <w:spacing w:before="120" w:after="200" w:line="276" w:lineRule="auto"/>
-        <w:ind w:left="200" w:right="200"/>
-        <w:jc w:val="center"/>
-      </w:pPr>
+      </w:pPr>
+      <w:r>
+        <w:t xml:space="preserve">When the analysis succeeds, </w:t>
+      </w:r>
       <w:r>
         <w:rPr>
           <w:b/>
           <w:bCs/>
-          <w:color w:val="00606B"/>
-        </w:rPr>
-        <w:t>[SCREENSHOT: The “Analysis completed” message.]</w:t>
-      </w:r>
+        </w:rPr>
+        <w:t>Analysis completed</w:t>
+      </w:r>
+      <w:r>
+        <w:t xml:space="preserve"> appears and the page switches to the </w:t>
+      </w:r>
+      <w:r>
+        <w:rPr>
+          <w:b/>
+          <w:bCs/>
+        </w:rPr>
+        <w:t>Analysis summary</w:t>
+      </w:r>
+      <w:r>
+        <w:t xml:space="preserve"> tab, which recaps your inputs. If it fails, a message tells you to review your fields for missing entries or warnings; a red notification gives technical details.</w:t>
+      </w:r>
+    </w:p>
+    <w:p>
+      <w:pPr>
+        <w:spacing w:after="120" w:line="276" w:lineRule="auto"/>
+      </w:pPr>
     </w:p>
     <w:p>
       <w:pPr>
         <w:pStyle w:val="Heading2"/>
       </w:pPr>
-      <w:bookmarkStart w:id="21" w:name="_Toc243047572"/>
+      <w:bookmarkStart w:id="21" w:name="_Toc244093404"/>
       <w:r>
         <w:t>5.2 Analysis results</w:t>
       </w:r>
@@ -11490,51 +10759,11 @@
     </w:p>
     <w:p>
       <w:pPr>
-        <w:pBdr>
-          <w:top w:val="dashed" w:sz="6" w:space="6" w:color="00838F"/>
-          <w:left w:val="dashed" w:sz="6" w:space="6" w:color="00838F"/>
-          <w:bottom w:val="dashed" w:sz="6" w:space="6" w:color="00838F"/>
-          <w:right w:val="dashed" w:sz="6" w:space="6" w:color="00838F"/>
-        </w:pBdr>
-        <w:shd w:val="clear" w:color="auto" w:fill="E0F7FA"/>
-        <w:spacing w:before="120" w:after="200" w:line="276" w:lineRule="auto"/>
-        <w:ind w:left="200" w:right="200"/>
-        <w:jc w:val="center"/>
-      </w:pPr>
-      <w:r>
-        <w:rPr>
-          <w:b/>
-          <w:bCs/>
-          <w:color w:val="00606B"/>
-        </w:rPr>
-        <w:t>[SCREENSHOT: Top of the Analysis results report.]</w:t>
-      </w:r>
-    </w:p>
-    <w:p>
-      <w:pPr>
-        <w:pBdr>
-          <w:top w:val="dashed" w:sz="6" w:space="6" w:color="00838F"/>
-          <w:left w:val="dashed" w:sz="6" w:space="6" w:color="00838F"/>
-          <w:bottom w:val="dashed" w:sz="6" w:space="6" w:color="00838F"/>
-          <w:right w:val="dashed" w:sz="6" w:space="6" w:color="00838F"/>
-        </w:pBdr>
-        <w:shd w:val="clear" w:color="auto" w:fill="E0F7FA"/>
-        <w:spacing w:before="120" w:after="200" w:line="276" w:lineRule="auto"/>
-        <w:ind w:left="200" w:right="200"/>
-        <w:jc w:val="center"/>
-      </w:pPr>
-      <w:r>
-        <w:rPr>
-          <w:b/>
-          <w:bCs/>
-          <w:color w:val="00606B"/>
-        </w:rPr>
-        <w:t>[SCREENSHOT: The figure of annual estimates with confidence intervals.]</w:t>
-      </w:r>
-    </w:p>
-    <w:p>
-      <w:pPr>
         <w:spacing w:before="80" w:after="160" w:line="276" w:lineRule="auto"/>
+        <w:rPr>
+          <w:i/>
+          <w:iCs/>
+        </w:rPr>
       </w:pPr>
       <w:r>
         <w:rPr>
@@ -11547,52 +10776,67 @@
     </w:p>
     <w:p>
       <w:pPr>
-        <w:pStyle w:val="Heading2"/>
-      </w:pPr>
-      <w:bookmarkStart w:id="22" w:name="_Toc243047573"/>
-      <w:r>
-        <w:t>5.3 Trying a different analysis</w:t>
-      </w:r>
-      <w:bookmarkEnd w:id="22"/>
-    </w:p>
-    <w:p>
-      <w:pPr>
         <w:spacing w:after="120" w:line="276" w:lineRule="auto"/>
       </w:pPr>
-      <w:r>
-        <w:t xml:space="preserve">To change your specifications, click </w:t>
-      </w:r>
+    </w:p>
+    <w:p>
+      <w:pPr>
+        <w:pBdr>
+          <w:left w:val="single" w:sz="18" w:space="8" w:color="2E7D32"/>
+        </w:pBdr>
+        <w:shd w:val="clear" w:color="auto" w:fill="E8F5E9"/>
+        <w:spacing w:before="120" w:after="160" w:line="276" w:lineRule="auto"/>
+        <w:ind w:left="200" w:right="100"/>
+      </w:pPr>
       <w:r>
         <w:rPr>
           <w:b/>
           <w:bCs/>
-        </w:rPr>
-        <w:t>Reset analysis and return to previous</w:t>
-      </w:r>
-      <w:r>
-        <w:t xml:space="preserve"> on the Analysis summary tab and confirm. This deletes the current design-based analysis, so download your results first.</w:t>
-      </w:r>
-    </w:p>
-    <w:p>
-      <w:pPr>
-        <w:pBdr>
-          <w:top w:val="dashed" w:sz="6" w:space="6" w:color="00838F"/>
-          <w:left w:val="dashed" w:sz="6" w:space="6" w:color="00838F"/>
-          <w:bottom w:val="dashed" w:sz="6" w:space="6" w:color="00838F"/>
-          <w:right w:val="dashed" w:sz="6" w:space="6" w:color="00838F"/>
-        </w:pBdr>
-        <w:shd w:val="clear" w:color="auto" w:fill="E0F7FA"/>
-        <w:spacing w:before="120" w:after="200" w:line="276" w:lineRule="auto"/>
-        <w:ind w:left="200" w:right="200"/>
-        <w:jc w:val="center"/>
-      </w:pPr>
+          <w:color w:val="2E7D32"/>
+        </w:rPr>
+        <w:t xml:space="preserve">Tip: </w:t>
+      </w:r>
+      <w:r>
+        <w:t xml:space="preserve">The Data </w:t>
+      </w:r>
+      <w:r>
+        <w:t>analysis</w:t>
+      </w:r>
+      <w:r>
+        <w:t xml:space="preserve"> report is also included in the zip file you can download (Section 6).</w:t>
+      </w:r>
+    </w:p>
+    <w:p>
+      <w:pPr>
+        <w:pStyle w:val="Heading2"/>
+      </w:pPr>
+    </w:p>
+    <w:p>
+      <w:pPr>
+        <w:pStyle w:val="Heading2"/>
+      </w:pPr>
+      <w:bookmarkStart w:id="22" w:name="_Toc244093405"/>
+      <w:r>
+        <w:t>5.3 Trying a different analysis</w:t>
+      </w:r>
+      <w:bookmarkEnd w:id="22"/>
+    </w:p>
+    <w:p>
+      <w:pPr>
+        <w:spacing w:after="120" w:line="276" w:lineRule="auto"/>
+      </w:pPr>
+      <w:r>
+        <w:t xml:space="preserve">To change your specifications, click </w:t>
+      </w:r>
       <w:r>
         <w:rPr>
           <w:b/>
           <w:bCs/>
-          <w:color w:val="00606B"/>
-        </w:rPr>
-        <w:t>[SCREENSHOT: The “Reset design-based estimator analysis?” confirmation message.]</w:t>
+        </w:rPr>
+        <w:t>Reset analysis and return to previous</w:t>
+      </w:r>
+      <w:r>
+        <w:t xml:space="preserve"> on the Analysis summary tab and confirm. This deletes the current design-based analysis, so download your results first.</w:t>
       </w:r>
     </w:p>
     <w:p>
@@ -11613,7 +10857,7 @@
       <w:pPr>
         <w:pStyle w:val="Heading1"/>
       </w:pPr>
-      <w:bookmarkStart w:id="23" w:name="_Toc243047574"/>
+      <w:bookmarkStart w:id="23" w:name="_Toc244093406"/>
       <w:r>
         <w:lastRenderedPageBreak/>
         <w:t xml:space="preserve">6. </w:t>
@@ -11744,12 +10988,6 @@
         <w:gridCol w:w="6960"/>
       </w:tblGrid>
       <w:tr>
-        <w:tblPrEx>
-          <w:tblCellMar>
-            <w:top w:w="0" w:type="dxa"/>
-            <w:bottom w:w="0" w:type="dxa"/>
-          </w:tblCellMar>
-        </w:tblPrEx>
         <w:trPr>
           <w:tblHeader/>
         </w:trPr>
@@ -11821,12 +11059,6 @@
         </w:tc>
       </w:tr>
       <w:tr>
-        <w:tblPrEx>
-          <w:tblCellMar>
-            <w:top w:w="0" w:type="dxa"/>
-            <w:bottom w:w="0" w:type="dxa"/>
-          </w:tblCellMar>
-        </w:tblPrEx>
         <w:trPr>
           <w:cantSplit/>
         </w:trPr>
@@ -11926,12 +11158,6 @@
         </w:tc>
       </w:tr>
       <w:tr>
-        <w:tblPrEx>
-          <w:tblCellMar>
-            <w:top w:w="0" w:type="dxa"/>
-            <w:bottom w:w="0" w:type="dxa"/>
-          </w:tblCellMar>
-        </w:tblPrEx>
         <w:trPr>
           <w:cantSplit/>
         </w:trPr>
@@ -11997,12 +11223,6 @@
         </w:tc>
       </w:tr>
       <w:tr>
-        <w:tblPrEx>
-          <w:tblCellMar>
-            <w:top w:w="0" w:type="dxa"/>
-            <w:bottom w:w="0" w:type="dxa"/>
-          </w:tblCellMar>
-        </w:tblPrEx>
         <w:trPr>
           <w:cantSplit/>
         </w:trPr>
@@ -12171,7 +11391,7 @@
       <w:pPr>
         <w:pStyle w:val="Heading1"/>
       </w:pPr>
-      <w:bookmarkStart w:id="24" w:name="_Toc243047575"/>
+      <w:bookmarkStart w:id="24" w:name="_Toc244093407"/>
       <w:r>
         <w:lastRenderedPageBreak/>
         <w:t>7. Help and further resources</w:t>
@@ -12231,7 +11451,7 @@
       <w:pPr>
         <w:pStyle w:val="Heading1"/>
       </w:pPr>
-      <w:bookmarkStart w:id="25" w:name="_Toc243047576"/>
+      <w:bookmarkStart w:id="25" w:name="_Toc244093408"/>
       <w:r>
         <w:lastRenderedPageBreak/>
         <w:t>8. Troubleshooting</w:t>
@@ -12261,12 +11481,6 @@
         <w:gridCol w:w="3360"/>
       </w:tblGrid>
       <w:tr>
-        <w:tblPrEx>
-          <w:tblCellMar>
-            <w:top w:w="0" w:type="dxa"/>
-            <w:bottom w:w="0" w:type="dxa"/>
-          </w:tblCellMar>
-        </w:tblPrEx>
         <w:trPr>
           <w:tblHeader/>
         </w:trPr>
@@ -12371,12 +11585,6 @@
         </w:tc>
       </w:tr>
       <w:tr>
-        <w:tblPrEx>
-          <w:tblCellMar>
-            <w:top w:w="0" w:type="dxa"/>
-            <w:bottom w:w="0" w:type="dxa"/>
-          </w:tblCellMar>
-        </w:tblPrEx>
         <w:trPr>
           <w:cantSplit/>
         </w:trPr>
@@ -12469,12 +11677,6 @@
         </w:tc>
       </w:tr>
       <w:tr>
-        <w:tblPrEx>
-          <w:tblCellMar>
-            <w:top w:w="0" w:type="dxa"/>
-            <w:bottom w:w="0" w:type="dxa"/>
-          </w:tblCellMar>
-        </w:tblPrEx>
         <w:trPr>
           <w:cantSplit/>
         </w:trPr>
@@ -12586,12 +11788,6 @@
         </w:tc>
       </w:tr>
       <w:tr>
-        <w:tblPrEx>
-          <w:tblCellMar>
-            <w:top w:w="0" w:type="dxa"/>
-            <w:bottom w:w="0" w:type="dxa"/>
-          </w:tblCellMar>
-        </w:tblPrEx>
         <w:trPr>
           <w:cantSplit/>
         </w:trPr>
@@ -12700,12 +11896,6 @@
         </w:tc>
       </w:tr>
       <w:tr>
-        <w:tblPrEx>
-          <w:tblCellMar>
-            <w:top w:w="0" w:type="dxa"/>
-            <w:bottom w:w="0" w:type="dxa"/>
-          </w:tblCellMar>
-        </w:tblPrEx>
         <w:trPr>
           <w:cantSplit/>
         </w:trPr>
@@ -12801,12 +11991,6 @@
         </w:tc>
       </w:tr>
       <w:tr>
-        <w:tblPrEx>
-          <w:tblCellMar>
-            <w:top w:w="0" w:type="dxa"/>
-            <w:bottom w:w="0" w:type="dxa"/>
-          </w:tblCellMar>
-        </w:tblPrEx>
         <w:trPr>
           <w:cantSplit/>
         </w:trPr>
@@ -12899,12 +12083,6 @@
         </w:tc>
       </w:tr>
       <w:tr>
-        <w:tblPrEx>
-          <w:tblCellMar>
-            <w:top w:w="0" w:type="dxa"/>
-            <w:bottom w:w="0" w:type="dxa"/>
-          </w:tblCellMar>
-        </w:tblPrEx>
         <w:trPr>
           <w:cantSplit/>
         </w:trPr>
@@ -13000,12 +12178,6 @@
         </w:tc>
       </w:tr>
       <w:tr>
-        <w:tblPrEx>
-          <w:tblCellMar>
-            <w:top w:w="0" w:type="dxa"/>
-            <w:bottom w:w="0" w:type="dxa"/>
-          </w:tblCellMar>
-        </w:tblPrEx>
         <w:trPr>
           <w:cantSplit/>
         </w:trPr>
@@ -13098,12 +12270,6 @@
         </w:tc>
       </w:tr>
       <w:tr>
-        <w:tblPrEx>
-          <w:tblCellMar>
-            <w:top w:w="0" w:type="dxa"/>
-            <w:bottom w:w="0" w:type="dxa"/>
-          </w:tblCellMar>
-        </w:tblPrEx>
         <w:trPr>
           <w:cantSplit/>
         </w:trPr>
@@ -13199,12 +12365,6 @@
         </w:tc>
       </w:tr>
       <w:tr>
-        <w:tblPrEx>
-          <w:tblCellMar>
-            <w:top w:w="0" w:type="dxa"/>
-            <w:bottom w:w="0" w:type="dxa"/>
-          </w:tblCellMar>
-        </w:tblPrEx>
         <w:trPr>
           <w:cantSplit/>
         </w:trPr>
@@ -13297,12 +12457,6 @@
         </w:tc>
       </w:tr>
       <w:tr>
-        <w:tblPrEx>
-          <w:tblCellMar>
-            <w:top w:w="0" w:type="dxa"/>
-            <w:bottom w:w="0" w:type="dxa"/>
-          </w:tblCellMar>
-        </w:tblPrEx>
         <w:trPr>
           <w:cantSplit/>
         </w:trPr>
@@ -13398,12 +12552,6 @@
         </w:tc>
       </w:tr>
       <w:tr>
-        <w:tblPrEx>
-          <w:tblCellMar>
-            <w:top w:w="0" w:type="dxa"/>
-            <w:bottom w:w="0" w:type="dxa"/>
-          </w:tblCellMar>
-        </w:tblPrEx>
         <w:trPr>
           <w:cantSplit/>
         </w:trPr>
@@ -13496,12 +12644,6 @@
         </w:tc>
       </w:tr>
       <w:tr>
-        <w:tblPrEx>
-          <w:tblCellMar>
-            <w:top w:w="0" w:type="dxa"/>
-            <w:bottom w:w="0" w:type="dxa"/>
-          </w:tblCellMar>
-        </w:tblPrEx>
         <w:trPr>
           <w:cantSplit/>
         </w:trPr>
@@ -13597,12 +12739,6 @@
         </w:tc>
       </w:tr>
       <w:tr>
-        <w:tblPrEx>
-          <w:tblCellMar>
-            <w:top w:w="0" w:type="dxa"/>
-            <w:bottom w:w="0" w:type="dxa"/>
-          </w:tblCellMar>
-        </w:tblPrEx>
         <w:trPr>
           <w:cantSplit/>
         </w:trPr>
@@ -13695,12 +12831,6 @@
         </w:tc>
       </w:tr>
       <w:tr>
-        <w:tblPrEx>
-          <w:tblCellMar>
-            <w:top w:w="0" w:type="dxa"/>
-            <w:bottom w:w="0" w:type="dxa"/>
-          </w:tblCellMar>
-        </w:tblPrEx>
         <w:trPr>
           <w:cantSplit/>
         </w:trPr>
@@ -13797,12 +12927,6 @@
         </w:tc>
       </w:tr>
       <w:tr>
-        <w:tblPrEx>
-          <w:tblCellMar>
-            <w:top w:w="0" w:type="dxa"/>
-            <w:bottom w:w="0" w:type="dxa"/>
-          </w:tblCellMar>
-        </w:tblPrEx>
         <w:trPr>
           <w:cantSplit/>
         </w:trPr>
@@ -13895,12 +13019,6 @@
         </w:tc>
       </w:tr>
       <w:tr>
-        <w:tblPrEx>
-          <w:tblCellMar>
-            <w:top w:w="0" w:type="dxa"/>
-            <w:bottom w:w="0" w:type="dxa"/>
-          </w:tblCellMar>
-        </w:tblPrEx>
         <w:trPr>
           <w:cantSplit/>
         </w:trPr>
@@ -13996,12 +13114,6 @@
         </w:tc>
       </w:tr>
       <w:tr>
-        <w:tblPrEx>
-          <w:tblCellMar>
-            <w:top w:w="0" w:type="dxa"/>
-            <w:bottom w:w="0" w:type="dxa"/>
-          </w:tblCellMar>
-        </w:tblPrEx>
         <w:trPr>
           <w:cantSplit/>
         </w:trPr>
@@ -14094,12 +13206,6 @@
         </w:tc>
       </w:tr>
       <w:tr>
-        <w:tblPrEx>
-          <w:tblCellMar>
-            <w:top w:w="0" w:type="dxa"/>
-            <w:bottom w:w="0" w:type="dxa"/>
-          </w:tblCellMar>
-        </w:tblPrEx>
         <w:trPr>
           <w:cantSplit/>
         </w:trPr>
@@ -14218,7 +13324,7 @@
       <w:pPr>
         <w:pStyle w:val="Heading1"/>
       </w:pPr>
-      <w:bookmarkStart w:id="26" w:name="_Toc243047577"/>
+      <w:bookmarkStart w:id="26" w:name="_Toc244093409"/>
       <w:r>
         <w:lastRenderedPageBreak/>
         <w:t>9. Glossary</w:t>
@@ -14247,12 +13353,6 @@
         <w:gridCol w:w="6760"/>
       </w:tblGrid>
       <w:tr>
-        <w:tblPrEx>
-          <w:tblCellMar>
-            <w:top w:w="0" w:type="dxa"/>
-            <w:bottom w:w="0" w:type="dxa"/>
-          </w:tblCellMar>
-        </w:tblPrEx>
         <w:trPr>
           <w:tblHeader/>
         </w:trPr>
@@ -14324,12 +13424,6 @@
         </w:tc>
       </w:tr>
       <w:tr>
-        <w:tblPrEx>
-          <w:tblCellMar>
-            <w:top w:w="0" w:type="dxa"/>
-            <w:bottom w:w="0" w:type="dxa"/>
-          </w:tblCellMar>
-        </w:tblPrEx>
         <w:trPr>
           <w:cantSplit/>
         </w:trPr>
@@ -14393,12 +13487,6 @@
         </w:tc>
       </w:tr>
       <w:tr>
-        <w:tblPrEx>
-          <w:tblCellMar>
-            <w:top w:w="0" w:type="dxa"/>
-            <w:bottom w:w="0" w:type="dxa"/>
-          </w:tblCellMar>
-        </w:tblPrEx>
         <w:trPr>
           <w:cantSplit/>
         </w:trPr>
@@ -14464,12 +13552,6 @@
         </w:tc>
       </w:tr>
       <w:tr>
-        <w:tblPrEx>
-          <w:tblCellMar>
-            <w:top w:w="0" w:type="dxa"/>
-            <w:bottom w:w="0" w:type="dxa"/>
-          </w:tblCellMar>
-        </w:tblPrEx>
         <w:trPr>
           <w:cantSplit/>
         </w:trPr>
@@ -14533,12 +13615,6 @@
         </w:tc>
       </w:tr>
       <w:tr>
-        <w:tblPrEx>
-          <w:tblCellMar>
-            <w:top w:w="0" w:type="dxa"/>
-            <w:bottom w:w="0" w:type="dxa"/>
-          </w:tblCellMar>
-        </w:tblPrEx>
         <w:trPr>
           <w:cantSplit/>
         </w:trPr>
@@ -14604,12 +13680,6 @@
         </w:tc>
       </w:tr>
       <w:tr>
-        <w:tblPrEx>
-          <w:tblCellMar>
-            <w:top w:w="0" w:type="dxa"/>
-            <w:bottom w:w="0" w:type="dxa"/>
-          </w:tblCellMar>
-        </w:tblPrEx>
         <w:trPr>
           <w:cantSplit/>
         </w:trPr>
@@ -14673,12 +13743,6 @@
         </w:tc>
       </w:tr>
       <w:tr>
-        <w:tblPrEx>
-          <w:tblCellMar>
-            <w:top w:w="0" w:type="dxa"/>
-            <w:bottom w:w="0" w:type="dxa"/>
-          </w:tblCellMar>
-        </w:tblPrEx>
         <w:trPr>
           <w:cantSplit/>
         </w:trPr>
@@ -14744,12 +13808,6 @@
         </w:tc>
       </w:tr>
       <w:tr>
-        <w:tblPrEx>
-          <w:tblCellMar>
-            <w:top w:w="0" w:type="dxa"/>
-            <w:bottom w:w="0" w:type="dxa"/>
-          </w:tblCellMar>
-        </w:tblPrEx>
         <w:trPr>
           <w:cantSplit/>
         </w:trPr>
@@ -14813,12 +13871,6 @@
         </w:tc>
       </w:tr>
       <w:tr>
-        <w:tblPrEx>
-          <w:tblCellMar>
-            <w:top w:w="0" w:type="dxa"/>
-            <w:bottom w:w="0" w:type="dxa"/>
-          </w:tblCellMar>
-        </w:tblPrEx>
         <w:trPr>
           <w:cantSplit/>
         </w:trPr>
@@ -14884,12 +13936,6 @@
         </w:tc>
       </w:tr>
       <w:tr>
-        <w:tblPrEx>
-          <w:tblCellMar>
-            <w:top w:w="0" w:type="dxa"/>
-            <w:bottom w:w="0" w:type="dxa"/>
-          </w:tblCellMar>
-        </w:tblPrEx>
         <w:trPr>
           <w:cantSplit/>
         </w:trPr>
@@ -14953,12 +13999,6 @@
         </w:tc>
       </w:tr>
       <w:tr>
-        <w:tblPrEx>
-          <w:tblCellMar>
-            <w:top w:w="0" w:type="dxa"/>
-            <w:bottom w:w="0" w:type="dxa"/>
-          </w:tblCellMar>
-        </w:tblPrEx>
         <w:trPr>
           <w:cantSplit/>
         </w:trPr>
@@ -15024,12 +14064,6 @@
         </w:tc>
       </w:tr>
       <w:tr>
-        <w:tblPrEx>
-          <w:tblCellMar>
-            <w:top w:w="0" w:type="dxa"/>
-            <w:bottom w:w="0" w:type="dxa"/>
-          </w:tblCellMar>
-        </w:tblPrEx>
         <w:trPr>
           <w:cantSplit/>
         </w:trPr>
@@ -15093,12 +14127,6 @@
         </w:tc>
       </w:tr>
       <w:tr>
-        <w:tblPrEx>
-          <w:tblCellMar>
-            <w:top w:w="0" w:type="dxa"/>
-            <w:bottom w:w="0" w:type="dxa"/>
-          </w:tblCellMar>
-        </w:tblPrEx>
         <w:trPr>
           <w:cantSplit/>
         </w:trPr>
@@ -15164,12 +14192,6 @@
         </w:tc>
       </w:tr>
       <w:tr>
-        <w:tblPrEx>
-          <w:tblCellMar>
-            <w:top w:w="0" w:type="dxa"/>
-            <w:bottom w:w="0" w:type="dxa"/>
-          </w:tblCellMar>
-        </w:tblPrEx>
         <w:trPr>
           <w:cantSplit/>
         </w:trPr>
@@ -15233,12 +14255,6 @@
         </w:tc>
       </w:tr>
       <w:tr>
-        <w:tblPrEx>
-          <w:tblCellMar>
-            <w:top w:w="0" w:type="dxa"/>
-            <w:bottom w:w="0" w:type="dxa"/>
-          </w:tblCellMar>
-        </w:tblPrEx>
         <w:trPr>
           <w:cantSplit/>
         </w:trPr>
@@ -15304,12 +14320,6 @@
         </w:tc>
       </w:tr>
       <w:tr>
-        <w:tblPrEx>
-          <w:tblCellMar>
-            <w:top w:w="0" w:type="dxa"/>
-            <w:bottom w:w="0" w:type="dxa"/>
-          </w:tblCellMar>
-        </w:tblPrEx>
         <w:trPr>
           <w:cantSplit/>
         </w:trPr>
@@ -15396,16 +14406,10 @@
       <w:pPr>
         <w:pStyle w:val="Heading1"/>
       </w:pPr>
-      <w:bookmarkStart w:id="27" w:name="_Toc243047578"/>
+      <w:bookmarkStart w:id="27" w:name="_Toc244093410"/>
       <w:r>
         <w:lastRenderedPageBreak/>
-        <w:t>10</w:t>
-      </w:r>
-      <w:r>
-        <w:t xml:space="preserve">. </w:t>
-      </w:r>
-      <w:r>
-        <w:t>References</w:t>
+        <w:t>10. References</w:t>
       </w:r>
       <w:bookmarkEnd w:id="27"/>
     </w:p>
@@ -16720,6 +15724,155 @@
     </w:lvl>
   </w:abstractNum>
   <w:abstractNum w:abstractNumId="18" w15:restartNumberingAfterBreak="0">
+    <w:nsid w:val="77E25B7F"/>
+    <w:multiLevelType w:val="multilevel"/>
+    <w:tmpl w:val="B4944164"/>
+    <w:lvl w:ilvl="0">
+      <w:start w:val="1"/>
+      <w:numFmt w:val="bullet"/>
+      <w:lvlText w:val=""/>
+      <w:lvlJc w:val="left"/>
+      <w:pPr>
+        <w:tabs>
+          <w:tab w:val="num" w:pos="720"/>
+        </w:tabs>
+        <w:ind w:left="720" w:hanging="360"/>
+      </w:pPr>
+      <w:rPr>
+        <w:rFonts w:ascii="Symbol" w:hAnsi="Symbol" w:hint="default"/>
+        <w:sz w:val="20"/>
+      </w:rPr>
+    </w:lvl>
+    <w:lvl w:ilvl="1" w:tentative="1">
+      <w:start w:val="1"/>
+      <w:numFmt w:val="bullet"/>
+      <w:lvlText w:val="o"/>
+      <w:lvlJc w:val="left"/>
+      <w:pPr>
+        <w:tabs>
+          <w:tab w:val="num" w:pos="1440"/>
+        </w:tabs>
+        <w:ind w:left="1440" w:hanging="360"/>
+      </w:pPr>
+      <w:rPr>
+        <w:rFonts w:ascii="Courier New" w:hAnsi="Courier New" w:hint="default"/>
+        <w:sz w:val="20"/>
+      </w:rPr>
+    </w:lvl>
+    <w:lvl w:ilvl="2" w:tentative="1">
+      <w:start w:val="1"/>
+      <w:numFmt w:val="bullet"/>
+      <w:lvlText w:val=""/>
+      <w:lvlJc w:val="left"/>
+      <w:pPr>
+        <w:tabs>
+          <w:tab w:val="num" w:pos="2160"/>
+        </w:tabs>
+        <w:ind w:left="2160" w:hanging="360"/>
+      </w:pPr>
+      <w:rPr>
+        <w:rFonts w:ascii="Wingdings" w:hAnsi="Wingdings" w:hint="default"/>
+        <w:sz w:val="20"/>
+      </w:rPr>
+    </w:lvl>
+    <w:lvl w:ilvl="3" w:tentative="1">
+      <w:start w:val="1"/>
+      <w:numFmt w:val="bullet"/>
+      <w:lvlText w:val=""/>
+      <w:lvlJc w:val="left"/>
+      <w:pPr>
+        <w:tabs>
+          <w:tab w:val="num" w:pos="2880"/>
+        </w:tabs>
+        <w:ind w:left="2880" w:hanging="360"/>
+      </w:pPr>
+      <w:rPr>
+        <w:rFonts w:ascii="Wingdings" w:hAnsi="Wingdings" w:hint="default"/>
+        <w:sz w:val="20"/>
+      </w:rPr>
+    </w:lvl>
+    <w:lvl w:ilvl="4" w:tentative="1">
+      <w:start w:val="1"/>
+      <w:numFmt w:val="bullet"/>
+      <w:lvlText w:val=""/>
+      <w:lvlJc w:val="left"/>
+      <w:pPr>
+        <w:tabs>
+          <w:tab w:val="num" w:pos="3600"/>
+        </w:tabs>
+        <w:ind w:left="3600" w:hanging="360"/>
+      </w:pPr>
+      <w:rPr>
+        <w:rFonts w:ascii="Wingdings" w:hAnsi="Wingdings" w:hint="default"/>
+        <w:sz w:val="20"/>
+      </w:rPr>
+    </w:lvl>
+    <w:lvl w:ilvl="5" w:tentative="1">
+      <w:start w:val="1"/>
+      <w:numFmt w:val="bullet"/>
+      <w:lvlText w:val=""/>
+      <w:lvlJc w:val="left"/>
+      <w:pPr>
+        <w:tabs>
+          <w:tab w:val="num" w:pos="4320"/>
+        </w:tabs>
+        <w:ind w:left="4320" w:hanging="360"/>
+      </w:pPr>
+      <w:rPr>
+        <w:rFonts w:ascii="Wingdings" w:hAnsi="Wingdings" w:hint="default"/>
+        <w:sz w:val="20"/>
+      </w:rPr>
+    </w:lvl>
+    <w:lvl w:ilvl="6" w:tentative="1">
+      <w:start w:val="1"/>
+      <w:numFmt w:val="bullet"/>
+      <w:lvlText w:val=""/>
+      <w:lvlJc w:val="left"/>
+      <w:pPr>
+        <w:tabs>
+          <w:tab w:val="num" w:pos="5040"/>
+        </w:tabs>
+        <w:ind w:left="5040" w:hanging="360"/>
+      </w:pPr>
+      <w:rPr>
+        <w:rFonts w:ascii="Wingdings" w:hAnsi="Wingdings" w:hint="default"/>
+        <w:sz w:val="20"/>
+      </w:rPr>
+    </w:lvl>
+    <w:lvl w:ilvl="7" w:tentative="1">
+      <w:start w:val="1"/>
+      <w:numFmt w:val="bullet"/>
+      <w:lvlText w:val=""/>
+      <w:lvlJc w:val="left"/>
+      <w:pPr>
+        <w:tabs>
+          <w:tab w:val="num" w:pos="5760"/>
+        </w:tabs>
+        <w:ind w:left="5760" w:hanging="360"/>
+      </w:pPr>
+      <w:rPr>
+        <w:rFonts w:ascii="Wingdings" w:hAnsi="Wingdings" w:hint="default"/>
+        <w:sz w:val="20"/>
+      </w:rPr>
+    </w:lvl>
+    <w:lvl w:ilvl="8" w:tentative="1">
+      <w:start w:val="1"/>
+      <w:numFmt w:val="bullet"/>
+      <w:lvlText w:val=""/>
+      <w:lvlJc w:val="left"/>
+      <w:pPr>
+        <w:tabs>
+          <w:tab w:val="num" w:pos="6480"/>
+        </w:tabs>
+        <w:ind w:left="6480" w:hanging="360"/>
+      </w:pPr>
+      <w:rPr>
+        <w:rFonts w:ascii="Wingdings" w:hAnsi="Wingdings" w:hint="default"/>
+        <w:sz w:val="20"/>
+      </w:rPr>
+    </w:lvl>
+  </w:abstractNum>
+  <w:abstractNum w:abstractNumId="19" w15:restartNumberingAfterBreak="0">
     <w:nsid w:val="79D526B7"/>
     <w:multiLevelType w:val="hybridMultilevel"/>
     <w:tmpl w:val="CBC6272A"/>
@@ -16804,7 +15957,7 @@
     </w:lvlOverride>
   </w:num>
   <w:num w:numId="6" w16cid:durableId="44567721">
-    <w:abstractNumId w:val="18"/>
+    <w:abstractNumId w:val="19"/>
     <w:lvlOverride w:ilvl="0">
       <w:startOverride w:val="1"/>
     </w:lvlOverride>
@@ -16877,6 +16030,9 @@
   </w:num>
   <w:num w:numId="22" w16cid:durableId="2054887457">
     <w:abstractNumId w:val="5"/>
+  </w:num>
+  <w:num w:numId="23" w16cid:durableId="1940288997">
+    <w:abstractNumId w:val="18"/>
   </w:num>
 </w:numbering>
 </file>
@@ -17381,7 +16537,6 @@
   <w:style w:type="character" w:default="1" w:styleId="DefaultParagraphFont">
     <w:name w:val="Default Paragraph Font"/>
     <w:uiPriority w:val="1"/>
-    <w:semiHidden/>
     <w:unhideWhenUsed/>
   </w:style>
   <w:style w:type="table" w:default="1" w:styleId="TableNormal">

</xml_diff>

<commit_message>
Complete draft for submission to ICCAT
</commit_message>
<xml_diff>
--- a/BycatchEstimator_App_User_Guide.docx
+++ b/BycatchEstimator_App_User_Guide.docx
@@ -12,6 +12,7 @@
         <w:spacing w:after="160"/>
         <w:jc w:val="center"/>
       </w:pPr>
+      <w:proofErr w:type="spellStart"/>
       <w:r>
         <w:rPr>
           <w:b/>
@@ -20,7 +21,18 @@
           <w:sz w:val="60"/>
           <w:szCs w:val="60"/>
         </w:rPr>
-        <w:t>BycatchEstimator App</w:t>
+        <w:t>BycatchEstimator</w:t>
+      </w:r>
+      <w:proofErr w:type="spellEnd"/>
+      <w:r>
+        <w:rPr>
+          <w:b/>
+          <w:bCs/>
+          <w:color w:val="1F3864"/>
+          <w:sz w:val="60"/>
+          <w:szCs w:val="60"/>
+        </w:rPr>
+        <w:t xml:space="preserve"> App</w:t>
       </w:r>
     </w:p>
     <w:p>
@@ -57,7 +69,29 @@
           <w:sz w:val="26"/>
           <w:szCs w:val="26"/>
         </w:rPr>
-        <w:t>A point-and-click interface to the BycatchEstimator R package</w:t>
+        <w:t xml:space="preserve">A point-and-click interface to the </w:t>
+      </w:r>
+      <w:proofErr w:type="spellStart"/>
+      <w:r>
+        <w:rPr>
+          <w:i/>
+          <w:iCs/>
+          <w:color w:val="595959"/>
+          <w:sz w:val="26"/>
+          <w:szCs w:val="26"/>
+        </w:rPr>
+        <w:t>BycatchEstimator</w:t>
+      </w:r>
+      <w:proofErr w:type="spellEnd"/>
+      <w:r>
+        <w:rPr>
+          <w:i/>
+          <w:iCs/>
+          <w:color w:val="595959"/>
+          <w:sz w:val="26"/>
+          <w:szCs w:val="26"/>
+        </w:rPr>
+        <w:t xml:space="preserve"> R package</w:t>
       </w:r>
     </w:p>
     <w:p>
@@ -201,7 +235,7 @@
           <w:r>
             <w:fldChar w:fldCharType="separate"/>
           </w:r>
-          <w:hyperlink w:anchor="_Toc244093384" w:history="1">
+          <w:hyperlink w:anchor="_Toc244181913" w:history="1">
             <w:r>
               <w:rPr>
                 <w:rStyle w:val="Hyperlink"/>
@@ -225,7 +259,7 @@
               <w:rPr>
                 <w:noProof/>
               </w:rPr>
-              <w:instrText xml:space="preserve"> PAGEREF _Toc244093384 \h </w:instrText>
+              <w:instrText xml:space="preserve"> PAGEREF _Toc244181913 \h </w:instrText>
             </w:r>
             <w:r>
               <w:rPr>
@@ -267,7 +301,7 @@
               <w14:ligatures w14:val="standardContextual"/>
             </w:rPr>
           </w:pPr>
-          <w:hyperlink w:anchor="_Toc244093385" w:history="1">
+          <w:hyperlink w:anchor="_Toc244181914" w:history="1">
             <w:r>
               <w:rPr>
                 <w:rStyle w:val="Hyperlink"/>
@@ -291,7 +325,7 @@
               <w:rPr>
                 <w:noProof/>
               </w:rPr>
-              <w:instrText xml:space="preserve"> PAGEREF _Toc244093385 \h </w:instrText>
+              <w:instrText xml:space="preserve"> PAGEREF _Toc244181914 \h </w:instrText>
             </w:r>
             <w:r>
               <w:rPr>
@@ -333,7 +367,7 @@
               <w14:ligatures w14:val="standardContextual"/>
             </w:rPr>
           </w:pPr>
-          <w:hyperlink w:anchor="_Toc244093386" w:history="1">
+          <w:hyperlink w:anchor="_Toc244181915" w:history="1">
             <w:r>
               <w:rPr>
                 <w:rStyle w:val="Hyperlink"/>
@@ -357,7 +391,7 @@
               <w:rPr>
                 <w:noProof/>
               </w:rPr>
-              <w:instrText xml:space="preserve"> PAGEREF _Toc244093386 \h </w:instrText>
+              <w:instrText xml:space="preserve"> PAGEREF _Toc244181915 \h </w:instrText>
             </w:r>
             <w:r>
               <w:rPr>
@@ -399,7 +433,7 @@
               <w14:ligatures w14:val="standardContextual"/>
             </w:rPr>
           </w:pPr>
-          <w:hyperlink w:anchor="_Toc244093387" w:history="1">
+          <w:hyperlink w:anchor="_Toc244181916" w:history="1">
             <w:r>
               <w:rPr>
                 <w:rStyle w:val="Hyperlink"/>
@@ -423,7 +457,7 @@
               <w:rPr>
                 <w:noProof/>
               </w:rPr>
-              <w:instrText xml:space="preserve"> PAGEREF _Toc244093387 \h </w:instrText>
+              <w:instrText xml:space="preserve"> PAGEREF _Toc244181916 \h </w:instrText>
             </w:r>
             <w:r>
               <w:rPr>
@@ -465,7 +499,7 @@
               <w14:ligatures w14:val="standardContextual"/>
             </w:rPr>
           </w:pPr>
-          <w:hyperlink w:anchor="_Toc244093388" w:history="1">
+          <w:hyperlink w:anchor="_Toc244181917" w:history="1">
             <w:r>
               <w:rPr>
                 <w:rStyle w:val="Hyperlink"/>
@@ -489,7 +523,7 @@
               <w:rPr>
                 <w:noProof/>
               </w:rPr>
-              <w:instrText xml:space="preserve"> PAGEREF _Toc244093388 \h </w:instrText>
+              <w:instrText xml:space="preserve"> PAGEREF _Toc244181917 \h </w:instrText>
             </w:r>
             <w:r>
               <w:rPr>
@@ -531,7 +565,7 @@
               <w14:ligatures w14:val="standardContextual"/>
             </w:rPr>
           </w:pPr>
-          <w:hyperlink w:anchor="_Toc244093389" w:history="1">
+          <w:hyperlink w:anchor="_Toc244181918" w:history="1">
             <w:r>
               <w:rPr>
                 <w:rStyle w:val="Hyperlink"/>
@@ -555,7 +589,7 @@
               <w:rPr>
                 <w:noProof/>
               </w:rPr>
-              <w:instrText xml:space="preserve"> PAGEREF _Toc244093389 \h </w:instrText>
+              <w:instrText xml:space="preserve"> PAGEREF _Toc244181918 \h </w:instrText>
             </w:r>
             <w:r>
               <w:rPr>
@@ -597,7 +631,7 @@
               <w14:ligatures w14:val="standardContextual"/>
             </w:rPr>
           </w:pPr>
-          <w:hyperlink w:anchor="_Toc244093390" w:history="1">
+          <w:hyperlink w:anchor="_Toc244181919" w:history="1">
             <w:r>
               <w:rPr>
                 <w:rStyle w:val="Hyperlink"/>
@@ -621,7 +655,7 @@
               <w:rPr>
                 <w:noProof/>
               </w:rPr>
-              <w:instrText xml:space="preserve"> PAGEREF _Toc244093390 \h </w:instrText>
+              <w:instrText xml:space="preserve"> PAGEREF _Toc244181919 \h </w:instrText>
             </w:r>
             <w:r>
               <w:rPr>
@@ -663,7 +697,7 @@
               <w14:ligatures w14:val="standardContextual"/>
             </w:rPr>
           </w:pPr>
-          <w:hyperlink w:anchor="_Toc244093391" w:history="1">
+          <w:hyperlink w:anchor="_Toc244181920" w:history="1">
             <w:r>
               <w:rPr>
                 <w:rStyle w:val="Hyperlink"/>
@@ -687,7 +721,7 @@
               <w:rPr>
                 <w:noProof/>
               </w:rPr>
-              <w:instrText xml:space="preserve"> PAGEREF _Toc244093391 \h </w:instrText>
+              <w:instrText xml:space="preserve"> PAGEREF _Toc244181920 \h </w:instrText>
             </w:r>
             <w:r>
               <w:rPr>
@@ -729,7 +763,7 @@
               <w14:ligatures w14:val="standardContextual"/>
             </w:rPr>
           </w:pPr>
-          <w:hyperlink w:anchor="_Toc244093392" w:history="1">
+          <w:hyperlink w:anchor="_Toc244181921" w:history="1">
             <w:r>
               <w:rPr>
                 <w:rStyle w:val="Hyperlink"/>
@@ -753,7 +787,7 @@
               <w:rPr>
                 <w:noProof/>
               </w:rPr>
-              <w:instrText xml:space="preserve"> PAGEREF _Toc244093392 \h </w:instrText>
+              <w:instrText xml:space="preserve"> PAGEREF _Toc244181921 \h </w:instrText>
             </w:r>
             <w:r>
               <w:rPr>
@@ -795,7 +829,7 @@
               <w14:ligatures w14:val="standardContextual"/>
             </w:rPr>
           </w:pPr>
-          <w:hyperlink w:anchor="_Toc244093393" w:history="1">
+          <w:hyperlink w:anchor="_Toc244181922" w:history="1">
             <w:r>
               <w:rPr>
                 <w:rStyle w:val="Hyperlink"/>
@@ -819,7 +853,7 @@
               <w:rPr>
                 <w:noProof/>
               </w:rPr>
-              <w:instrText xml:space="preserve"> PAGEREF _Toc244093393 \h </w:instrText>
+              <w:instrText xml:space="preserve"> PAGEREF _Toc244181922 \h </w:instrText>
             </w:r>
             <w:r>
               <w:rPr>
@@ -861,13 +895,13 @@
               <w14:ligatures w14:val="standardContextual"/>
             </w:rPr>
           </w:pPr>
-          <w:hyperlink w:anchor="_Toc244093394" w:history="1">
+          <w:hyperlink w:anchor="_Toc244181923" w:history="1">
             <w:r>
               <w:rPr>
                 <w:rStyle w:val="Hyperlink"/>
                 <w:noProof/>
               </w:rPr>
-              <w:t>2.3 Reserved column names</w:t>
+              <w:t>2.3 Protected column names</w:t>
             </w:r>
             <w:r>
               <w:rPr>
@@ -885,7 +919,7 @@
               <w:rPr>
                 <w:noProof/>
               </w:rPr>
-              <w:instrText xml:space="preserve"> PAGEREF _Toc244093394 \h </w:instrText>
+              <w:instrText xml:space="preserve"> PAGEREF _Toc244181923 \h </w:instrText>
             </w:r>
             <w:r>
               <w:rPr>
@@ -927,7 +961,7 @@
               <w14:ligatures w14:val="standardContextual"/>
             </w:rPr>
           </w:pPr>
-          <w:hyperlink w:anchor="_Toc244093395" w:history="1">
+          <w:hyperlink w:anchor="_Toc244181924" w:history="1">
             <w:r>
               <w:rPr>
                 <w:rStyle w:val="Hyperlink"/>
@@ -951,7 +985,7 @@
               <w:rPr>
                 <w:noProof/>
               </w:rPr>
-              <w:instrText xml:space="preserve"> PAGEREF _Toc244093395 \h </w:instrText>
+              <w:instrText xml:space="preserve"> PAGEREF _Toc244181924 \h </w:instrText>
             </w:r>
             <w:r>
               <w:rPr>
@@ -993,7 +1027,7 @@
               <w14:ligatures w14:val="standardContextual"/>
             </w:rPr>
           </w:pPr>
-          <w:hyperlink w:anchor="_Toc244093396" w:history="1">
+          <w:hyperlink w:anchor="_Toc244181925" w:history="1">
             <w:r>
               <w:rPr>
                 <w:rStyle w:val="Hyperlink"/>
@@ -1017,7 +1051,7 @@
               <w:rPr>
                 <w:noProof/>
               </w:rPr>
-              <w:instrText xml:space="preserve"> PAGEREF _Toc244093396 \h </w:instrText>
+              <w:instrText xml:space="preserve"> PAGEREF _Toc244181925 \h </w:instrText>
             </w:r>
             <w:r>
               <w:rPr>
@@ -1034,7 +1068,7 @@
               <w:rPr>
                 <w:noProof/>
               </w:rPr>
-              <w:t>11</w:t>
+              <w:t>12</w:t>
             </w:r>
             <w:r>
               <w:rPr>
@@ -1059,7 +1093,7 @@
               <w14:ligatures w14:val="standardContextual"/>
             </w:rPr>
           </w:pPr>
-          <w:hyperlink w:anchor="_Toc244093397" w:history="1">
+          <w:hyperlink w:anchor="_Toc244181926" w:history="1">
             <w:r>
               <w:rPr>
                 <w:rStyle w:val="Hyperlink"/>
@@ -1083,7 +1117,7 @@
               <w:rPr>
                 <w:noProof/>
               </w:rPr>
-              <w:instrText xml:space="preserve"> PAGEREF _Toc244093397 \h </w:instrText>
+              <w:instrText xml:space="preserve"> PAGEREF _Toc244181926 \h </w:instrText>
             </w:r>
             <w:r>
               <w:rPr>
@@ -1100,7 +1134,7 @@
               <w:rPr>
                 <w:noProof/>
               </w:rPr>
-              <w:t>11</w:t>
+              <w:t>12</w:t>
             </w:r>
             <w:r>
               <w:rPr>
@@ -1125,7 +1159,7 @@
               <w14:ligatures w14:val="standardContextual"/>
             </w:rPr>
           </w:pPr>
-          <w:hyperlink w:anchor="_Toc244093398" w:history="1">
+          <w:hyperlink w:anchor="_Toc244181927" w:history="1">
             <w:r>
               <w:rPr>
                 <w:rStyle w:val="Hyperlink"/>
@@ -1149,7 +1183,7 @@
               <w:rPr>
                 <w:noProof/>
               </w:rPr>
-              <w:instrText xml:space="preserve"> PAGEREF _Toc244093398 \h </w:instrText>
+              <w:instrText xml:space="preserve"> PAGEREF _Toc244181927 \h </w:instrText>
             </w:r>
             <w:r>
               <w:rPr>
@@ -1166,7 +1200,7 @@
               <w:rPr>
                 <w:noProof/>
               </w:rPr>
-              <w:t>12</w:t>
+              <w:t>14</w:t>
             </w:r>
             <w:r>
               <w:rPr>
@@ -1191,7 +1225,7 @@
               <w14:ligatures w14:val="standardContextual"/>
             </w:rPr>
           </w:pPr>
-          <w:hyperlink w:anchor="_Toc244093399" w:history="1">
+          <w:hyperlink w:anchor="_Toc244181928" w:history="1">
             <w:r>
               <w:rPr>
                 <w:rStyle w:val="Hyperlink"/>
@@ -1215,7 +1249,7 @@
               <w:rPr>
                 <w:noProof/>
               </w:rPr>
-              <w:instrText xml:space="preserve"> PAGEREF _Toc244093399 \h </w:instrText>
+              <w:instrText xml:space="preserve"> PAGEREF _Toc244181928 \h </w:instrText>
             </w:r>
             <w:r>
               <w:rPr>
@@ -1232,7 +1266,7 @@
               <w:rPr>
                 <w:noProof/>
               </w:rPr>
-              <w:t>13</w:t>
+              <w:t>15</w:t>
             </w:r>
             <w:r>
               <w:rPr>
@@ -1257,7 +1291,7 @@
               <w14:ligatures w14:val="standardContextual"/>
             </w:rPr>
           </w:pPr>
-          <w:hyperlink w:anchor="_Toc244093400" w:history="1">
+          <w:hyperlink w:anchor="_Toc244181929" w:history="1">
             <w:r>
               <w:rPr>
                 <w:rStyle w:val="Hyperlink"/>
@@ -1281,7 +1315,7 @@
               <w:rPr>
                 <w:noProof/>
               </w:rPr>
-              <w:instrText xml:space="preserve"> PAGEREF _Toc244093400 \h </w:instrText>
+              <w:instrText xml:space="preserve"> PAGEREF _Toc244181929 \h </w:instrText>
             </w:r>
             <w:r>
               <w:rPr>
@@ -1298,7 +1332,7 @@
               <w:rPr>
                 <w:noProof/>
               </w:rPr>
-              <w:t>19</w:t>
+              <w:t>21</w:t>
             </w:r>
             <w:r>
               <w:rPr>
@@ -1324,7 +1358,7 @@
               <w14:ligatures w14:val="standardContextual"/>
             </w:rPr>
           </w:pPr>
-          <w:hyperlink w:anchor="_Toc244093401" w:history="1">
+          <w:hyperlink w:anchor="_Toc244181930" w:history="1">
             <w:r>
               <w:rPr>
                 <w:rStyle w:val="Hyperlink"/>
@@ -1366,7 +1400,7 @@
               <w:rPr>
                 <w:noProof/>
               </w:rPr>
-              <w:instrText xml:space="preserve"> PAGEREF _Toc244093401 \h </w:instrText>
+              <w:instrText xml:space="preserve"> PAGEREF _Toc244181930 \h </w:instrText>
             </w:r>
             <w:r>
               <w:rPr>
@@ -1383,7 +1417,7 @@
               <w:rPr>
                 <w:noProof/>
               </w:rPr>
-              <w:t>19</w:t>
+              <w:t>21</w:t>
             </w:r>
             <w:r>
               <w:rPr>
@@ -1408,7 +1442,7 @@
               <w14:ligatures w14:val="standardContextual"/>
             </w:rPr>
           </w:pPr>
-          <w:hyperlink w:anchor="_Toc244093402" w:history="1">
+          <w:hyperlink w:anchor="_Toc244181931" w:history="1">
             <w:r>
               <w:rPr>
                 <w:rStyle w:val="Hyperlink"/>
@@ -1432,7 +1466,7 @@
               <w:rPr>
                 <w:noProof/>
               </w:rPr>
-              <w:instrText xml:space="preserve"> PAGEREF _Toc244093402 \h </w:instrText>
+              <w:instrText xml:space="preserve"> PAGEREF _Toc244181931 \h </w:instrText>
             </w:r>
             <w:r>
               <w:rPr>
@@ -1449,7 +1483,7 @@
               <w:rPr>
                 <w:noProof/>
               </w:rPr>
-              <w:t>20</w:t>
+              <w:t>22</w:t>
             </w:r>
             <w:r>
               <w:rPr>
@@ -1474,7 +1508,7 @@
               <w14:ligatures w14:val="standardContextual"/>
             </w:rPr>
           </w:pPr>
-          <w:hyperlink w:anchor="_Toc244093403" w:history="1">
+          <w:hyperlink w:anchor="_Toc244181932" w:history="1">
             <w:r>
               <w:rPr>
                 <w:rStyle w:val="Hyperlink"/>
@@ -1498,7 +1532,7 @@
               <w:rPr>
                 <w:noProof/>
               </w:rPr>
-              <w:instrText xml:space="preserve"> PAGEREF _Toc244093403 \h </w:instrText>
+              <w:instrText xml:space="preserve"> PAGEREF _Toc244181932 \h </w:instrText>
             </w:r>
             <w:r>
               <w:rPr>
@@ -1515,13 +1549,7 @@
               <w:rPr>
                 <w:noProof/>
               </w:rPr>
-              <w:t>2</w:t>
-            </w:r>
-            <w:r>
-              <w:rPr>
-                <w:noProof/>
-              </w:rPr>
-              <w:t>0</w:t>
+              <w:t>22</w:t>
             </w:r>
             <w:r>
               <w:rPr>
@@ -1546,7 +1574,7 @@
               <w14:ligatures w14:val="standardContextual"/>
             </w:rPr>
           </w:pPr>
-          <w:hyperlink w:anchor="_Toc244093404" w:history="1">
+          <w:hyperlink w:anchor="_Toc244181933" w:history="1">
             <w:r>
               <w:rPr>
                 <w:rStyle w:val="Hyperlink"/>
@@ -1570,7 +1598,7 @@
               <w:rPr>
                 <w:noProof/>
               </w:rPr>
-              <w:instrText xml:space="preserve"> PAGEREF _Toc244093404 \h </w:instrText>
+              <w:instrText xml:space="preserve"> PAGEREF _Toc244181933 \h </w:instrText>
             </w:r>
             <w:r>
               <w:rPr>
@@ -1587,7 +1615,7 @@
               <w:rPr>
                 <w:noProof/>
               </w:rPr>
-              <w:t>21</w:t>
+              <w:t>23</w:t>
             </w:r>
             <w:r>
               <w:rPr>
@@ -1612,7 +1640,7 @@
               <w14:ligatures w14:val="standardContextual"/>
             </w:rPr>
           </w:pPr>
-          <w:hyperlink w:anchor="_Toc244093405" w:history="1">
+          <w:hyperlink w:anchor="_Toc244181934" w:history="1">
             <w:r>
               <w:rPr>
                 <w:rStyle w:val="Hyperlink"/>
@@ -1636,7 +1664,7 @@
               <w:rPr>
                 <w:noProof/>
               </w:rPr>
-              <w:instrText xml:space="preserve"> PAGEREF _Toc244093405 \h </w:instrText>
+              <w:instrText xml:space="preserve"> PAGEREF _Toc244181934 \h </w:instrText>
             </w:r>
             <w:r>
               <w:rPr>
@@ -1653,7 +1681,7 @@
               <w:rPr>
                 <w:noProof/>
               </w:rPr>
-              <w:t>21</w:t>
+              <w:t>23</w:t>
             </w:r>
             <w:r>
               <w:rPr>
@@ -1678,7 +1706,7 @@
               <w14:ligatures w14:val="standardContextual"/>
             </w:rPr>
           </w:pPr>
-          <w:hyperlink w:anchor="_Toc244093406" w:history="1">
+          <w:hyperlink w:anchor="_Toc244181935" w:history="1">
             <w:r>
               <w:rPr>
                 <w:rStyle w:val="Hyperlink"/>
@@ -1702,7 +1730,7 @@
               <w:rPr>
                 <w:noProof/>
               </w:rPr>
-              <w:instrText xml:space="preserve"> PAGEREF _Toc244093406 \h </w:instrText>
+              <w:instrText xml:space="preserve"> PAGEREF _Toc244181935 \h </w:instrText>
             </w:r>
             <w:r>
               <w:rPr>
@@ -1719,7 +1747,7 @@
               <w:rPr>
                 <w:noProof/>
               </w:rPr>
-              <w:t>22</w:t>
+              <w:t>24</w:t>
             </w:r>
             <w:r>
               <w:rPr>
@@ -1744,7 +1772,7 @@
               <w14:ligatures w14:val="standardContextual"/>
             </w:rPr>
           </w:pPr>
-          <w:hyperlink w:anchor="_Toc244093407" w:history="1">
+          <w:hyperlink w:anchor="_Toc244181936" w:history="1">
             <w:r>
               <w:rPr>
                 <w:rStyle w:val="Hyperlink"/>
@@ -1768,7 +1796,7 @@
               <w:rPr>
                 <w:noProof/>
               </w:rPr>
-              <w:instrText xml:space="preserve"> PAGEREF _Toc244093407 \h </w:instrText>
+              <w:instrText xml:space="preserve"> PAGEREF _Toc244181936 \h </w:instrText>
             </w:r>
             <w:r>
               <w:rPr>
@@ -1785,7 +1813,7 @@
               <w:rPr>
                 <w:noProof/>
               </w:rPr>
-              <w:t>23</w:t>
+              <w:t>25</w:t>
             </w:r>
             <w:r>
               <w:rPr>
@@ -1810,7 +1838,7 @@
               <w14:ligatures w14:val="standardContextual"/>
             </w:rPr>
           </w:pPr>
-          <w:hyperlink w:anchor="_Toc244093408" w:history="1">
+          <w:hyperlink w:anchor="_Toc244181937" w:history="1">
             <w:r>
               <w:rPr>
                 <w:rStyle w:val="Hyperlink"/>
@@ -1834,7 +1862,7 @@
               <w:rPr>
                 <w:noProof/>
               </w:rPr>
-              <w:instrText xml:space="preserve"> PAGEREF _Toc244093408 \h </w:instrText>
+              <w:instrText xml:space="preserve"> PAGEREF _Toc244181937 \h </w:instrText>
             </w:r>
             <w:r>
               <w:rPr>
@@ -1851,7 +1879,7 @@
               <w:rPr>
                 <w:noProof/>
               </w:rPr>
-              <w:t>24</w:t>
+              <w:t>26</w:t>
             </w:r>
             <w:r>
               <w:rPr>
@@ -1876,7 +1904,7 @@
               <w14:ligatures w14:val="standardContextual"/>
             </w:rPr>
           </w:pPr>
-          <w:hyperlink w:anchor="_Toc244093409" w:history="1">
+          <w:hyperlink w:anchor="_Toc244181938" w:history="1">
             <w:r>
               <w:rPr>
                 <w:rStyle w:val="Hyperlink"/>
@@ -1900,7 +1928,7 @@
               <w:rPr>
                 <w:noProof/>
               </w:rPr>
-              <w:instrText xml:space="preserve"> PAGEREF _Toc244093409 \h </w:instrText>
+              <w:instrText xml:space="preserve"> PAGEREF _Toc244181938 \h </w:instrText>
             </w:r>
             <w:r>
               <w:rPr>
@@ -1917,7 +1945,7 @@
               <w:rPr>
                 <w:noProof/>
               </w:rPr>
-              <w:t>26</w:t>
+              <w:t>28</w:t>
             </w:r>
             <w:r>
               <w:rPr>
@@ -1942,7 +1970,7 @@
               <w14:ligatures w14:val="standardContextual"/>
             </w:rPr>
           </w:pPr>
-          <w:hyperlink w:anchor="_Toc244093410" w:history="1">
+          <w:hyperlink w:anchor="_Toc244181939" w:history="1">
             <w:r>
               <w:rPr>
                 <w:rStyle w:val="Hyperlink"/>
@@ -1966,7 +1994,7 @@
               <w:rPr>
                 <w:noProof/>
               </w:rPr>
-              <w:instrText xml:space="preserve"> PAGEREF _Toc244093410 \h </w:instrText>
+              <w:instrText xml:space="preserve"> PAGEREF _Toc244181939 \h </w:instrText>
             </w:r>
             <w:r>
               <w:rPr>
@@ -1983,7 +2011,7 @@
               <w:rPr>
                 <w:noProof/>
               </w:rPr>
-              <w:t>27</w:t>
+              <w:t>29</w:t>
             </w:r>
             <w:r>
               <w:rPr>
@@ -2009,7 +2037,7 @@
       <w:pPr>
         <w:pStyle w:val="Heading1"/>
       </w:pPr>
-      <w:bookmarkStart w:id="0" w:name="_Toc244093384"/>
+      <w:bookmarkStart w:id="0" w:name="_Toc244181913"/>
       <w:r>
         <w:lastRenderedPageBreak/>
         <w:t>1. Introduction</w:t>
@@ -2020,7 +2048,7 @@
       <w:pPr>
         <w:pStyle w:val="Heading2"/>
       </w:pPr>
-      <w:bookmarkStart w:id="1" w:name="_Toc244093385"/>
+      <w:bookmarkStart w:id="1" w:name="_Toc244181914"/>
       <w:r>
         <w:t>1.1 About this guide</w:t>
       </w:r>
@@ -2031,7 +2059,15 @@
         <w:spacing w:after="120" w:line="276" w:lineRule="auto"/>
       </w:pPr>
       <w:r>
-        <w:t xml:space="preserve">This guide explains how to use the BycatchEstimator </w:t>
+        <w:t xml:space="preserve">This guide explains how to use the </w:t>
+      </w:r>
+      <w:proofErr w:type="spellStart"/>
+      <w:r>
+        <w:t>BycatchEstimator</w:t>
+      </w:r>
+      <w:proofErr w:type="spellEnd"/>
+      <w:r>
+        <w:t xml:space="preserve"> </w:t>
       </w:r>
       <w:r>
         <w:t>web application</w:t>
@@ -2057,7 +2093,15 @@
         </w:rPr>
       </w:pPr>
       <w:r>
-        <w:t xml:space="preserve">This web application is intended to make the R package known as BycatchEstimator toolkit (BYET) accessible to a wide audience of practitioners with little or no experience with writing code to conduct statistical analysis. Its development is motivated by fostering </w:t>
+        <w:t xml:space="preserve">This web application is intended to make the R package known as </w:t>
+      </w:r>
+      <w:proofErr w:type="spellStart"/>
+      <w:r>
+        <w:t>BycatchEstimator</w:t>
+      </w:r>
+      <w:proofErr w:type="spellEnd"/>
+      <w:r>
+        <w:t xml:space="preserve"> toolkit (BYET) accessible to a wide audience of practitioners with little or no experience with writing code to conduct statistical analysis. Its development is motivated by fostering </w:t>
       </w:r>
       <w:r>
         <w:rPr>
@@ -2103,6 +2147,7 @@
         </w:rPr>
         <w:t xml:space="preserve"> is a statistical framework for bycatch estimation that has been developed as a freely available R package under the title </w:t>
       </w:r>
+      <w:proofErr w:type="spellStart"/>
       <w:r>
         <w:rPr>
           <w:i/>
@@ -2111,11 +2156,12 @@
         </w:rPr>
         <w:t>BycatchEstimator</w:t>
       </w:r>
+      <w:proofErr w:type="spellEnd"/>
       <w:r>
         <w:rPr>
           <w:color w:val="333333"/>
         </w:rPr>
-        <w:t xml:space="preserve"> (Babcock et al. 2025a). </w:t>
+        <w:t xml:space="preserve"> (Babcock et al. 2025). </w:t>
       </w:r>
       <w:r>
         <w:rPr>
@@ -2148,8 +2194,13 @@
         <w:t xml:space="preserve">. Advanced users who are interested in model-based bycatch estimation are encouraged to access these approaches by using </w:t>
       </w:r>
       <w:r>
-        <w:t>the R package known as BycatchEstimator</w:t>
-      </w:r>
+        <w:t xml:space="preserve">the R package known as </w:t>
+      </w:r>
+      <w:proofErr w:type="spellStart"/>
+      <w:r>
+        <w:t>BycatchEstimator</w:t>
+      </w:r>
+      <w:proofErr w:type="spellEnd"/>
       <w:r>
         <w:t xml:space="preserve">. </w:t>
       </w:r>
@@ -2176,7 +2227,7 @@
       <w:pPr>
         <w:pStyle w:val="Heading2"/>
       </w:pPr>
-      <w:bookmarkStart w:id="2" w:name="_Toc244093386"/>
+      <w:bookmarkStart w:id="2" w:name="_Toc244181915"/>
       <w:r>
         <w:t>1.2 What the app does</w:t>
       </w:r>
@@ -2187,7 +2238,15 @@
         <w:spacing w:after="120" w:line="276" w:lineRule="auto"/>
       </w:pPr>
       <w:r>
-        <w:t>The app is an alternative interface to the BycatchEstimator R package. It produces estimates of bycatch by expanding a sample, such as an observer database, to the total fishing effort recorded in logbooks or landings records. The app is organized into four modules that you work through in order:</w:t>
+        <w:t xml:space="preserve">The app is an alternative interface to the </w:t>
+      </w:r>
+      <w:proofErr w:type="spellStart"/>
+      <w:r>
+        <w:t>BycatchEstimator</w:t>
+      </w:r>
+      <w:proofErr w:type="spellEnd"/>
+      <w:r>
+        <w:t xml:space="preserve"> R package. It produces estimates of bycatch by expanding a sample, such as an observer database, to the total fishing effort recorded in logbooks or landings records. The app is organized into four modules that you work through in order:</w:t>
       </w:r>
     </w:p>
     <w:p>
@@ -2210,7 +2269,15 @@
         <w:t xml:space="preserve">: upload observer and logbook data, tell the app </w:t>
       </w:r>
       <w:r>
-        <w:t>how to interpret you data</w:t>
+        <w:t xml:space="preserve">how to interpret </w:t>
+      </w:r>
+      <w:proofErr w:type="gramStart"/>
+      <w:r>
+        <w:t>you</w:t>
+      </w:r>
+      <w:proofErr w:type="gramEnd"/>
+      <w:r>
+        <w:t xml:space="preserve"> data</w:t>
       </w:r>
       <w:r>
         <w:t xml:space="preserve"> columns, and align fishing effort between the two </w:t>
@@ -2358,79 +2425,27 @@
         <w:spacing w:after="60" w:line="276" w:lineRule="auto"/>
       </w:pPr>
       <w:r>
-        <w:t>Figure 1. Landing page. Side-bar shows links to each module, which should be carried out in order from top to bottom.</w:t>
-      </w:r>
-    </w:p>
-    <w:p>
-      <w:pPr>
-        <w:spacing w:before="80" w:after="160" w:line="276" w:lineRule="auto"/>
-        <w:rPr>
-          <w:i/>
-          <w:iCs/>
-        </w:rPr>
-      </w:pPr>
-      <w:r>
-        <w:rPr>
-          <w:i/>
-          <w:iCs/>
-          <w:highlight w:val="yellow"/>
-        </w:rPr>
-        <w:t>[ADD CONTEXT: When this approach is appropriate and its key assumptions. Also say which features of the R package are, and are not, available in the app.]</w:t>
-      </w:r>
-    </w:p>
-    <w:p>
-      <w:pPr>
-        <w:spacing w:before="80" w:after="160" w:line="276" w:lineRule="auto"/>
-        <w:rPr>
-          <w:i/>
-          <w:iCs/>
-        </w:rPr>
-      </w:pPr>
-      <w:r>
-        <w:rPr>
-          <w:i/>
-          <w:iCs/>
-        </w:rPr>
-        <w:t xml:space="preserve">Add description of design-based </w:t>
-      </w:r>
-    </w:p>
-    <w:p>
-      <w:pPr>
-        <w:spacing w:before="80" w:after="160" w:line="276" w:lineRule="auto"/>
-        <w:rPr>
-          <w:i/>
-          <w:iCs/>
-        </w:rPr>
-      </w:pPr>
-    </w:p>
-    <w:p>
-      <w:pPr>
-        <w:spacing w:before="80" w:after="160" w:line="276" w:lineRule="auto"/>
-        <w:rPr>
-          <w:i/>
-          <w:iCs/>
-        </w:rPr>
-      </w:pPr>
-    </w:p>
-    <w:p>
-      <w:pPr>
-        <w:spacing w:before="80" w:after="160" w:line="276" w:lineRule="auto"/>
-        <w:rPr>
-          <w:i/>
-          <w:iCs/>
-        </w:rPr>
-      </w:pPr>
-    </w:p>
-    <w:p>
-      <w:pPr>
-        <w:spacing w:before="80" w:after="160" w:line="276" w:lineRule="auto"/>
+        <w:t xml:space="preserve">Figure 1. Landing page. </w:t>
+      </w:r>
+      <w:proofErr w:type="gramStart"/>
+      <w:r>
+        <w:t>Side-bar</w:t>
+      </w:r>
+      <w:proofErr w:type="gramEnd"/>
+      <w:r>
+        <w:t xml:space="preserve"> shows links to each module, which should be carried out in order from top to bottom.</w:t>
+      </w:r>
+    </w:p>
+    <w:p>
+      <w:pPr>
+        <w:spacing w:after="60" w:line="276" w:lineRule="auto"/>
       </w:pPr>
     </w:p>
     <w:p>
       <w:pPr>
         <w:pStyle w:val="Heading2"/>
       </w:pPr>
-      <w:bookmarkStart w:id="3" w:name="_Toc244093387"/>
+      <w:bookmarkStart w:id="3" w:name="_Toc244181916"/>
       <w:r>
         <w:t>1.3 Before you begin</w:t>
       </w:r>
@@ -2501,6 +2516,7 @@
       <w:r>
         <w:t xml:space="preserve">The </w:t>
       </w:r>
+      <w:proofErr w:type="spellStart"/>
       <w:r>
         <w:rPr>
           <w:b/>
@@ -2508,6 +2524,7 @@
         </w:rPr>
         <w:t>BycatchEstimatorApp</w:t>
       </w:r>
+      <w:proofErr w:type="spellEnd"/>
       <w:r>
         <w:t xml:space="preserve"> package, which contains the app (Section 1.4).</w:t>
       </w:r>
@@ -2614,9 +2631,14 @@
     </w:p>
     <w:p>
       <w:pPr>
+        <w:spacing w:after="120" w:line="276" w:lineRule="auto"/>
+      </w:pPr>
+    </w:p>
+    <w:p>
+      <w:pPr>
         <w:pStyle w:val="Heading2"/>
       </w:pPr>
-      <w:bookmarkStart w:id="4" w:name="_Toc244093388"/>
+      <w:bookmarkStart w:id="4" w:name="_Toc244181917"/>
       <w:r>
         <w:t>1.4 Installing and starting the app</w:t>
       </w:r>
@@ -2646,8 +2668,25 @@
           <w:iCs/>
           <w:highlight w:val="yellow"/>
         </w:rPr>
-        <w:lastRenderedPageBreak/>
-        <w:t>[ADD CONTEXT: Confirm the final package name and how the package is distributed (for example, GitHub, r-universe or CRAN). The package name used below, BycatchEstimatorApp, is a working name.]</w:t>
+        <w:t xml:space="preserve">[ADD CONTEXT: Confirm the final package name and how the package is distributed (for example, GitHub, r-universe or CRAN). The package name used below, </w:t>
+      </w:r>
+      <w:proofErr w:type="spellStart"/>
+      <w:r>
+        <w:rPr>
+          <w:i/>
+          <w:iCs/>
+          <w:highlight w:val="yellow"/>
+        </w:rPr>
+        <w:t>BycatchEstimatorApp</w:t>
+      </w:r>
+      <w:proofErr w:type="spellEnd"/>
+      <w:r>
+        <w:rPr>
+          <w:i/>
+          <w:iCs/>
+          <w:highlight w:val="yellow"/>
+        </w:rPr>
+        <w:t>, is a working name.]</w:t>
       </w:r>
     </w:p>
     <w:p>
@@ -2691,6 +2730,7 @@
         <w:spacing w:after="80" w:line="276" w:lineRule="auto"/>
       </w:pPr>
       <w:r>
+        <w:lastRenderedPageBreak/>
         <w:t xml:space="preserve">Download and install </w:t>
       </w:r>
       <w:r>
@@ -2707,11 +2747,26 @@
         <w:t xml:space="preserve"> You may be tempted to run the app in R without using RStudio; however, RStudio </w:t>
       </w:r>
       <w:r>
-        <w:t>contains Pandoc, which is necessary for downloading reports.</w:t>
+        <w:t xml:space="preserve">contains </w:t>
+      </w:r>
+      <w:proofErr w:type="spellStart"/>
+      <w:r>
+        <w:t>Pandoc</w:t>
+      </w:r>
+      <w:proofErr w:type="spellEnd"/>
+      <w:r>
+        <w:t>, which is necessary for downloading reports.</w:t>
       </w:r>
       <w:r>
         <w:t xml:space="preserve"> </w:t>
       </w:r>
+    </w:p>
+    <w:p>
+      <w:pPr>
+        <w:pStyle w:val="ListParagraph"/>
+        <w:spacing w:after="80" w:line="276" w:lineRule="auto"/>
+        <w:ind w:left="720"/>
+      </w:pPr>
     </w:p>
     <w:p>
       <w:pPr>
@@ -2731,8 +2786,25 @@
         <w:t xml:space="preserve">Note: </w:t>
       </w:r>
       <w:r>
-        <w:t>If you use R without RStudio, you must also install Pandoc (https://pandoc.org/installing.html). Without it, the app cannot create the Data checks and Analysis results reports.</w:t>
-      </w:r>
+        <w:t xml:space="preserve">If you use R without RStudio, you must also install </w:t>
+      </w:r>
+      <w:proofErr w:type="spellStart"/>
+      <w:r>
+        <w:t>Pandoc</w:t>
+      </w:r>
+      <w:proofErr w:type="spellEnd"/>
+      <w:r>
+        <w:t xml:space="preserve"> (https://pandoc.org/installing.html). Without it, the app cannot create the Data checks and </w:t>
+      </w:r>
+      <w:r>
+        <w:br/>
+        <w:t>Analysis results reports.</w:t>
+      </w:r>
+    </w:p>
+    <w:p>
+      <w:pPr>
+        <w:spacing w:after="80" w:line="276" w:lineRule="auto"/>
+      </w:pPr>
     </w:p>
     <w:p>
       <w:pPr>
@@ -2821,12 +2893,24 @@
         <w:spacing w:after="80" w:line="276" w:lineRule="auto"/>
       </w:pPr>
       <w:r>
-        <w:t>Wait for the installation to finish. The first installation can take several minutes because the app needs a number of supporting packages. If R asks whether to install or update packages, accept the defaults.</w:t>
+        <w:t xml:space="preserve">Wait for the installation to finish. The first installation can take several minutes because the app needs </w:t>
+      </w:r>
+      <w:proofErr w:type="gramStart"/>
+      <w:r>
+        <w:t>a number of</w:t>
+      </w:r>
+      <w:proofErr w:type="gramEnd"/>
+      <w:r>
+        <w:t xml:space="preserve"> supporting packages. If R asks whether to install or update packages, accept the defaults.</w:t>
       </w:r>
     </w:p>
     <w:p>
       <w:pPr>
         <w:spacing w:before="80" w:after="160" w:line="276" w:lineRule="auto"/>
+        <w:rPr>
+          <w:i/>
+          <w:iCs/>
+        </w:rPr>
       </w:pPr>
       <w:r>
         <w:rPr>
@@ -2834,8 +2918,117 @@
           <w:iCs/>
           <w:highlight w:val="yellow"/>
         </w:rPr>
-        <w:t>[ADD CONTEXT: The installation command for your chosen distribution option. Examples of the forms it can take: remotes::install_github("account/package") for GitHub; install.packages("package", repos = c("https://account.r-universe.dev", "https://cloud.r-project.org")) for r-universe; install.packages("package") for CRAN. Remember to say whether users first need to install the remotes package.]</w:t>
-      </w:r>
+        <w:t xml:space="preserve">[ADD CONTEXT: The installation command for your chosen distribution option. Examples of the forms it can </w:t>
+      </w:r>
+      <w:proofErr w:type="gramStart"/>
+      <w:r>
+        <w:rPr>
+          <w:i/>
+          <w:iCs/>
+          <w:highlight w:val="yellow"/>
+        </w:rPr>
+        <w:t>take:</w:t>
+      </w:r>
+      <w:proofErr w:type="gramEnd"/>
+      <w:r>
+        <w:rPr>
+          <w:i/>
+          <w:iCs/>
+          <w:highlight w:val="yellow"/>
+        </w:rPr>
+        <w:t xml:space="preserve"> </w:t>
+      </w:r>
+      <w:proofErr w:type="gramStart"/>
+      <w:r>
+        <w:rPr>
+          <w:i/>
+          <w:iCs/>
+          <w:highlight w:val="yellow"/>
+        </w:rPr>
+        <w:t>remotes::</w:t>
+      </w:r>
+      <w:proofErr w:type="spellStart"/>
+      <w:proofErr w:type="gramEnd"/>
+      <w:r>
+        <w:rPr>
+          <w:i/>
+          <w:iCs/>
+          <w:highlight w:val="yellow"/>
+        </w:rPr>
+        <w:t>install_github</w:t>
+      </w:r>
+      <w:proofErr w:type="spellEnd"/>
+      <w:r>
+        <w:rPr>
+          <w:i/>
+          <w:iCs/>
+          <w:highlight w:val="yellow"/>
+        </w:rPr>
+        <w:t xml:space="preserve">("account/package") for GitHub; </w:t>
+      </w:r>
+      <w:proofErr w:type="spellStart"/>
+      <w:proofErr w:type="gramStart"/>
+      <w:r>
+        <w:rPr>
+          <w:i/>
+          <w:iCs/>
+          <w:highlight w:val="yellow"/>
+        </w:rPr>
+        <w:t>install.packages</w:t>
+      </w:r>
+      <w:proofErr w:type="spellEnd"/>
+      <w:proofErr w:type="gramEnd"/>
+      <w:r>
+        <w:rPr>
+          <w:i/>
+          <w:iCs/>
+          <w:highlight w:val="yellow"/>
+        </w:rPr>
+        <w:t xml:space="preserve">("package", repos = </w:t>
+      </w:r>
+      <w:proofErr w:type="gramStart"/>
+      <w:r>
+        <w:rPr>
+          <w:i/>
+          <w:iCs/>
+          <w:highlight w:val="yellow"/>
+        </w:rPr>
+        <w:t>c(</w:t>
+      </w:r>
+      <w:proofErr w:type="gramEnd"/>
+      <w:r>
+        <w:rPr>
+          <w:i/>
+          <w:iCs/>
+          <w:highlight w:val="yellow"/>
+        </w:rPr>
+        <w:t xml:space="preserve">"https://account.r-universe.dev", "https://cloud.r-project.org")) for r-universe; </w:t>
+      </w:r>
+      <w:proofErr w:type="spellStart"/>
+      <w:proofErr w:type="gramStart"/>
+      <w:r>
+        <w:rPr>
+          <w:i/>
+          <w:iCs/>
+          <w:highlight w:val="yellow"/>
+        </w:rPr>
+        <w:t>install.packages</w:t>
+      </w:r>
+      <w:proofErr w:type="spellEnd"/>
+      <w:proofErr w:type="gramEnd"/>
+      <w:r>
+        <w:rPr>
+          <w:i/>
+          <w:iCs/>
+          <w:highlight w:val="yellow"/>
+        </w:rPr>
+        <w:t>("package") for CRAN. Remember to say whether users first need to install the remotes package.]</w:t>
+      </w:r>
+    </w:p>
+    <w:p>
+      <w:pPr>
+        <w:spacing w:before="80" w:after="160" w:line="276" w:lineRule="auto"/>
+      </w:pPr>
     </w:p>
     <w:p>
       <w:pPr>
@@ -2861,6 +3054,11 @@
     </w:p>
     <w:p>
       <w:pPr>
+        <w:spacing w:before="80" w:after="160" w:line="276" w:lineRule="auto"/>
+      </w:pPr>
+    </w:p>
+    <w:p>
+      <w:pPr>
         <w:pStyle w:val="Heading3"/>
       </w:pPr>
       <w:r>
@@ -2894,13 +3092,61 @@
         <w:spacing w:before="60" w:after="140"/>
         <w:ind w:left="360" w:right="360"/>
       </w:pPr>
+      <w:proofErr w:type="spellStart"/>
+      <w:proofErr w:type="gramStart"/>
       <w:r>
         <w:rPr>
           <w:rFonts w:ascii="Courier New" w:eastAsia="Courier New" w:hAnsi="Courier New" w:cs="Courier New"/>
           <w:sz w:val="20"/>
           <w:szCs w:val="20"/>
         </w:rPr>
-        <w:t>BycatchEstimatorApp::run_bycatch_app()</w:t>
+        <w:t>BycatchEstimatorApp</w:t>
+      </w:r>
+      <w:proofErr w:type="spellEnd"/>
+      <w:r>
+        <w:rPr>
+          <w:rFonts w:ascii="Courier New" w:eastAsia="Courier New" w:hAnsi="Courier New" w:cs="Courier New"/>
+          <w:sz w:val="20"/>
+          <w:szCs w:val="20"/>
+        </w:rPr>
+        <w:t>::</w:t>
+      </w:r>
+      <w:proofErr w:type="spellStart"/>
+      <w:proofErr w:type="gramEnd"/>
+      <w:r>
+        <w:rPr>
+          <w:rFonts w:ascii="Courier New" w:eastAsia="Courier New" w:hAnsi="Courier New" w:cs="Courier New"/>
+          <w:sz w:val="20"/>
+          <w:szCs w:val="20"/>
+        </w:rPr>
+        <w:t>run_bycatch_</w:t>
+      </w:r>
+      <w:proofErr w:type="gramStart"/>
+      <w:r>
+        <w:rPr>
+          <w:rFonts w:ascii="Courier New" w:eastAsia="Courier New" w:hAnsi="Courier New" w:cs="Courier New"/>
+          <w:sz w:val="20"/>
+          <w:szCs w:val="20"/>
+        </w:rPr>
+        <w:t>app</w:t>
+      </w:r>
+      <w:proofErr w:type="spellEnd"/>
+      <w:r>
+        <w:rPr>
+          <w:rFonts w:ascii="Courier New" w:eastAsia="Courier New" w:hAnsi="Courier New" w:cs="Courier New"/>
+          <w:sz w:val="20"/>
+          <w:szCs w:val="20"/>
+        </w:rPr>
+        <w:t>(</w:t>
+      </w:r>
+      <w:proofErr w:type="gramEnd"/>
+      <w:r>
+        <w:rPr>
+          <w:rFonts w:ascii="Courier New" w:eastAsia="Courier New" w:hAnsi="Courier New" w:cs="Courier New"/>
+          <w:sz w:val="20"/>
+          <w:szCs w:val="20"/>
+        </w:rPr>
+        <w:t>)</w:t>
       </w:r>
     </w:p>
     <w:p>
@@ -2996,6 +3242,11 @@
     </w:p>
     <w:p>
       <w:pPr>
+        <w:spacing w:after="60" w:line="276" w:lineRule="auto"/>
+      </w:pPr>
+    </w:p>
+    <w:p>
+      <w:pPr>
         <w:pStyle w:val="Heading3"/>
       </w:pPr>
       <w:r>
@@ -3035,12 +3286,19 @@
         </w:rPr>
         <w:t>[ADD CONTEXT: A statement about data handling when the app is run locally. For example: files you attach are read by the copy of the app running on your own computer. Confirm this wording matches how you will distribute and support the app.]</w:t>
       </w:r>
+      <w:r>
+        <w:rPr>
+          <w:i/>
+          <w:iCs/>
+        </w:rPr>
+        <w:br/>
+      </w:r>
     </w:p>
     <w:p>
       <w:pPr>
         <w:pStyle w:val="Heading2"/>
       </w:pPr>
-      <w:bookmarkStart w:id="5" w:name="_Toc244093389"/>
+      <w:bookmarkStart w:id="5" w:name="_Toc244181918"/>
       <w:r>
         <w:t>1.5 Finding your way around</w:t>
       </w:r>
@@ -3514,7 +3772,7 @@
       <w:pPr>
         <w:pStyle w:val="Heading2"/>
       </w:pPr>
-      <w:bookmarkStart w:id="6" w:name="_Toc244093390"/>
+      <w:bookmarkStart w:id="6" w:name="_Toc244181919"/>
       <w:r>
         <w:lastRenderedPageBreak/>
         <w:t>1.6 Quick start</w:t>
@@ -3533,12 +3791,55 @@
       <w:r>
         <w:t xml:space="preserve">First time only: install R, RStudio and the app package (Section 1.4). Then start the app with </w:t>
       </w:r>
+      <w:proofErr w:type="spellStart"/>
+      <w:proofErr w:type="gramStart"/>
       <w:r>
         <w:rPr>
           <w:b/>
           <w:bCs/>
         </w:rPr>
-        <w:t>BycatchEstimatorApp::run_bycatch_app()</w:t>
+        <w:t>BycatchEstimatorApp</w:t>
+      </w:r>
+      <w:proofErr w:type="spellEnd"/>
+      <w:r>
+        <w:rPr>
+          <w:b/>
+          <w:bCs/>
+        </w:rPr>
+        <w:t>::</w:t>
+      </w:r>
+      <w:proofErr w:type="spellStart"/>
+      <w:proofErr w:type="gramEnd"/>
+      <w:r>
+        <w:rPr>
+          <w:b/>
+          <w:bCs/>
+        </w:rPr>
+        <w:t>run_bycatch_</w:t>
+      </w:r>
+      <w:proofErr w:type="gramStart"/>
+      <w:r>
+        <w:rPr>
+          <w:b/>
+          <w:bCs/>
+        </w:rPr>
+        <w:t>app</w:t>
+      </w:r>
+      <w:proofErr w:type="spellEnd"/>
+      <w:r>
+        <w:rPr>
+          <w:b/>
+          <w:bCs/>
+        </w:rPr>
+        <w:t>(</w:t>
+      </w:r>
+      <w:proofErr w:type="gramEnd"/>
+      <w:r>
+        <w:rPr>
+          <w:b/>
+          <w:bCs/>
+        </w:rPr>
+        <w:t>)</w:t>
       </w:r>
       <w:r>
         <w:t>.</w:t>
@@ -3621,10 +3922,22 @@
           <w:b/>
           <w:bCs/>
         </w:rPr>
-        <w:t>Align data &amp; activate</w:t>
-      </w:r>
-      <w:r>
-        <w:t xml:space="preserve">: align the effort columns, add any factor variables, enter species names and a description, then click </w:t>
+        <w:t xml:space="preserve">Align data &amp; </w:t>
+      </w:r>
+      <w:proofErr w:type="gramStart"/>
+      <w:r>
+        <w:rPr>
+          <w:b/>
+          <w:bCs/>
+        </w:rPr>
+        <w:t>activate</w:t>
+      </w:r>
+      <w:r>
+        <w:t>:</w:t>
+      </w:r>
+      <w:proofErr w:type="gramEnd"/>
+      <w:r>
+        <w:t xml:space="preserve"> align the effort columns, add any factor variables, enter species names and a description, then click </w:t>
       </w:r>
       <w:r>
         <w:rPr>
@@ -3736,7 +4049,7 @@
       <w:pPr>
         <w:pStyle w:val="Heading1"/>
       </w:pPr>
-      <w:bookmarkStart w:id="7" w:name="_Toc244093391"/>
+      <w:bookmarkStart w:id="7" w:name="_Toc244181920"/>
       <w:r>
         <w:lastRenderedPageBreak/>
         <w:t>2. Preparing your data</w:t>
@@ -3755,7 +4068,7 @@
       <w:pPr>
         <w:pStyle w:val="Heading2"/>
       </w:pPr>
-      <w:bookmarkStart w:id="8" w:name="_Toc244093392"/>
+      <w:bookmarkStart w:id="8" w:name="_Toc244181921"/>
       <w:r>
         <w:t>2.1 File requirements</w:t>
       </w:r>
@@ -4119,7 +4432,7 @@
       <w:pPr>
         <w:pStyle w:val="Heading2"/>
       </w:pPr>
-      <w:bookmarkStart w:id="9" w:name="_Toc244093393"/>
+      <w:bookmarkStart w:id="9" w:name="_Toc244181922"/>
       <w:r>
         <w:t>2.2 What each dataset should contain</w:t>
       </w:r>
@@ -4836,24 +5149,17 @@
     </w:p>
     <w:p>
       <w:pPr>
-        <w:spacing w:before="80" w:after="160" w:line="276" w:lineRule="auto"/>
-      </w:pPr>
-      <w:r>
-        <w:rPr>
-          <w:i/>
-          <w:iCs/>
-          <w:highlight w:val="yellow"/>
-        </w:rPr>
-        <w:t>[ADD CONTEXT: Any data-cleaning advice, such as consistent area codes, handling of missing values, and confidentiality considerations.]</w:t>
-      </w:r>
-    </w:p>
-    <w:p>
-      <w:pPr>
         <w:pStyle w:val="Heading2"/>
       </w:pPr>
-      <w:bookmarkStart w:id="10" w:name="_Toc244093394"/>
-      <w:r>
-        <w:t>2.3 Reserved column names</w:t>
+      <w:bookmarkStart w:id="10" w:name="_Toc244181923"/>
+      <w:r>
+        <w:t xml:space="preserve">2.3 </w:t>
+      </w:r>
+      <w:r>
+        <w:t>Protected</w:t>
+      </w:r>
+      <w:r>
+        <w:t xml:space="preserve"> column names</w:t>
       </w:r>
       <w:bookmarkEnd w:id="10"/>
     </w:p>
@@ -4894,6 +5200,7 @@
       <w:r>
         <w:t xml:space="preserve"> and </w:t>
       </w:r>
+      <w:proofErr w:type="spellStart"/>
       <w:r>
         <w:rPr>
           <w:b/>
@@ -4901,27 +5208,34 @@
         </w:rPr>
         <w:t>SampleUnits</w:t>
       </w:r>
-      <w:r>
-        <w:t xml:space="preserve">. If your file already has a column with one of these names, you must select that column for that role. Otherwise the app shows a red warning. To fix it, either select the column with the reserved name, or rename or remove it in your file and upload the file again. The warning appears in red </w:t>
-      </w:r>
-      <w:r>
+      <w:proofErr w:type="spellEnd"/>
+      <w:r>
+        <w:t xml:space="preserve">. If your file already has a column with one of these names, you must select that column for that role. </w:t>
+      </w:r>
+      <w:r>
+        <w:t>Otherwise,</w:t>
+      </w:r>
+      <w:r>
+        <w:t xml:space="preserve"> the app shows a red warning. To fix it, either select the column with the reserved name, or rename or remove it in your file and upload the file again. The warning appears in red directly below the field as soon as you make the selection, and the step cannot be completed until it is resolved</w:t>
+      </w:r>
+      <w:r>
+        <w:t>.</w:t>
+      </w:r>
+    </w:p>
+    <w:p>
+      <w:pPr>
+        <w:spacing w:after="120" w:line="276" w:lineRule="auto"/>
+      </w:pPr>
+    </w:p>
+    <w:p>
+      <w:pPr>
+        <w:spacing w:after="120" w:line="276" w:lineRule="auto"/>
+      </w:pPr>
+      <w:r>
+        <w:rPr>
+          <w:noProof/>
+        </w:rPr>
         <w:lastRenderedPageBreak/>
-        <w:t>directly below the field as soon as you make the selection, and the step cannot be completed until it is resolved.</w:t>
-      </w:r>
-    </w:p>
-    <w:p>
-      <w:pPr>
-        <w:spacing w:after="120" w:line="276" w:lineRule="auto"/>
-      </w:pPr>
-    </w:p>
-    <w:p>
-      <w:pPr>
-        <w:spacing w:after="120" w:line="276" w:lineRule="auto"/>
-      </w:pPr>
-      <w:r>
-        <w:rPr>
-          <w:noProof/>
-        </w:rPr>
         <w:drawing>
           <wp:inline distT="0" distB="0" distL="0" distR="0" wp14:anchorId="73C63A12" wp14:editId="5B15C2E7">
             <wp:extent cx="5943600" cy="1346835"/>
@@ -4964,7 +5278,15 @@
         <w:spacing w:after="120" w:line="276" w:lineRule="auto"/>
       </w:pPr>
       <w:r>
-        <w:t>Figure 4. A red warning that ‘Year is available but you selected something else!’, as an example of reserved column names.</w:t>
+        <w:t xml:space="preserve">Figure 4. A red warning that ‘Year is </w:t>
+      </w:r>
+      <w:proofErr w:type="gramStart"/>
+      <w:r>
+        <w:t>available</w:t>
+      </w:r>
+      <w:proofErr w:type="gramEnd"/>
+      <w:r>
+        <w:t xml:space="preserve"> but you selected something else!’, as an example of reserved column names.</w:t>
       </w:r>
       <w:r>
         <w:br/>
@@ -5403,6 +5725,7 @@
             <w:pPr>
               <w:spacing w:after="40"/>
             </w:pPr>
+            <w:proofErr w:type="spellStart"/>
             <w:r>
               <w:rPr>
                 <w:sz w:val="20"/>
@@ -5410,6 +5733,7 @@
               </w:rPr>
               <w:t>SampleUnits</w:t>
             </w:r>
+            <w:proofErr w:type="spellEnd"/>
           </w:p>
         </w:tc>
         <w:tc>
@@ -5483,7 +5807,7 @@
       <w:pPr>
         <w:pStyle w:val="Heading2"/>
       </w:pPr>
-      <w:bookmarkStart w:id="11" w:name="_Toc244093395"/>
+      <w:bookmarkStart w:id="11" w:name="_Toc244181924"/>
       <w:r>
         <w:t>2.4 Practice datasets</w:t>
       </w:r>
@@ -5525,6 +5849,17 @@
       </w:r>
       <w:r>
         <w:t>.</w:t>
+      </w:r>
+    </w:p>
+    <w:p>
+      <w:pPr>
+        <w:pStyle w:val="Heading3"/>
+      </w:pPr>
+      <w:r>
+        <w:t>Simple observer and logbook datasets</w:t>
+      </w:r>
+      <w:r>
+        <w:t xml:space="preserve"> </w:t>
       </w:r>
     </w:p>
     <w:p>
@@ -5532,32 +5867,14 @@
         <w:pStyle w:val="ListParagraph"/>
         <w:numPr>
           <w:ilvl w:val="0"/>
-          <w:numId w:val="2"/>
+          <w:numId w:val="24"/>
         </w:numPr>
-        <w:spacing w:after="60" w:line="276" w:lineRule="auto"/>
-      </w:pPr>
-      <w:commentRangeStart w:id="12"/>
-      <w:r>
-        <w:rPr>
-          <w:b/>
-          <w:bCs/>
-        </w:rPr>
-        <w:t>Simple observer and logbook datasets</w:t>
-      </w:r>
-      <w:r>
-        <w:t xml:space="preserve"> </w:t>
-      </w:r>
-      <w:commentRangeEnd w:id="12"/>
-      <w:r>
-        <w:rPr>
-          <w:rStyle w:val="CommentReference"/>
-          <w:sz w:val="22"/>
-          <w:szCs w:val="22"/>
-        </w:rPr>
-        <w:commentReference w:id="12"/>
-      </w:r>
-      <w:r>
-        <w:t>(downloaded as observerdata_simple.csv and logbookdata_simple.csv).</w:t>
+      </w:pPr>
+      <w:r>
+        <w:t>D</w:t>
+      </w:r>
+      <w:r>
+        <w:t>ownloaded as observerdata_simple.csv and logbookdata_simple.csv.</w:t>
       </w:r>
     </w:p>
     <w:p>
@@ -5565,19 +5882,78 @@
         <w:pStyle w:val="ListParagraph"/>
         <w:numPr>
           <w:ilvl w:val="0"/>
-          <w:numId w:val="2"/>
+          <w:numId w:val="24"/>
         </w:numPr>
-        <w:spacing w:after="60" w:line="276" w:lineRule="auto"/>
-      </w:pPr>
-      <w:r>
-        <w:rPr>
-          <w:b/>
-          <w:bCs/>
-        </w:rPr>
-        <w:t>Complex observer and logbook datasets from LLSIM</w:t>
-      </w:r>
-      <w:r>
-        <w:t xml:space="preserve"> (downloaded as observerdata_LLSIM.csv and logbookdata_LLSIM.csv).</w:t>
+      </w:pPr>
+      <w:r>
+        <w:t>Observer data:</w:t>
+      </w:r>
+    </w:p>
+    <w:p>
+      <w:pPr>
+        <w:pStyle w:val="ListParagraph"/>
+        <w:numPr>
+          <w:ilvl w:val="1"/>
+          <w:numId w:val="24"/>
+        </w:numPr>
+      </w:pPr>
+      <w:r>
+        <w:t>Year: year variable</w:t>
+      </w:r>
+    </w:p>
+    <w:p>
+      <w:pPr>
+        <w:pStyle w:val="ListParagraph"/>
+        <w:numPr>
+          <w:ilvl w:val="1"/>
+          <w:numId w:val="24"/>
+        </w:numPr>
+      </w:pPr>
+      <w:r>
+        <w:t>Catch: catch variable</w:t>
+      </w:r>
+    </w:p>
+    <w:p>
+      <w:pPr>
+        <w:pStyle w:val="ListParagraph"/>
+        <w:numPr>
+          <w:ilvl w:val="1"/>
+          <w:numId w:val="24"/>
+        </w:numPr>
+      </w:pPr>
+      <w:proofErr w:type="spellStart"/>
+      <w:proofErr w:type="gramStart"/>
+      <w:r>
+        <w:t>sampled.sets</w:t>
+      </w:r>
+      <w:proofErr w:type="spellEnd"/>
+      <w:proofErr w:type="gramEnd"/>
+      <w:r>
+        <w:t>: Effort variable, total effort for the fishing trip</w:t>
+      </w:r>
+    </w:p>
+    <w:p>
+      <w:pPr>
+        <w:pStyle w:val="ListParagraph"/>
+        <w:numPr>
+          <w:ilvl w:val="1"/>
+          <w:numId w:val="24"/>
+        </w:numPr>
+      </w:pPr>
+      <w:r>
+        <w:t>Each row is a fishing trip</w:t>
+      </w:r>
+    </w:p>
+    <w:p>
+      <w:pPr>
+        <w:pStyle w:val="ListParagraph"/>
+        <w:numPr>
+          <w:ilvl w:val="1"/>
+          <w:numId w:val="24"/>
+        </w:numPr>
+      </w:pPr>
+      <w:r>
+        <w:t>EW and season are optional design stratification and/or grouping variables.</w:t>
       </w:r>
     </w:p>
     <w:p>
@@ -5585,20 +5961,413 @@
         <w:pStyle w:val="ListParagraph"/>
         <w:numPr>
           <w:ilvl w:val="0"/>
-          <w:numId w:val="2"/>
+          <w:numId w:val="24"/>
         </w:numPr>
+      </w:pPr>
+      <w:r>
+        <w:t>Logbook data:</w:t>
+      </w:r>
+    </w:p>
+    <w:p>
+      <w:pPr>
+        <w:pStyle w:val="ListParagraph"/>
+        <w:numPr>
+          <w:ilvl w:val="1"/>
+          <w:numId w:val="24"/>
+        </w:numPr>
+      </w:pPr>
+      <w:r>
+        <w:t>Year: year variable</w:t>
+      </w:r>
+    </w:p>
+    <w:p>
+      <w:pPr>
+        <w:pStyle w:val="ListParagraph"/>
+        <w:numPr>
+          <w:ilvl w:val="1"/>
+          <w:numId w:val="24"/>
+        </w:numPr>
+      </w:pPr>
+      <w:r>
+        <w:t>sets: Effort variable, total effort for the fishing trip</w:t>
+      </w:r>
+    </w:p>
+    <w:p>
+      <w:pPr>
+        <w:pStyle w:val="ListParagraph"/>
+        <w:numPr>
+          <w:ilvl w:val="1"/>
+          <w:numId w:val="24"/>
+        </w:numPr>
+      </w:pPr>
+      <w:r>
+        <w:t>Each row is a fishing trip</w:t>
+      </w:r>
+    </w:p>
+    <w:p>
+      <w:pPr>
+        <w:pStyle w:val="ListParagraph"/>
+        <w:numPr>
+          <w:ilvl w:val="1"/>
+          <w:numId w:val="24"/>
+        </w:numPr>
+      </w:pPr>
+      <w:r>
+        <w:t>EW and season are optional design stratification and/or grouping variables.</w:t>
+      </w:r>
+    </w:p>
+    <w:p>
+      <w:pPr>
         <w:spacing w:after="60" w:line="276" w:lineRule="auto"/>
-      </w:pPr>
-      <w:r>
-        <w:rPr>
-          <w:i/>
-          <w:iCs/>
-          <w:highlight w:val="yellow"/>
-        </w:rPr>
-        <w:t>[ADD CONTEXT: What the example datasets represent (fishery, species, variables) and which one you recommend for a first practice run.]</w:t>
-      </w:r>
-    </w:p>
-    <w:p>
+        <w:rPr>
+          <w:b/>
+          <w:bCs/>
+        </w:rPr>
+      </w:pPr>
+    </w:p>
+    <w:p>
+      <w:pPr>
+        <w:pStyle w:val="Heading3"/>
+      </w:pPr>
+      <w:r>
+        <w:t xml:space="preserve">Simple observer with aggregated logbook datasets </w:t>
+      </w:r>
+    </w:p>
+    <w:p>
+      <w:pPr>
+        <w:pStyle w:val="ListParagraph"/>
+        <w:numPr>
+          <w:ilvl w:val="0"/>
+          <w:numId w:val="25"/>
+        </w:numPr>
+      </w:pPr>
+      <w:r>
+        <w:t>D</w:t>
+      </w:r>
+      <w:r>
+        <w:t xml:space="preserve">ownloaded as </w:t>
+      </w:r>
+      <w:r>
+        <w:t>observerdata_simple.csv</w:t>
+      </w:r>
+      <w:r>
+        <w:t xml:space="preserve"> and </w:t>
+      </w:r>
+      <w:r>
+        <w:t>logbookdata_aggregate.csv</w:t>
+      </w:r>
+    </w:p>
+    <w:p>
+      <w:pPr>
+        <w:pStyle w:val="ListParagraph"/>
+        <w:numPr>
+          <w:ilvl w:val="0"/>
+          <w:numId w:val="25"/>
+        </w:numPr>
+      </w:pPr>
+      <w:r>
+        <w:t>Observer data:</w:t>
+      </w:r>
+    </w:p>
+    <w:p>
+      <w:pPr>
+        <w:pStyle w:val="ListParagraph"/>
+        <w:numPr>
+          <w:ilvl w:val="1"/>
+          <w:numId w:val="25"/>
+        </w:numPr>
+      </w:pPr>
+      <w:r>
+        <w:t>Year: year variable</w:t>
+      </w:r>
+    </w:p>
+    <w:p>
+      <w:pPr>
+        <w:pStyle w:val="ListParagraph"/>
+        <w:numPr>
+          <w:ilvl w:val="1"/>
+          <w:numId w:val="25"/>
+        </w:numPr>
+      </w:pPr>
+      <w:r>
+        <w:t>Catch: catch variable</w:t>
+      </w:r>
+    </w:p>
+    <w:p>
+      <w:pPr>
+        <w:pStyle w:val="ListParagraph"/>
+        <w:numPr>
+          <w:ilvl w:val="1"/>
+          <w:numId w:val="25"/>
+        </w:numPr>
+      </w:pPr>
+      <w:proofErr w:type="spellStart"/>
+      <w:proofErr w:type="gramStart"/>
+      <w:r>
+        <w:lastRenderedPageBreak/>
+        <w:t>sampled.sets</w:t>
+      </w:r>
+      <w:proofErr w:type="spellEnd"/>
+      <w:proofErr w:type="gramEnd"/>
+      <w:r>
+        <w:t>: Effort variable</w:t>
+      </w:r>
+      <w:r>
+        <w:t>, total effort for the trip</w:t>
+      </w:r>
+    </w:p>
+    <w:p>
+      <w:pPr>
+        <w:pStyle w:val="ListParagraph"/>
+        <w:numPr>
+          <w:ilvl w:val="1"/>
+          <w:numId w:val="25"/>
+        </w:numPr>
+      </w:pPr>
+      <w:r>
+        <w:t>Each row is a fishing trip</w:t>
+      </w:r>
+    </w:p>
+    <w:p>
+      <w:pPr>
+        <w:pStyle w:val="ListParagraph"/>
+        <w:numPr>
+          <w:ilvl w:val="1"/>
+          <w:numId w:val="25"/>
+        </w:numPr>
+      </w:pPr>
+      <w:r>
+        <w:t>EW and season are optional design stratification and/or grouping variables.</w:t>
+      </w:r>
+    </w:p>
+    <w:p>
+      <w:pPr>
+        <w:pStyle w:val="ListParagraph"/>
+        <w:numPr>
+          <w:ilvl w:val="0"/>
+          <w:numId w:val="25"/>
+        </w:numPr>
+      </w:pPr>
+      <w:r>
+        <w:t>Logbook data:</w:t>
+      </w:r>
+    </w:p>
+    <w:p>
+      <w:pPr>
+        <w:pStyle w:val="ListParagraph"/>
+        <w:numPr>
+          <w:ilvl w:val="1"/>
+          <w:numId w:val="25"/>
+        </w:numPr>
+      </w:pPr>
+      <w:r>
+        <w:t>Year: year variable</w:t>
+      </w:r>
+    </w:p>
+    <w:p>
+      <w:pPr>
+        <w:pStyle w:val="ListParagraph"/>
+        <w:numPr>
+          <w:ilvl w:val="1"/>
+          <w:numId w:val="25"/>
+        </w:numPr>
+      </w:pPr>
+      <w:r>
+        <w:t>sets: Effort variable</w:t>
+      </w:r>
+      <w:r>
+        <w:t>, sum of effort across several trips</w:t>
+      </w:r>
+    </w:p>
+    <w:p>
+      <w:pPr>
+        <w:pStyle w:val="ListParagraph"/>
+        <w:numPr>
+          <w:ilvl w:val="1"/>
+          <w:numId w:val="25"/>
+        </w:numPr>
+      </w:pPr>
+      <w:r>
+        <w:t>tips: number of trips in the record (row).</w:t>
+      </w:r>
+    </w:p>
+    <w:p>
+      <w:pPr>
+        <w:pStyle w:val="ListParagraph"/>
+        <w:numPr>
+          <w:ilvl w:val="1"/>
+          <w:numId w:val="25"/>
+        </w:numPr>
+      </w:pPr>
+      <w:r>
+        <w:t xml:space="preserve">Each row </w:t>
+      </w:r>
+      <w:r>
+        <w:t xml:space="preserve">is an aggregation of multiple fishing trips, as indicated by the </w:t>
+      </w:r>
+      <w:proofErr w:type="gramStart"/>
+      <w:r>
+        <w:t>trips</w:t>
+      </w:r>
+      <w:proofErr w:type="gramEnd"/>
+      <w:r>
+        <w:t xml:space="preserve"> column. </w:t>
+      </w:r>
+    </w:p>
+    <w:p>
+      <w:pPr>
+        <w:pStyle w:val="ListParagraph"/>
+        <w:numPr>
+          <w:ilvl w:val="1"/>
+          <w:numId w:val="25"/>
+        </w:numPr>
+      </w:pPr>
+      <w:r>
+        <w:t>EW and season are optional design stratification and/or grouping variables.</w:t>
+      </w:r>
+    </w:p>
+    <w:p>
+      <w:pPr>
+        <w:spacing w:after="60" w:line="276" w:lineRule="auto"/>
+        <w:rPr>
+          <w:b/>
+          <w:bCs/>
+        </w:rPr>
+      </w:pPr>
+    </w:p>
+    <w:p>
+      <w:pPr>
+        <w:pStyle w:val="Heading3"/>
+      </w:pPr>
+      <w:r>
+        <w:t>Complex observer and logbook datasets from LLSIM</w:t>
+      </w:r>
+      <w:r>
+        <w:t xml:space="preserve"> </w:t>
+      </w:r>
+    </w:p>
+    <w:p>
+      <w:pPr>
+        <w:pStyle w:val="ListParagraph"/>
+        <w:numPr>
+          <w:ilvl w:val="0"/>
+          <w:numId w:val="26"/>
+        </w:numPr>
+      </w:pPr>
+      <w:r>
+        <w:t>D</w:t>
+      </w:r>
+      <w:r>
+        <w:t>ownloaded as observerdata_LLSIM.csv and logbookdata_LLSIM.csv).</w:t>
+      </w:r>
+    </w:p>
+    <w:p>
+      <w:pPr>
+        <w:pStyle w:val="ListParagraph"/>
+        <w:numPr>
+          <w:ilvl w:val="0"/>
+          <w:numId w:val="26"/>
+        </w:numPr>
+      </w:pPr>
+      <w:r>
+        <w:t>Please see the following reference documents for usage details:</w:t>
+      </w:r>
+    </w:p>
+    <w:p>
+      <w:pPr>
+        <w:pStyle w:val="ListParagraph"/>
+        <w:numPr>
+          <w:ilvl w:val="1"/>
+          <w:numId w:val="26"/>
+        </w:numPr>
+        <w:pBdr>
+          <w:top w:val="nil"/>
+          <w:left w:val="nil"/>
+          <w:bottom w:val="nil"/>
+          <w:right w:val="nil"/>
+          <w:between w:val="nil"/>
+        </w:pBdr>
+        <w:rPr>
+          <w:color w:val="333333"/>
+          <w:sz w:val="20"/>
+          <w:szCs w:val="20"/>
+        </w:rPr>
+      </w:pPr>
+      <w:r>
+        <w:rPr>
+          <w:color w:val="333333"/>
+          <w:sz w:val="20"/>
+          <w:szCs w:val="20"/>
+        </w:rPr>
+        <w:t xml:space="preserve">Babcock, E.A., W.J. Harford, T. </w:t>
+      </w:r>
+      <w:proofErr w:type="spellStart"/>
+      <w:r>
+        <w:rPr>
+          <w:color w:val="333333"/>
+          <w:sz w:val="20"/>
+          <w:szCs w:val="20"/>
+        </w:rPr>
+        <w:t>Gedamke</w:t>
+      </w:r>
+      <w:proofErr w:type="spellEnd"/>
+      <w:r>
+        <w:rPr>
+          <w:color w:val="333333"/>
+          <w:sz w:val="20"/>
+          <w:szCs w:val="20"/>
+        </w:rPr>
+        <w:t>, D. Soto, and C. P. Goodyear. 2022. Efficacy of a bycatch estimation tool. Collect. Vol. Sci. Pap. ICCAT, 79(5): 304-339.</w:t>
+      </w:r>
+    </w:p>
+    <w:p>
+      <w:pPr>
+        <w:pStyle w:val="ListParagraph"/>
+        <w:numPr>
+          <w:ilvl w:val="1"/>
+          <w:numId w:val="26"/>
+        </w:numPr>
+        <w:pBdr>
+          <w:top w:val="nil"/>
+          <w:left w:val="nil"/>
+          <w:bottom w:val="nil"/>
+          <w:right w:val="nil"/>
+          <w:between w:val="nil"/>
+        </w:pBdr>
+      </w:pPr>
+      <w:r>
+        <w:rPr>
+          <w:color w:val="333333"/>
+          <w:sz w:val="20"/>
+          <w:szCs w:val="20"/>
+        </w:rPr>
+        <w:t>Babcock, E.A. and C. P. Goodyear. 2021. Testing a bycatch estimation tool using simulated blue marlin longline data. ICCAT Collect. Vol. Sci. Pap. ICCAT, 78(5): 179-189.</w:t>
+      </w:r>
+      <w:r>
+        <w:t xml:space="preserve"> </w:t>
+      </w:r>
+    </w:p>
+    <w:p>
+      <w:pPr>
+        <w:pBdr>
+          <w:top w:val="nil"/>
+          <w:left w:val="nil"/>
+          <w:bottom w:val="nil"/>
+          <w:right w:val="nil"/>
+          <w:between w:val="nil"/>
+        </w:pBdr>
+      </w:pPr>
+    </w:p>
+    <w:p>
+      <w:pPr>
+        <w:rPr>
+          <w:b/>
+          <w:bCs/>
+          <w:color w:val="1F3864"/>
+          <w:sz w:val="34"/>
+          <w:szCs w:val="34"/>
+        </w:rPr>
+      </w:pPr>
       <w:r>
         <w:br w:type="page"/>
       </w:r>
@@ -5607,7 +6376,7 @@
       <w:pPr>
         <w:pStyle w:val="Heading1"/>
       </w:pPr>
-      <w:bookmarkStart w:id="13" w:name="_Toc244093396"/>
+      <w:bookmarkStart w:id="12" w:name="_Toc244181925"/>
       <w:r>
         <w:lastRenderedPageBreak/>
         <w:t xml:space="preserve">3. </w:t>
@@ -5618,7 +6387,7 @@
       <w:r>
         <w:t xml:space="preserve"> 1: Bycatch setup</w:t>
       </w:r>
-      <w:bookmarkEnd w:id="13"/>
+      <w:bookmarkEnd w:id="12"/>
     </w:p>
     <w:p>
       <w:pPr>
@@ -5681,12 +6450,20 @@
     </w:p>
     <w:p>
       <w:pPr>
+        <w:pStyle w:val="ListParagraph"/>
+        <w:spacing w:after="80" w:line="276" w:lineRule="auto"/>
+        <w:ind w:left="720"/>
+      </w:pPr>
+    </w:p>
+    <w:p>
+      <w:pPr>
+        <w:pStyle w:val="ListParagraph"/>
         <w:pBdr>
           <w:left w:val="single" w:sz="18" w:space="8" w:color="2E7D32"/>
         </w:pBdr>
         <w:shd w:val="clear" w:color="auto" w:fill="E8F5E9"/>
         <w:spacing w:before="120" w:after="160" w:line="276" w:lineRule="auto"/>
-        <w:ind w:left="200" w:right="100"/>
+        <w:ind w:left="360" w:right="100"/>
       </w:pPr>
       <w:r>
         <w:rPr>
@@ -5702,13 +6479,18 @@
     </w:p>
     <w:p>
       <w:pPr>
+        <w:spacing w:after="80" w:line="276" w:lineRule="auto"/>
+      </w:pPr>
+    </w:p>
+    <w:p>
+      <w:pPr>
         <w:pStyle w:val="Heading2"/>
       </w:pPr>
-      <w:bookmarkStart w:id="14" w:name="_Toc244093397"/>
+      <w:bookmarkStart w:id="13" w:name="_Toc244181926"/>
       <w:r>
         <w:t>3.1 Part 1: Gather observer data</w:t>
       </w:r>
-      <w:bookmarkEnd w:id="14"/>
+      <w:bookmarkEnd w:id="13"/>
     </w:p>
     <w:p>
       <w:pPr>
@@ -5881,10 +6663,16 @@
       <w:pPr>
         <w:spacing w:after="80" w:line="276" w:lineRule="auto"/>
       </w:pPr>
+    </w:p>
+    <w:p>
+      <w:pPr>
+        <w:spacing w:after="80" w:line="276" w:lineRule="auto"/>
+      </w:pPr>
       <w:r>
         <w:rPr>
           <w:noProof/>
         </w:rPr>
+        <w:lastRenderedPageBreak/>
         <w:drawing>
           <wp:inline distT="0" distB="0" distL="0" distR="0" wp14:anchorId="0A485B94" wp14:editId="4FCD680B">
             <wp:extent cx="5943600" cy="2713355"/>
@@ -5901,7 +6689,7 @@
                     <pic:cNvPicPr/>
                   </pic:nvPicPr>
                   <pic:blipFill>
-                    <a:blip r:embed="rId15"/>
+                    <a:blip r:embed="rId11"/>
                     <a:stretch>
                       <a:fillRect/>
                     </a:stretch>
@@ -5949,7 +6737,6 @@
         <w:rPr>
           <w:noProof/>
         </w:rPr>
-        <w:lastRenderedPageBreak/>
         <w:drawing>
           <wp:inline distT="0" distB="0" distL="0" distR="0" wp14:anchorId="028AC938" wp14:editId="724DC24F">
             <wp:extent cx="5943600" cy="2254885"/>
@@ -5966,7 +6753,7 @@
                     <pic:cNvPicPr/>
                   </pic:nvPicPr>
                   <pic:blipFill>
-                    <a:blip r:embed="rId16"/>
+                    <a:blip r:embed="rId12"/>
                     <a:stretch>
                       <a:fillRect/>
                     </a:stretch>
@@ -6540,6 +7327,7 @@
                 <w:sz w:val="20"/>
                 <w:szCs w:val="20"/>
               </w:rPr>
+              <w:lastRenderedPageBreak/>
               <w:t>Catch type</w:t>
             </w:r>
           </w:p>
@@ -6703,19 +7491,6 @@
       <w:pPr>
         <w:spacing w:after="120"/>
       </w:pPr>
-    </w:p>
-    <w:p>
-      <w:pPr>
-        <w:spacing w:before="80" w:after="160" w:line="276" w:lineRule="auto"/>
-      </w:pPr>
-      <w:r>
-        <w:rPr>
-          <w:i/>
-          <w:iCs/>
-          <w:highlight w:val="yellow"/>
-        </w:rPr>
-        <w:t>[ADD CONTEXT: How to choose between the catch type options (for example, Discards versus Dead discards) and the units of catch.]</w:t>
-      </w:r>
     </w:p>
     <w:p>
       <w:pPr>
@@ -6755,16 +7530,19 @@
       <w:r>
         <w:t>When every mandatory field is complete, the Part 1 badge turns into a green check mark.</w:t>
       </w:r>
+      <w:r>
+        <w:br/>
+      </w:r>
     </w:p>
     <w:p>
       <w:pPr>
         <w:pStyle w:val="Heading2"/>
       </w:pPr>
-      <w:bookmarkStart w:id="15" w:name="_Toc244093398"/>
+      <w:bookmarkStart w:id="14" w:name="_Toc244181927"/>
       <w:r>
         <w:t>3.2 Part 2: Gather logbook data</w:t>
       </w:r>
-      <w:bookmarkEnd w:id="15"/>
+      <w:bookmarkEnd w:id="14"/>
     </w:p>
     <w:p>
       <w:pPr>
@@ -6853,7 +7631,6 @@
         <w:spacing w:after="80" w:line="276" w:lineRule="auto"/>
       </w:pPr>
       <w:r>
-        <w:lastRenderedPageBreak/>
         <w:t xml:space="preserve">Check or edit the </w:t>
       </w:r>
       <w:r>
@@ -6912,7 +7689,7 @@
                     <pic:cNvPicPr/>
                   </pic:nvPicPr>
                   <pic:blipFill>
-                    <a:blip r:embed="rId17"/>
+                    <a:blip r:embed="rId13"/>
                     <a:stretch>
                       <a:fillRect/>
                     </a:stretch>
@@ -6982,7 +7759,7 @@
                     <pic:cNvPicPr/>
                   </pic:nvPicPr>
                   <pic:blipFill>
-                    <a:blip r:embed="rId18"/>
+                    <a:blip r:embed="rId14"/>
                     <a:stretch>
                       <a:fillRect/>
                     </a:stretch>
@@ -7032,18 +7809,22 @@
         <w:spacing w:after="120" w:line="276" w:lineRule="auto"/>
       </w:pPr>
       <w:r>
+        <w:lastRenderedPageBreak/>
         <w:t>The same reserved-name rule applies here: if your logbook file has a column called Year, you must select it as the year column (see Section 2.3). The Part 2 badge turns green when the form is complete.</w:t>
       </w:r>
+      <w:r>
+        <w:br/>
+      </w:r>
     </w:p>
     <w:p>
       <w:pPr>
         <w:pStyle w:val="Heading2"/>
       </w:pPr>
-      <w:bookmarkStart w:id="16" w:name="_Toc244093399"/>
+      <w:bookmarkStart w:id="15" w:name="_Toc244181928"/>
       <w:r>
         <w:t>3.3 Part 3: Align data &amp; activate</w:t>
       </w:r>
-      <w:bookmarkEnd w:id="16"/>
+      <w:bookmarkEnd w:id="15"/>
     </w:p>
     <w:p>
       <w:pPr>
@@ -7082,7 +7863,7 @@
                     <pic:cNvPicPr/>
                   </pic:nvPicPr>
                   <pic:blipFill>
-                    <a:blip r:embed="rId19"/>
+                    <a:blip r:embed="rId15"/>
                     <a:stretch>
                       <a:fillRect/>
                     </a:stretch>
@@ -7111,7 +7892,6 @@
         </w:rPr>
       </w:pPr>
       <w:r>
-        <w:lastRenderedPageBreak/>
         <w:t>Figure</w:t>
       </w:r>
       <w:r>
@@ -7125,6 +7905,9 @@
       </w:r>
       <w:r>
         <w:t>that is displayed when Parts 1 and 2 are incomplete.</w:t>
+      </w:r>
+      <w:r>
+        <w:br/>
       </w:r>
     </w:p>
     <w:p>
@@ -7678,7 +8461,23 @@
                 <w:sz w:val="20"/>
                 <w:szCs w:val="20"/>
               </w:rPr>
-              <w:t xml:space="preserve"> if each logbook row is also one trip or set; otherwise </w:t>
+              <w:t xml:space="preserve"> if each logbook row is also one trip or </w:t>
+            </w:r>
+            <w:proofErr w:type="gramStart"/>
+            <w:r>
+              <w:rPr>
+                <w:sz w:val="20"/>
+                <w:szCs w:val="20"/>
+              </w:rPr>
+              <w:t>set</w:t>
+            </w:r>
+            <w:proofErr w:type="gramEnd"/>
+            <w:r>
+              <w:rPr>
+                <w:sz w:val="20"/>
+                <w:szCs w:val="20"/>
+              </w:rPr>
+              <w:t xml:space="preserve">; otherwise </w:t>
             </w:r>
             <w:r>
               <w:rPr>
@@ -7804,6 +8603,11 @@
       <w:r>
         <w:t>For example, if the observer sample unit is a trip but the logbook data are summarised by year and area, the logbook data need a column giving the number of trips for each year and area. Select that column as the counts of sample units.</w:t>
       </w:r>
+    </w:p>
+    <w:p>
+      <w:pPr>
+        <w:spacing w:after="120" w:line="276" w:lineRule="auto"/>
+      </w:pPr>
     </w:p>
     <w:p>
       <w:pPr>
@@ -7820,6 +8624,7 @@
           <w:bCs/>
           <w:color w:val="2E7D32"/>
         </w:rPr>
+        <w:lastRenderedPageBreak/>
         <w:t xml:space="preserve">Tip: </w:t>
       </w:r>
       <w:r>
@@ -7852,7 +8657,7 @@
         <mc:AlternateContent>
           <mc:Choice Requires="wpg">
             <w:drawing>
-              <wp:anchor distT="0" distB="0" distL="114300" distR="114300" simplePos="0" relativeHeight="251670528" behindDoc="0" locked="0" layoutInCell="1" allowOverlap="1" wp14:anchorId="6E8BF001" wp14:editId="4CF42343">
+              <wp:anchor distT="0" distB="0" distL="114300" distR="114300" simplePos="0" relativeHeight="251670528" behindDoc="0" locked="0" layoutInCell="1" allowOverlap="1" wp14:anchorId="6E8BF001" wp14:editId="353FC42C">
                 <wp:simplePos x="0" y="0"/>
                 <wp:positionH relativeFrom="column">
                   <wp:posOffset>66502</wp:posOffset>
@@ -7885,7 +8690,7 @@
                           </pic:cNvPicPr>
                         </pic:nvPicPr>
                         <pic:blipFill>
-                          <a:blip r:embed="rId20" cstate="print">
+                          <a:blip r:embed="rId16" cstate="print">
                             <a:extLst>
                               <a:ext uri="{28A0092B-C50C-407E-A947-70E740481C1C}">
                                 <a14:useLocalDpi xmlns:a14="http://schemas.microsoft.com/office/drawing/2010/main" val="0"/>
@@ -7914,7 +8719,7 @@
                           </pic:cNvPicPr>
                         </pic:nvPicPr>
                         <pic:blipFill>
-                          <a:blip r:embed="rId21" cstate="print">
+                          <a:blip r:embed="rId17" cstate="print">
                             <a:extLst>
                               <a:ext uri="{28A0092B-C50C-407E-A947-70E740481C1C}">
                                 <a14:useLocalDpi xmlns:a14="http://schemas.microsoft.com/office/drawing/2010/main" val="0"/>
@@ -7943,7 +8748,7 @@
                           </pic:cNvPicPr>
                         </pic:nvPicPr>
                         <pic:blipFill>
-                          <a:blip r:embed="rId22" cstate="print">
+                          <a:blip r:embed="rId18" cstate="print">
                             <a:extLst>
                               <a:ext uri="{28A0092B-C50C-407E-A947-70E740481C1C}">
                                 <a14:useLocalDpi xmlns:a14="http://schemas.microsoft.com/office/drawing/2010/main" val="0"/>
@@ -7972,7 +8777,7 @@
                           </pic:cNvPicPr>
                         </pic:nvPicPr>
                         <pic:blipFill>
-                          <a:blip r:embed="rId23" cstate="print">
+                          <a:blip r:embed="rId19" cstate="print">
                             <a:extLst>
                               <a:ext uri="{28A0092B-C50C-407E-A947-70E740481C1C}">
                                 <a14:useLocalDpi xmlns:a14="http://schemas.microsoft.com/office/drawing/2010/main" val="0"/>
@@ -8158,16 +8963,16 @@
                   <o:lock v:ext="edit" aspectratio="t"/>
                 </v:shapetype>
                 <v:shape id="Picture 1" o:spid="_x0000_s1027" type="#_x0000_t75" style="position:absolute;left:249;top:29759;width:57518;height:4769;visibility:visible;mso-wrap-style:square" o:gfxdata="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">
-                  <v:imagedata r:id="rId24" o:title=""/>
+                  <v:imagedata r:id="rId20" o:title=""/>
                 </v:shape>
                 <v:shape id="Picture 2" o:spid="_x0000_s1028" type="#_x0000_t75" style="position:absolute;left:249;top:11471;width:57518;height:4775;visibility:visible;mso-wrap-style:square" o:gfxdata="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">
-                  <v:imagedata r:id="rId25" o:title=""/>
+                  <v:imagedata r:id="rId21" o:title=""/>
                 </v:shape>
                 <v:shape id="Picture 3" o:spid="_x0000_s1029" type="#_x0000_t75" style="position:absolute;left:249;top:20698;width:57518;height:4769;visibility:visible;mso-wrap-style:square" o:gfxdata="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">
-                  <v:imagedata r:id="rId26" o:title=""/>
+                  <v:imagedata r:id="rId22" o:title=""/>
                 </v:shape>
                 <v:shape id="Picture 4" o:spid="_x0000_s1030" type="#_x0000_t75" style="position:absolute;left:415;top:2909;width:57271;height:4750;visibility:visible;mso-wrap-style:square" o:gfxdata="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">
-                  <v:imagedata r:id="rId27" o:title=""/>
+                  <v:imagedata r:id="rId23" o:title=""/>
                 </v:shape>
                 <v:shapetype id="_x0000_t202" coordsize="21600,21600" o:spt="202" path="m,l,21600r21600,l21600,xe">
                   <v:stroke joinstyle="miter"/>
@@ -8343,89 +9148,9 @@
         <w:ind w:left="200" w:right="100"/>
       </w:pPr>
     </w:p>
-    <w:p>
-      <w:pPr>
-        <w:pBdr>
-          <w:left w:val="single" w:sz="18" w:space="8" w:color="2E7D32"/>
-        </w:pBdr>
-        <w:shd w:val="clear" w:color="auto" w:fill="E8F5E9"/>
-        <w:spacing w:before="120" w:after="160" w:line="276" w:lineRule="auto"/>
-        <w:ind w:left="200" w:right="100"/>
-      </w:pPr>
-    </w:p>
-    <w:p>
-      <w:pPr>
-        <w:pBdr>
-          <w:left w:val="single" w:sz="18" w:space="8" w:color="2E7D32"/>
-        </w:pBdr>
-        <w:shd w:val="clear" w:color="auto" w:fill="E8F5E9"/>
-        <w:spacing w:before="120" w:after="160" w:line="276" w:lineRule="auto"/>
-        <w:ind w:left="200" w:right="100"/>
-      </w:pPr>
-    </w:p>
-    <w:p>
-      <w:pPr>
-        <w:pBdr>
-          <w:left w:val="single" w:sz="18" w:space="8" w:color="2E7D32"/>
-        </w:pBdr>
-        <w:shd w:val="clear" w:color="auto" w:fill="E8F5E9"/>
-        <w:spacing w:before="120" w:after="160" w:line="276" w:lineRule="auto"/>
-        <w:ind w:left="200" w:right="100"/>
-      </w:pPr>
-    </w:p>
-    <w:p>
-      <w:pPr>
-        <w:pBdr>
-          <w:left w:val="single" w:sz="18" w:space="8" w:color="2E7D32"/>
-        </w:pBdr>
-        <w:shd w:val="clear" w:color="auto" w:fill="E8F5E9"/>
-        <w:spacing w:before="120" w:after="160" w:line="276" w:lineRule="auto"/>
-        <w:ind w:left="200" w:right="100"/>
-      </w:pPr>
-    </w:p>
-    <w:p>
-      <w:pPr>
-        <w:pBdr>
-          <w:left w:val="single" w:sz="18" w:space="8" w:color="2E7D32"/>
-        </w:pBdr>
-        <w:shd w:val="clear" w:color="auto" w:fill="E8F5E9"/>
-        <w:spacing w:before="120" w:after="160" w:line="276" w:lineRule="auto"/>
-        <w:ind w:left="200" w:right="100"/>
-      </w:pPr>
-    </w:p>
-    <w:p>
-      <w:pPr>
-        <w:pBdr>
-          <w:left w:val="single" w:sz="18" w:space="8" w:color="2E7D32"/>
-        </w:pBdr>
-        <w:shd w:val="clear" w:color="auto" w:fill="E8F5E9"/>
-        <w:spacing w:before="120" w:after="160" w:line="276" w:lineRule="auto"/>
-        <w:ind w:left="200" w:right="100"/>
-      </w:pPr>
-    </w:p>
-    <w:p>
-      <w:pPr>
-        <w:pBdr>
-          <w:left w:val="single" w:sz="18" w:space="8" w:color="2E7D32"/>
-        </w:pBdr>
-        <w:shd w:val="clear" w:color="auto" w:fill="E8F5E9"/>
-        <w:spacing w:before="120" w:after="160" w:line="276" w:lineRule="auto"/>
-        <w:ind w:left="200" w:right="100"/>
-      </w:pPr>
-    </w:p>
-    <w:p>
-      <w:pPr>
-        <w:pBdr>
-          <w:left w:val="single" w:sz="18" w:space="8" w:color="2E7D32"/>
-        </w:pBdr>
-        <w:shd w:val="clear" w:color="auto" w:fill="E8F5E9"/>
-        <w:spacing w:before="120" w:after="160" w:line="276" w:lineRule="auto"/>
-        <w:ind w:left="200" w:right="100"/>
-      </w:pPr>
-    </w:p>
     <w:tbl>
       <w:tblPr>
-        <w:tblpPr w:leftFromText="180" w:rightFromText="180" w:vertAnchor="page" w:horzAnchor="margin" w:tblpX="553" w:tblpY="1179"/>
+        <w:tblpPr w:leftFromText="180" w:rightFromText="180" w:vertAnchor="page" w:horzAnchor="margin" w:tblpXSpec="center" w:tblpY="8026"/>
         <w:tblW w:w="8642" w:type="dxa"/>
         <w:tblBorders>
           <w:top w:val="single" w:sz="4" w:space="0" w:color="auto"/>
@@ -9070,6 +9795,16 @@
     </w:tbl>
     <w:p>
       <w:pPr>
+        <w:pBdr>
+          <w:left w:val="single" w:sz="18" w:space="8" w:color="2E7D32"/>
+        </w:pBdr>
+        <w:shd w:val="clear" w:color="auto" w:fill="E8F5E9"/>
+        <w:spacing w:before="120" w:after="160" w:line="276" w:lineRule="auto"/>
+        <w:ind w:left="200" w:right="100"/>
+      </w:pPr>
+    </w:p>
+    <w:p>
+      <w:pPr>
         <w:spacing w:before="80" w:after="160" w:line="276" w:lineRule="auto"/>
         <w:rPr>
           <w:i/>
@@ -9083,6 +9818,7 @@
           <w:iCs/>
           <w:noProof/>
         </w:rPr>
+        <w:lastRenderedPageBreak/>
         <w:drawing>
           <wp:inline distT="0" distB="0" distL="0" distR="0" wp14:anchorId="2D3DD502" wp14:editId="51E46357">
             <wp:extent cx="5943600" cy="2189480"/>
@@ -9099,7 +9835,7 @@
                     <pic:cNvPicPr/>
                   </pic:nvPicPr>
                   <pic:blipFill>
-                    <a:blip r:embed="rId28"/>
+                    <a:blip r:embed="rId24"/>
                     <a:stretch>
                       <a:fillRect/>
                     </a:stretch>
@@ -9142,6 +9878,11 @@
     </w:p>
     <w:p>
       <w:pPr>
+        <w:spacing w:before="80" w:after="160" w:line="276" w:lineRule="auto"/>
+      </w:pPr>
+    </w:p>
+    <w:p>
+      <w:pPr>
         <w:pBdr>
           <w:left w:val="single" w:sz="18" w:space="8" w:color="1565C0"/>
         </w:pBdr>
@@ -9296,7 +10037,6 @@
         <w:spacing w:after="80" w:line="276" w:lineRule="auto"/>
       </w:pPr>
       <w:r>
-        <w:lastRenderedPageBreak/>
         <w:t xml:space="preserve">Repeat for each additional factor. Click </w:t>
       </w:r>
       <w:r>
@@ -9312,9 +10052,12 @@
     </w:p>
     <w:p>
       <w:pPr>
-        <w:pStyle w:val="ListParagraph"/>
         <w:spacing w:after="80" w:line="276" w:lineRule="auto"/>
-        <w:ind w:left="720"/>
+      </w:pPr>
+    </w:p>
+    <w:p>
+      <w:pPr>
+        <w:spacing w:after="80" w:line="276" w:lineRule="auto"/>
       </w:pPr>
     </w:p>
     <w:p>
@@ -9325,6 +10068,7 @@
         <w:rPr>
           <w:noProof/>
         </w:rPr>
+        <w:lastRenderedPageBreak/>
         <w:drawing>
           <wp:inline distT="0" distB="0" distL="0" distR="0" wp14:anchorId="739FC82C" wp14:editId="2D16C289">
             <wp:extent cx="5943600" cy="1939290"/>
@@ -9341,7 +10085,7 @@
                     <pic:cNvPicPr/>
                   </pic:nvPicPr>
                   <pic:blipFill>
-                    <a:blip r:embed="rId29"/>
+                    <a:blip r:embed="rId25"/>
                     <a:stretch>
                       <a:fillRect/>
                     </a:stretch>
@@ -9431,7 +10175,15 @@
         <w:ind w:right="100"/>
       </w:pPr>
       <w:r>
-        <w:t>If they differ, the app renames the logbook column to match the observer name. Renaming can occasionally cause processing errors, so use it with care.</w:t>
+        <w:t xml:space="preserve">If they differ, the app renames the logbook column to match the </w:t>
+      </w:r>
+      <w:proofErr w:type="gramStart"/>
+      <w:r>
+        <w:t>observer</w:t>
+      </w:r>
+      <w:proofErr w:type="gramEnd"/>
+      <w:r>
+        <w:t xml:space="preserve"> name. Renaming can occasionally cause processing errors, so use it with care.</w:t>
       </w:r>
     </w:p>
     <w:p>
@@ -9632,6 +10384,9 @@
       </w:r>
       <w:r>
         <w:t xml:space="preserve"> of the run (maximum 50 characters).</w:t>
+      </w:r>
+      <w:r>
+        <w:br/>
       </w:r>
     </w:p>
     <w:p>
@@ -9760,7 +10515,7 @@
                     <pic:cNvPicPr/>
                   </pic:nvPicPr>
                   <pic:blipFill>
-                    <a:blip r:embed="rId30"/>
+                    <a:blip r:embed="rId26"/>
                     <a:stretch>
                       <a:fillRect/>
                     </a:stretch>
@@ -9794,6 +10549,11 @@
     </w:p>
     <w:p>
       <w:pPr>
+        <w:spacing w:after="80" w:line="276" w:lineRule="auto"/>
+      </w:pPr>
+    </w:p>
+    <w:p>
+      <w:pPr>
         <w:spacing w:before="80" w:after="160" w:line="276" w:lineRule="auto"/>
       </w:pPr>
     </w:p>
@@ -9988,6 +10748,11 @@
       <w:r>
         <w:t>Once setup is active, Parts 1 and 2 are locked and show a green “complete” banner, and the badges for Part 3, Data checks and Download turn green.</w:t>
       </w:r>
+    </w:p>
+    <w:p>
+      <w:pPr>
+        <w:spacing w:after="80" w:line="276" w:lineRule="auto"/>
+      </w:pPr>
     </w:p>
     <w:p>
       <w:pPr>
@@ -10029,7 +10794,7 @@
                     <pic:cNvPicPr/>
                   </pic:nvPicPr>
                   <pic:blipFill>
-                    <a:blip r:embed="rId31">
+                    <a:blip r:embed="rId27">
                       <a:extLst>
                         <a:ext uri="{28A0092B-C50C-407E-A947-70E740481C1C}">
                           <a14:useLocalDpi xmlns:a14="http://schemas.microsoft.com/office/drawing/2010/main" val="0"/>
@@ -10074,7 +10839,15 @@
         <w:spacing w:after="120" w:line="276" w:lineRule="auto"/>
       </w:pPr>
       <w:r>
-        <w:t>Figure 13. Confirmation screen when deactivating Bycatch setup in order to modify data inputs.</w:t>
+        <w:t xml:space="preserve">Figure 13. Confirmation screen when deactivating Bycatch setup </w:t>
+      </w:r>
+      <w:proofErr w:type="gramStart"/>
+      <w:r>
+        <w:t>in order to</w:t>
+      </w:r>
+      <w:proofErr w:type="gramEnd"/>
+      <w:r>
+        <w:t xml:space="preserve"> modify data inputs.</w:t>
       </w:r>
     </w:p>
     <w:p>
@@ -10121,7 +10894,7 @@
       <w:pPr>
         <w:pStyle w:val="Heading1"/>
       </w:pPr>
-      <w:bookmarkStart w:id="17" w:name="_Toc244093400"/>
+      <w:bookmarkStart w:id="16" w:name="_Toc244181929"/>
       <w:r>
         <w:lastRenderedPageBreak/>
         <w:t xml:space="preserve">4. </w:t>
@@ -10132,14 +10905,22 @@
       <w:r>
         <w:t xml:space="preserve"> 2: Data checks</w:t>
       </w:r>
-      <w:bookmarkEnd w:id="17"/>
+      <w:bookmarkEnd w:id="16"/>
     </w:p>
     <w:p>
       <w:pPr>
         <w:spacing w:after="120" w:line="276" w:lineRule="auto"/>
       </w:pPr>
       <w:r>
-        <w:t>Complete Bycatch setup before using this module. Data checks provides:</w:t>
+        <w:t xml:space="preserve">Complete Bycatch setup before using this module. Data checks </w:t>
+      </w:r>
+      <w:proofErr w:type="gramStart"/>
+      <w:r>
+        <w:t>provides</w:t>
+      </w:r>
+      <w:proofErr w:type="gramEnd"/>
+      <w:r>
+        <w:t>:</w:t>
       </w:r>
     </w:p>
     <w:p>
@@ -10213,11 +10994,11 @@
       <w:r>
         <w:t xml:space="preserve"> </w:t>
       </w:r>
-      <w:bookmarkStart w:id="18" w:name="_Toc244093401"/>
+      <w:bookmarkStart w:id="17" w:name="_Toc244181930"/>
       <w:r>
         <w:t>Diagnostics &amp; summary</w:t>
       </w:r>
-      <w:bookmarkEnd w:id="18"/>
+      <w:bookmarkEnd w:id="17"/>
     </w:p>
     <w:p>
       <w:pPr>
@@ -10255,6 +11036,9 @@
       </w:pPr>
       <w:r>
         <w:t>The report includes warning messages about missing data or NAs; figures and tables showing sample sizes and the presence or absence of the bycatch species across levels of exploratory variables; observer coverage levels; raw trends in catch per unit effort (CPUE); and a summary of the available data.</w:t>
+      </w:r>
+      <w:r>
+        <w:br/>
       </w:r>
     </w:p>
     <w:p>
@@ -10287,7 +11071,7 @@
       <w:pPr>
         <w:pStyle w:val="Heading1"/>
       </w:pPr>
-      <w:bookmarkStart w:id="19" w:name="_Toc244093402"/>
+      <w:bookmarkStart w:id="18" w:name="_Toc244181931"/>
       <w:r>
         <w:lastRenderedPageBreak/>
         <w:t xml:space="preserve">5. </w:t>
@@ -10298,7 +11082,7 @@
       <w:r>
         <w:t xml:space="preserve"> 3: Design-based estimators</w:t>
       </w:r>
-      <w:bookmarkEnd w:id="19"/>
+      <w:bookmarkEnd w:id="18"/>
     </w:p>
     <w:p>
       <w:pPr>
@@ -10377,11 +11161,11 @@
       <w:pPr>
         <w:pStyle w:val="Heading2"/>
       </w:pPr>
-      <w:bookmarkStart w:id="20" w:name="_Toc244093403"/>
+      <w:bookmarkStart w:id="19" w:name="_Toc244181932"/>
       <w:r>
         <w:t>5.1 Specifications</w:t>
       </w:r>
-      <w:bookmarkEnd w:id="20"/>
+      <w:bookmarkEnd w:id="19"/>
     </w:p>
     <w:p>
       <w:pPr>
@@ -10453,19 +11237,15 @@
         <w:spacing w:after="80" w:line="276" w:lineRule="auto"/>
       </w:pPr>
       <w:r>
-        <w:t xml:space="preserve">This is also the step where pooling is specified, if necessary. </w:t>
-      </w:r>
-      <w:r>
-        <w:t>To deal with strata that have no observations or few observations, the user may request pooling</w:t>
-      </w:r>
-      <w:r>
-        <w:t xml:space="preserve"> for any selected stratification variable. </w:t>
-      </w:r>
-      <w:r>
-        <w:t>If pooling, the total bycatch is estimated for the observer and logbook data specified by the pooling scheme for each stratum (i.e. combination of variables) and then allocated to the stratum according to the fraction of the logbook effort in the pooled data that is in the stratum of interest. Unpooled estimates are used for strata with sufficient data. Variances are also allocated to the stratum of interest based on the fraction of total effort.</w:t>
-      </w:r>
-      <w:r>
-        <w:t xml:space="preserve"> Select ‘none’ for each stratification variable to avoid pooling.</w:t>
+        <w:t xml:space="preserve">This is also the step where pooling is specified, if necessary. To deal with strata that have no observations or few observations, the user may request pooling for any selected stratification variable. If pooling, the total bycatch is estimated for the observer and logbook data specified by the pooling scheme for each stratum (i.e. combination of variables) and then allocated to the stratum according to the fraction of the logbook effort in the pooled data that is in the stratum of interest. </w:t>
+      </w:r>
+      <w:proofErr w:type="spellStart"/>
+      <w:r>
+        <w:t>Unpooled</w:t>
+      </w:r>
+      <w:proofErr w:type="spellEnd"/>
+      <w:r>
+        <w:t xml:space="preserve"> estimates are used for strata with sufficient data. Variances are also allocated to the stratum of interest based on the fraction of total effort. Select ‘none’ for each stratification variable to avoid pooling.</w:t>
       </w:r>
     </w:p>
     <w:p>
@@ -10476,64 +11256,26 @@
         <w:spacing w:after="80" w:line="276" w:lineRule="auto"/>
       </w:pPr>
       <w:r>
-        <w:t xml:space="preserve">If pooling is requested, the strata will be pooled in the order </w:t>
-      </w:r>
-      <w:r>
-        <w:t>the selected variables are displayed in this step</w:t>
-      </w:r>
-      <w:r>
-        <w:t>.</w:t>
-      </w:r>
-      <w:r>
-        <w:t xml:space="preserve"> You must also s</w:t>
-      </w:r>
-      <w:r>
-        <w:t xml:space="preserve">pecify </w:t>
-      </w:r>
-      <w:r>
-        <w:t xml:space="preserve">‘Minimum stratification unit’, which is </w:t>
-      </w:r>
-      <w:r>
-        <w:t>the minimum number of sample units needed to avoid pooling</w:t>
-      </w:r>
-      <w:r>
-        <w:t xml:space="preserve"> and must be a value greater than 0</w:t>
-      </w:r>
-      <w:r>
-        <w:t>.</w:t>
-      </w:r>
-      <w:r>
-        <w:t xml:space="preserve"> Pooling type must also be selected. </w:t>
-      </w:r>
-      <w:r>
-        <w:t>Pooling type 'pooledVar' applies an alternate variable to the selected stratification variable</w:t>
-      </w:r>
-      <w:r>
-        <w:t xml:space="preserve"> </w:t>
-      </w:r>
-      <w:r>
-        <w:t>(e.g. season rather than month)</w:t>
-      </w:r>
-      <w:r>
-        <w:t xml:space="preserve">. </w:t>
-      </w:r>
-      <w:r>
-        <w:t>If 'pooledVar' is used, the name of the alternate variable must be specified.</w:t>
-      </w:r>
-      <w:r>
-        <w:t xml:space="preserve"> </w:t>
-      </w:r>
-      <w:r>
-        <w:t xml:space="preserve">Pooling can also be carried out across ‘all’ values. </w:t>
-      </w:r>
-      <w:r>
-        <w:t>Pooling type 'adjacent' is only available for Year variable. If 'adjacent is used, ensure that Number of adjacent years is greater than 0</w:t>
-      </w:r>
-      <w:r>
-        <w:t xml:space="preserve">, </w:t>
-      </w:r>
-      <w:r>
-        <w:t>which specifies the number of adjacent years to include for the adjacent year method (e.g. 1 to include both the previous and following year).</w:t>
+        <w:t>If pooling is requested, the strata will be pooled in the order the selected variables are displayed in this step. You must also specify ‘Minimum stratification unit’, which is the minimum number of sample units needed to avoid pooling and must be a value greater than 0. Pooling type must also be selected. Pooling type '</w:t>
+      </w:r>
+      <w:proofErr w:type="spellStart"/>
+      <w:r>
+        <w:t>pooledVar</w:t>
+      </w:r>
+      <w:proofErr w:type="spellEnd"/>
+      <w:r>
+        <w:t>' applies an alternate variable to the selected stratification variable (e.g. season rather than month). If '</w:t>
+      </w:r>
+      <w:proofErr w:type="spellStart"/>
+      <w:r>
+        <w:t>pooledVar</w:t>
+      </w:r>
+      <w:proofErr w:type="spellEnd"/>
+      <w:r>
+        <w:t xml:space="preserve">' is used, the name of the alternate variable must be specified. </w:t>
+      </w:r>
+      <w:r>
+        <w:t>Pooling can also be carried out across ‘all’ values. Pooling type 'adjacent' is only available for Year variable. If 'adjacent is used, ensure that Number of adjacent years is greater than 0, which specifies the number of adjacent years to include for the adjacent year method (e.g. 1 to include both the previous and following year).</w:t>
       </w:r>
     </w:p>
     <w:p>
@@ -10580,21 +11322,7 @@
           <w:sz w:val="20"/>
           <w:szCs w:val="20"/>
         </w:rPr>
-        <w:t xml:space="preserve">Factor variables </w:t>
-      </w:r>
-      <w:r>
-        <w:rPr>
-          <w:sz w:val="20"/>
-          <w:szCs w:val="20"/>
-        </w:rPr>
-        <w:t xml:space="preserve">are </w:t>
-      </w:r>
-      <w:r>
-        <w:rPr>
-          <w:sz w:val="20"/>
-          <w:szCs w:val="20"/>
-        </w:rPr>
-        <w:t>used to summarise the estimates, for example total bycatch by statistical area in each year, or a summary by a variable other than Year. A grouping variable does not have to be a stratification variable. If it is not, the estimates are allocated across its levels in proportion to total logbook effort.</w:t>
+        <w:t>Factor variables are used to summarise the estimates, for example total bycatch by statistical area in each year, or a summary by a variable other than Year. A grouping variable does not have to be a stratification variable. If it is not, the estimates are allocated across its levels in proportion to total logbook effort.</w:t>
       </w:r>
     </w:p>
     <w:p>
@@ -10630,13 +11358,7 @@
         <w:pStyle w:val="Heading3"/>
       </w:pPr>
       <w:r>
-        <w:t xml:space="preserve">Step </w:t>
-      </w:r>
-      <w:r>
-        <w:t>4</w:t>
-      </w:r>
-      <w:r>
-        <w:t xml:space="preserve">: </w:t>
+        <w:t xml:space="preserve">Step 4: </w:t>
       </w:r>
       <w:r>
         <w:t>Enter a scenario name (maximum 100 characters).</w:t>
@@ -10707,11 +11429,11 @@
       <w:pPr>
         <w:pStyle w:val="Heading2"/>
       </w:pPr>
-      <w:bookmarkStart w:id="21" w:name="_Toc244093404"/>
+      <w:bookmarkStart w:id="20" w:name="_Toc244181933"/>
       <w:r>
         <w:t>5.2 Analysis results</w:t>
       </w:r>
-      <w:bookmarkEnd w:id="21"/>
+      <w:bookmarkEnd w:id="20"/>
     </w:p>
     <w:p>
       <w:pPr>
@@ -10797,13 +11519,7 @@
         <w:t xml:space="preserve">Tip: </w:t>
       </w:r>
       <w:r>
-        <w:t xml:space="preserve">The Data </w:t>
-      </w:r>
-      <w:r>
-        <w:t>analysis</w:t>
-      </w:r>
-      <w:r>
-        <w:t xml:space="preserve"> report is also included in the zip file you can download (Section 6).</w:t>
+        <w:t>The Data analysis report is also included in the zip file you can download (Section 6).</w:t>
       </w:r>
     </w:p>
     <w:p>
@@ -10815,11 +11531,11 @@
       <w:pPr>
         <w:pStyle w:val="Heading2"/>
       </w:pPr>
-      <w:bookmarkStart w:id="22" w:name="_Toc244093405"/>
+      <w:bookmarkStart w:id="21" w:name="_Toc244181934"/>
       <w:r>
         <w:t>5.3 Trying a different analysis</w:t>
       </w:r>
-      <w:bookmarkEnd w:id="22"/>
+      <w:bookmarkEnd w:id="21"/>
     </w:p>
     <w:p>
       <w:pPr>
@@ -10857,7 +11573,7 @@
       <w:pPr>
         <w:pStyle w:val="Heading1"/>
       </w:pPr>
-      <w:bookmarkStart w:id="23" w:name="_Toc244093406"/>
+      <w:bookmarkStart w:id="22" w:name="_Toc244181935"/>
       <w:r>
         <w:lastRenderedPageBreak/>
         <w:t xml:space="preserve">6. </w:t>
@@ -10868,7 +11584,7 @@
       <w:r>
         <w:t xml:space="preserve"> 4: Download outputs</w:t>
       </w:r>
-      <w:bookmarkEnd w:id="23"/>
+      <w:bookmarkEnd w:id="22"/>
     </w:p>
     <w:p>
       <w:pPr>
@@ -11116,43 +11832,132 @@
                 <w:sz w:val="20"/>
                 <w:szCs w:val="20"/>
               </w:rPr>
-              <w:t>The observer and logbook datasets (observer_dataset and logbook_dataset).</w:t>
-            </w:r>
-          </w:p>
-          <w:p>
-            <w:pPr>
-              <w:spacing w:after="40"/>
-            </w:pPr>
-            <w:r>
-              <w:rPr>
-                <w:sz w:val="20"/>
-                <w:szCs w:val="20"/>
-              </w:rPr>
-              <w:t>A summary of the inputs you chose in the app (bycatch_inputs).</w:t>
-            </w:r>
-          </w:p>
-          <w:p>
-            <w:pPr>
-              <w:spacing w:after="40"/>
-            </w:pPr>
-            <w:r>
-              <w:rPr>
-                <w:sz w:val="20"/>
-                <w:szCs w:val="20"/>
-              </w:rPr>
-              <w:t>DataSummary and StrataSummary files with data summaries by year and factor variables.</w:t>
-            </w:r>
-          </w:p>
-          <w:p>
-            <w:pPr>
-              <w:spacing w:after="40"/>
-            </w:pPr>
-            <w:r>
-              <w:rPr>
-                <w:sz w:val="20"/>
-                <w:szCs w:val="20"/>
-              </w:rPr>
-              <w:t>An .rds file that can be read in R.</w:t>
+              <w:t>The observer and logbook datasets (</w:t>
+            </w:r>
+            <w:proofErr w:type="spellStart"/>
+            <w:r>
+              <w:rPr>
+                <w:sz w:val="20"/>
+                <w:szCs w:val="20"/>
+              </w:rPr>
+              <w:t>observer_dataset</w:t>
+            </w:r>
+            <w:proofErr w:type="spellEnd"/>
+            <w:r>
+              <w:rPr>
+                <w:sz w:val="20"/>
+                <w:szCs w:val="20"/>
+              </w:rPr>
+              <w:t xml:space="preserve"> and </w:t>
+            </w:r>
+            <w:proofErr w:type="spellStart"/>
+            <w:r>
+              <w:rPr>
+                <w:sz w:val="20"/>
+                <w:szCs w:val="20"/>
+              </w:rPr>
+              <w:t>logbook_dataset</w:t>
+            </w:r>
+            <w:proofErr w:type="spellEnd"/>
+            <w:r>
+              <w:rPr>
+                <w:sz w:val="20"/>
+                <w:szCs w:val="20"/>
+              </w:rPr>
+              <w:t>).</w:t>
+            </w:r>
+          </w:p>
+          <w:p>
+            <w:pPr>
+              <w:spacing w:after="40"/>
+            </w:pPr>
+            <w:r>
+              <w:rPr>
+                <w:sz w:val="20"/>
+                <w:szCs w:val="20"/>
+              </w:rPr>
+              <w:t>A summary of the inputs you chose in the app (</w:t>
+            </w:r>
+            <w:proofErr w:type="spellStart"/>
+            <w:r>
+              <w:rPr>
+                <w:sz w:val="20"/>
+                <w:szCs w:val="20"/>
+              </w:rPr>
+              <w:t>bycatch_inputs</w:t>
+            </w:r>
+            <w:proofErr w:type="spellEnd"/>
+            <w:r>
+              <w:rPr>
+                <w:sz w:val="20"/>
+                <w:szCs w:val="20"/>
+              </w:rPr>
+              <w:t>).</w:t>
+            </w:r>
+          </w:p>
+          <w:p>
+            <w:pPr>
+              <w:spacing w:after="40"/>
+            </w:pPr>
+            <w:proofErr w:type="spellStart"/>
+            <w:r>
+              <w:rPr>
+                <w:sz w:val="20"/>
+                <w:szCs w:val="20"/>
+              </w:rPr>
+              <w:t>DataSummary</w:t>
+            </w:r>
+            <w:proofErr w:type="spellEnd"/>
+            <w:r>
+              <w:rPr>
+                <w:sz w:val="20"/>
+                <w:szCs w:val="20"/>
+              </w:rPr>
+              <w:t xml:space="preserve"> and </w:t>
+            </w:r>
+            <w:proofErr w:type="spellStart"/>
+            <w:r>
+              <w:rPr>
+                <w:sz w:val="20"/>
+                <w:szCs w:val="20"/>
+              </w:rPr>
+              <w:t>StrataSummary</w:t>
+            </w:r>
+            <w:proofErr w:type="spellEnd"/>
+            <w:r>
+              <w:rPr>
+                <w:sz w:val="20"/>
+                <w:szCs w:val="20"/>
+              </w:rPr>
+              <w:t xml:space="preserve"> files with data summaries by year and factor variables.</w:t>
+            </w:r>
+          </w:p>
+          <w:p>
+            <w:pPr>
+              <w:spacing w:after="40"/>
+            </w:pPr>
+            <w:r>
+              <w:rPr>
+                <w:sz w:val="20"/>
+                <w:szCs w:val="20"/>
+              </w:rPr>
+              <w:t>An .</w:t>
+            </w:r>
+            <w:proofErr w:type="spellStart"/>
+            <w:r>
+              <w:rPr>
+                <w:sz w:val="20"/>
+                <w:szCs w:val="20"/>
+              </w:rPr>
+              <w:t>rds</w:t>
+            </w:r>
+            <w:proofErr w:type="spellEnd"/>
+            <w:r>
+              <w:rPr>
+                <w:sz w:val="20"/>
+                <w:szCs w:val="20"/>
+              </w:rPr>
+              <w:t xml:space="preserve"> file that can be read in R.</w:t>
             </w:r>
           </w:p>
         </w:tc>
@@ -11304,7 +12109,23 @@
                 <w:sz w:val="20"/>
                 <w:szCs w:val="20"/>
               </w:rPr>
-              <w:t>An .rds file that can be read in R.</w:t>
+              <w:t>An .</w:t>
+            </w:r>
+            <w:proofErr w:type="spellStart"/>
+            <w:r>
+              <w:rPr>
+                <w:sz w:val="20"/>
+                <w:szCs w:val="20"/>
+              </w:rPr>
+              <w:t>rds</w:t>
+            </w:r>
+            <w:proofErr w:type="spellEnd"/>
+            <w:r>
+              <w:rPr>
+                <w:sz w:val="20"/>
+                <w:szCs w:val="20"/>
+              </w:rPr>
+              <w:t xml:space="preserve"> file that can be read in R.</w:t>
             </w:r>
           </w:p>
         </w:tc>
@@ -11391,12 +12212,12 @@
       <w:pPr>
         <w:pStyle w:val="Heading1"/>
       </w:pPr>
-      <w:bookmarkStart w:id="24" w:name="_Toc244093407"/>
+      <w:bookmarkStart w:id="23" w:name="_Toc244181936"/>
       <w:r>
         <w:lastRenderedPageBreak/>
         <w:t>7. Help and further resources</w:t>
       </w:r>
-      <w:bookmarkEnd w:id="24"/>
+      <w:bookmarkEnd w:id="23"/>
     </w:p>
     <w:p>
       <w:pPr>
@@ -11425,8 +12246,13 @@
         </w:numPr>
         <w:spacing w:after="60" w:line="276" w:lineRule="auto"/>
       </w:pPr>
-      <w:r>
-        <w:t>BycatchEstimator R package on GitHub: https://github.com/ebabcock/BycatchEstimator</w:t>
+      <w:proofErr w:type="spellStart"/>
+      <w:r>
+        <w:t>BycatchEstimator</w:t>
+      </w:r>
+      <w:proofErr w:type="spellEnd"/>
+      <w:r>
+        <w:t xml:space="preserve"> R package on GitHub: https://github.com/ebabcock/BycatchEstimator</w:t>
       </w:r>
     </w:p>
     <w:p>
@@ -11438,8 +12264,13 @@
         </w:numPr>
         <w:spacing w:after="60" w:line="276" w:lineRule="auto"/>
       </w:pPr>
-      <w:r>
-        <w:t>BycatchEstimator R package User Guide: https://ebabcock.github.io/BycatchEstimator/</w:t>
+      <w:proofErr w:type="spellStart"/>
+      <w:r>
+        <w:t>BycatchEstimator</w:t>
+      </w:r>
+      <w:proofErr w:type="spellEnd"/>
+      <w:r>
+        <w:t xml:space="preserve"> R package User Guide: https://ebabcock.github.io/BycatchEstimator/</w:t>
       </w:r>
     </w:p>
     <w:p>
@@ -11451,12 +12282,12 @@
       <w:pPr>
         <w:pStyle w:val="Heading1"/>
       </w:pPr>
-      <w:bookmarkStart w:id="25" w:name="_Toc244093408"/>
+      <w:bookmarkStart w:id="24" w:name="_Toc244181937"/>
       <w:r>
         <w:lastRenderedPageBreak/>
         <w:t>8. Troubleshooting</w:t>
       </w:r>
-      <w:bookmarkEnd w:id="25"/>
+      <w:bookmarkEnd w:id="24"/>
     </w:p>
     <w:tbl>
       <w:tblPr>
@@ -11613,7 +12444,23 @@
                 <w:sz w:val="20"/>
                 <w:szCs w:val="20"/>
               </w:rPr>
-              <w:t>Error: there is no package called ‘BycatchEstimatorApp’</w:t>
+              <w:t>Error: there is no package called ‘</w:t>
+            </w:r>
+            <w:proofErr w:type="spellStart"/>
+            <w:r>
+              <w:rPr>
+                <w:sz w:val="20"/>
+                <w:szCs w:val="20"/>
+              </w:rPr>
+              <w:t>BycatchEstimatorApp</w:t>
+            </w:r>
+            <w:proofErr w:type="spellEnd"/>
+            <w:r>
+              <w:rPr>
+                <w:sz w:val="20"/>
+                <w:szCs w:val="20"/>
+              </w:rPr>
+              <w:t>’</w:t>
             </w:r>
           </w:p>
         </w:tc>
@@ -11706,7 +12553,23 @@
                 <w:sz w:val="20"/>
                 <w:szCs w:val="20"/>
               </w:rPr>
-              <w:t>Error: could not find function “run_bycatch_app”</w:t>
+              <w:t>Error: could not find function “</w:t>
+            </w:r>
+            <w:proofErr w:type="spellStart"/>
+            <w:r>
+              <w:rPr>
+                <w:sz w:val="20"/>
+                <w:szCs w:val="20"/>
+              </w:rPr>
+              <w:t>run_bycatch_app</w:t>
+            </w:r>
+            <w:proofErr w:type="spellEnd"/>
+            <w:r>
+              <w:rPr>
+                <w:sz w:val="20"/>
+                <w:szCs w:val="20"/>
+              </w:rPr>
+              <w:t>”</w:t>
             </w:r>
           </w:p>
         </w:tc>
@@ -11768,6 +12631,8 @@
               </w:rPr>
               <w:t xml:space="preserve">Type the command exactly as shown, including </w:t>
             </w:r>
+            <w:proofErr w:type="spellStart"/>
+            <w:proofErr w:type="gramStart"/>
             <w:r>
               <w:rPr>
                 <w:b/>
@@ -11775,7 +12640,17 @@
                 <w:sz w:val="20"/>
                 <w:szCs w:val="20"/>
               </w:rPr>
-              <w:t>BycatchEstimatorApp::</w:t>
+              <w:t>BycatchEstimatorApp</w:t>
+            </w:r>
+            <w:proofErr w:type="spellEnd"/>
+            <w:r>
+              <w:rPr>
+                <w:b/>
+                <w:bCs/>
+                <w:sz w:val="20"/>
+                <w:szCs w:val="20"/>
+              </w:rPr>
+              <w:t>::</w:t>
             </w:r>
             <w:r>
               <w:rPr>
@@ -11784,6 +12659,7 @@
               </w:rPr>
               <w:t>.</w:t>
             </w:r>
+            <w:proofErr w:type="gramEnd"/>
           </w:p>
         </w:tc>
       </w:tr>
@@ -11925,8 +12801,17 @@
                 <w:sz w:val="20"/>
                 <w:szCs w:val="20"/>
               </w:rPr>
-              <w:t>Reports do not appear, or an error mentions Pandoc</w:t>
-            </w:r>
+              <w:t xml:space="preserve">Reports do not appear, or an error mentions </w:t>
+            </w:r>
+            <w:proofErr w:type="spellStart"/>
+            <w:r>
+              <w:rPr>
+                <w:sz w:val="20"/>
+                <w:szCs w:val="20"/>
+              </w:rPr>
+              <w:t>Pandoc</w:t>
+            </w:r>
+            <w:proofErr w:type="spellEnd"/>
           </w:p>
         </w:tc>
         <w:tc>
@@ -11950,12 +12835,21 @@
             <w:pPr>
               <w:spacing w:after="40"/>
             </w:pPr>
-            <w:r>
-              <w:rPr>
-                <w:sz w:val="20"/>
-                <w:szCs w:val="20"/>
-              </w:rPr>
-              <w:t>Pandoc is missing, which can happen when R is used without RStudio.</w:t>
+            <w:proofErr w:type="spellStart"/>
+            <w:r>
+              <w:rPr>
+                <w:sz w:val="20"/>
+                <w:szCs w:val="20"/>
+              </w:rPr>
+              <w:t>Pandoc</w:t>
+            </w:r>
+            <w:proofErr w:type="spellEnd"/>
+            <w:r>
+              <w:rPr>
+                <w:sz w:val="20"/>
+                <w:szCs w:val="20"/>
+              </w:rPr>
+              <w:t xml:space="preserve"> is missing, which can happen when R is used without RStudio.</w:t>
             </w:r>
           </w:p>
         </w:tc>
@@ -11985,7 +12879,39 @@
                 <w:sz w:val="20"/>
                 <w:szCs w:val="20"/>
               </w:rPr>
-              <w:t>Run the app from RStudio, or install Pandoc (https://pandoc.org/installing.html).</w:t>
+              <w:t xml:space="preserve">Run the app from </w:t>
+            </w:r>
+            <w:proofErr w:type="gramStart"/>
+            <w:r>
+              <w:rPr>
+                <w:sz w:val="20"/>
+                <w:szCs w:val="20"/>
+              </w:rPr>
+              <w:t>RStudio, or</w:t>
+            </w:r>
+            <w:proofErr w:type="gramEnd"/>
+            <w:r>
+              <w:rPr>
+                <w:sz w:val="20"/>
+                <w:szCs w:val="20"/>
+              </w:rPr>
+              <w:t xml:space="preserve"> install </w:t>
+            </w:r>
+            <w:proofErr w:type="spellStart"/>
+            <w:r>
+              <w:rPr>
+                <w:sz w:val="20"/>
+                <w:szCs w:val="20"/>
+              </w:rPr>
+              <w:t>Pandoc</w:t>
+            </w:r>
+            <w:proofErr w:type="spellEnd"/>
+            <w:r>
+              <w:rPr>
+                <w:sz w:val="20"/>
+                <w:szCs w:val="20"/>
+              </w:rPr>
+              <w:t xml:space="preserve"> (https://pandoc.org/installing.html).</w:t>
             </w:r>
           </w:p>
         </w:tc>
@@ -12299,7 +13225,23 @@
                 <w:sz w:val="20"/>
                 <w:szCs w:val="20"/>
               </w:rPr>
-              <w:t>Red warning: “Year (or Catch, Effort, SampleUnits) is available but you selected something else!”</w:t>
+              <w:t xml:space="preserve">Red warning: “Year (or Catch, Effort, </w:t>
+            </w:r>
+            <w:proofErr w:type="spellStart"/>
+            <w:r>
+              <w:rPr>
+                <w:sz w:val="20"/>
+                <w:szCs w:val="20"/>
+              </w:rPr>
+              <w:t>SampleUnits</w:t>
+            </w:r>
+            <w:proofErr w:type="spellEnd"/>
+            <w:r>
+              <w:rPr>
+                <w:sz w:val="20"/>
+                <w:szCs w:val="20"/>
+              </w:rPr>
+              <w:t>) is available but you selected something else!”</w:t>
             </w:r>
           </w:p>
         </w:tc>
@@ -12359,7 +13301,39 @@
                 <w:sz w:val="20"/>
                 <w:szCs w:val="20"/>
               </w:rPr>
-              <w:t>Select that column for that role, or rename or remove it and re-upload. In Part 3, a reserved Effort or SampleUnits column is handled the same way.</w:t>
+              <w:t xml:space="preserve">Select that column for that </w:t>
+            </w:r>
+            <w:proofErr w:type="gramStart"/>
+            <w:r>
+              <w:rPr>
+                <w:sz w:val="20"/>
+                <w:szCs w:val="20"/>
+              </w:rPr>
+              <w:t>role, or</w:t>
+            </w:r>
+            <w:proofErr w:type="gramEnd"/>
+            <w:r>
+              <w:rPr>
+                <w:sz w:val="20"/>
+                <w:szCs w:val="20"/>
+              </w:rPr>
+              <w:t xml:space="preserve"> rename or remove it and re-upload. In Part 3, a reserved Effort or </w:t>
+            </w:r>
+            <w:proofErr w:type="spellStart"/>
+            <w:r>
+              <w:rPr>
+                <w:sz w:val="20"/>
+                <w:szCs w:val="20"/>
+              </w:rPr>
+              <w:t>SampleUnits</w:t>
+            </w:r>
+            <w:proofErr w:type="spellEnd"/>
+            <w:r>
+              <w:rPr>
+                <w:sz w:val="20"/>
+                <w:szCs w:val="20"/>
+              </w:rPr>
+              <w:t xml:space="preserve"> column is handled the same way.</w:t>
             </w:r>
           </w:p>
         </w:tc>
@@ -12422,7 +13396,23 @@
                 <w:sz w:val="20"/>
                 <w:szCs w:val="20"/>
               </w:rPr>
-              <w:t>The same logbook column was chosen as the effort column and as the counts column.</w:t>
+              <w:t xml:space="preserve">The same logbook column was chosen as the effort column and as the </w:t>
+            </w:r>
+            <w:proofErr w:type="gramStart"/>
+            <w:r>
+              <w:rPr>
+                <w:sz w:val="20"/>
+                <w:szCs w:val="20"/>
+              </w:rPr>
+              <w:t>counts</w:t>
+            </w:r>
+            <w:proofErr w:type="gramEnd"/>
+            <w:r>
+              <w:rPr>
+                <w:sz w:val="20"/>
+                <w:szCs w:val="20"/>
+              </w:rPr>
+              <w:t xml:space="preserve"> column.</w:t>
             </w:r>
           </w:p>
         </w:tc>
@@ -13078,7 +14068,23 @@
                 <w:sz w:val="20"/>
                 <w:szCs w:val="20"/>
               </w:rPr>
-              <w:t>A mandatory field is empty or the analysis could not be run.</w:t>
+              <w:t xml:space="preserve">A mandatory field is </w:t>
+            </w:r>
+            <w:proofErr w:type="gramStart"/>
+            <w:r>
+              <w:rPr>
+                <w:sz w:val="20"/>
+                <w:szCs w:val="20"/>
+              </w:rPr>
+              <w:t>empty</w:t>
+            </w:r>
+            <w:proofErr w:type="gramEnd"/>
+            <w:r>
+              <w:rPr>
+                <w:sz w:val="20"/>
+                <w:szCs w:val="20"/>
+              </w:rPr>
+              <w:t xml:space="preserve"> or the analysis could not be run.</w:t>
             </w:r>
           </w:p>
         </w:tc>
@@ -13108,7 +14114,23 @@
                 <w:sz w:val="20"/>
                 <w:szCs w:val="20"/>
               </w:rPr>
-              <w:t>Check the stratification variable(s) and scenario name, and review any warnings.</w:t>
+              <w:t xml:space="preserve">Check the stratification variable(s) and scenario </w:t>
+            </w:r>
+            <w:proofErr w:type="gramStart"/>
+            <w:r>
+              <w:rPr>
+                <w:sz w:val="20"/>
+                <w:szCs w:val="20"/>
+              </w:rPr>
+              <w:t>name, and</w:t>
+            </w:r>
+            <w:proofErr w:type="gramEnd"/>
+            <w:r>
+              <w:rPr>
+                <w:sz w:val="20"/>
+                <w:szCs w:val="20"/>
+              </w:rPr>
+              <w:t xml:space="preserve"> review any warnings.</w:t>
             </w:r>
           </w:p>
         </w:tc>
@@ -13324,12 +14346,12 @@
       <w:pPr>
         <w:pStyle w:val="Heading1"/>
       </w:pPr>
-      <w:bookmarkStart w:id="26" w:name="_Toc244093409"/>
+      <w:bookmarkStart w:id="25" w:name="_Toc244181938"/>
       <w:r>
         <w:lastRenderedPageBreak/>
         <w:t>9. Glossary</w:t>
       </w:r>
-      <w:bookmarkEnd w:id="26"/>
+      <w:bookmarkEnd w:id="25"/>
     </w:p>
     <w:tbl>
       <w:tblPr>
@@ -14186,7 +15208,23 @@
                 <w:sz w:val="20"/>
                 <w:szCs w:val="20"/>
               </w:rPr>
-              <w:t>The free statistical programming language that the BycatchEstimator package is written in.</w:t>
+              <w:t xml:space="preserve">The free statistical programming language that the </w:t>
+            </w:r>
+            <w:proofErr w:type="spellStart"/>
+            <w:r>
+              <w:rPr>
+                <w:sz w:val="20"/>
+                <w:szCs w:val="20"/>
+              </w:rPr>
+              <w:t>BycatchEstimator</w:t>
+            </w:r>
+            <w:proofErr w:type="spellEnd"/>
+            <w:r>
+              <w:rPr>
+                <w:sz w:val="20"/>
+                <w:szCs w:val="20"/>
+              </w:rPr>
+              <w:t xml:space="preserve"> package is written in.</w:t>
             </w:r>
           </w:p>
         </w:tc>
@@ -14406,27 +15444,163 @@
       <w:pPr>
         <w:pStyle w:val="Heading1"/>
       </w:pPr>
-      <w:bookmarkStart w:id="27" w:name="_Toc244093410"/>
+      <w:bookmarkStart w:id="26" w:name="_Toc244181939"/>
       <w:r>
         <w:lastRenderedPageBreak/>
         <w:t>10. References</w:t>
       </w:r>
-      <w:bookmarkEnd w:id="27"/>
+      <w:bookmarkEnd w:id="26"/>
+    </w:p>
+    <w:p>
+      <w:pPr>
+        <w:pBdr>
+          <w:top w:val="nil"/>
+          <w:left w:val="nil"/>
+          <w:bottom w:val="nil"/>
+          <w:right w:val="nil"/>
+          <w:between w:val="nil"/>
+        </w:pBdr>
+        <w:ind w:left="720" w:hanging="720"/>
+      </w:pPr>
+      <w:r>
+        <w:rPr>
+          <w:color w:val="333333"/>
+          <w:sz w:val="20"/>
+          <w:szCs w:val="20"/>
+        </w:rPr>
+        <w:t>Babcock, E.A. W. J. Harford and A. Adao. 2025</w:t>
+      </w:r>
+      <w:r>
+        <w:rPr>
+          <w:color w:val="333333"/>
+          <w:sz w:val="20"/>
+          <w:szCs w:val="20"/>
+        </w:rPr>
+        <w:t>a</w:t>
+      </w:r>
+      <w:r>
+        <w:rPr>
+          <w:color w:val="333333"/>
+          <w:sz w:val="20"/>
+          <w:szCs w:val="20"/>
+        </w:rPr>
+        <w:t xml:space="preserve">. </w:t>
+      </w:r>
+      <w:proofErr w:type="spellStart"/>
+      <w:r>
+        <w:rPr>
+          <w:color w:val="333333"/>
+          <w:sz w:val="20"/>
+          <w:szCs w:val="20"/>
+        </w:rPr>
+        <w:t>BycatchEstimator</w:t>
+      </w:r>
+      <w:proofErr w:type="spellEnd"/>
+      <w:r>
+        <w:rPr>
+          <w:color w:val="333333"/>
+          <w:sz w:val="20"/>
+          <w:szCs w:val="20"/>
+        </w:rPr>
+        <w:t xml:space="preserve">: Generic Model-Based Bycatch Estimation Procedure. R package version </w:t>
+      </w:r>
+      <w:proofErr w:type="gramStart"/>
+      <w:r>
+        <w:rPr>
+          <w:color w:val="333333"/>
+          <w:sz w:val="20"/>
+          <w:szCs w:val="20"/>
+        </w:rPr>
+        <w:t>1.0.0.000 .</w:t>
+      </w:r>
+      <w:proofErr w:type="gramEnd"/>
+      <w:r>
+        <w:rPr>
+          <w:color w:val="333333"/>
+          <w:sz w:val="20"/>
+          <w:szCs w:val="20"/>
+        </w:rPr>
+        <w:t xml:space="preserve"> </w:t>
+      </w:r>
+      <w:hyperlink r:id="rId28" w:tgtFrame="_blank" w:history="1">
+        <w:r>
+          <w:rPr>
+            <w:color w:val="333333"/>
+            <w:sz w:val="20"/>
+            <w:szCs w:val="20"/>
+          </w:rPr>
+          <w:t>https://ebabcock.github.io/BycatchEstimator/</w:t>
+        </w:r>
+      </w:hyperlink>
+    </w:p>
+    <w:p>
+      <w:pPr>
+        <w:pBdr>
+          <w:top w:val="nil"/>
+          <w:left w:val="nil"/>
+          <w:bottom w:val="nil"/>
+          <w:right w:val="nil"/>
+          <w:between w:val="nil"/>
+        </w:pBdr>
+        <w:ind w:left="720" w:hanging="720"/>
+        <w:rPr>
+          <w:color w:val="333333"/>
+          <w:sz w:val="20"/>
+          <w:szCs w:val="20"/>
+        </w:rPr>
+      </w:pPr>
+    </w:p>
+    <w:p>
+      <w:pPr>
+        <w:pBdr>
+          <w:top w:val="nil"/>
+          <w:left w:val="nil"/>
+          <w:bottom w:val="nil"/>
+          <w:right w:val="nil"/>
+          <w:between w:val="nil"/>
+        </w:pBdr>
+        <w:ind w:left="720" w:hanging="720"/>
+        <w:rPr>
+          <w:color w:val="333333"/>
+          <w:sz w:val="20"/>
+          <w:szCs w:val="20"/>
+        </w:rPr>
+      </w:pPr>
+      <w:r>
+        <w:rPr>
+          <w:color w:val="333333"/>
+          <w:sz w:val="20"/>
+          <w:szCs w:val="20"/>
+        </w:rPr>
+        <w:t xml:space="preserve">Pennington, M. 1983. Efficient Estimators of Abundance, for Fish and Plankton Surveys. Biometrics 39 (1): 281–86. </w:t>
+      </w:r>
+      <w:hyperlink r:id="rId29" w:history="1">
+        <w:r>
+          <w:rPr>
+            <w:rStyle w:val="Hyperlink"/>
+            <w:sz w:val="20"/>
+            <w:szCs w:val="20"/>
+          </w:rPr>
+          <w:t>https://www.jstor.org/stable/2530830</w:t>
+        </w:r>
+      </w:hyperlink>
+      <w:r>
+        <w:rPr>
+          <w:color w:val="333333"/>
+          <w:sz w:val="20"/>
+          <w:szCs w:val="20"/>
+        </w:rPr>
+        <w:t>.</w:t>
+      </w:r>
     </w:p>
     <w:p>
       <w:pPr>
         <w:spacing w:before="80" w:after="160" w:line="276" w:lineRule="auto"/>
       </w:pPr>
-      <w:r>
-        <w:rPr>
-          <w:highlight w:val="yellow"/>
-        </w:rPr>
-        <w:t>To do</w:t>
-      </w:r>
     </w:p>
     <w:sectPr>
-      <w:headerReference w:type="default" r:id="rId32"/>
-      <w:footerReference w:type="default" r:id="rId33"/>
+      <w:headerReference w:type="default" r:id="rId30"/>
+      <w:footerReference w:type="default" r:id="rId31"/>
       <w:pgSz w:w="12240" w:h="15840"/>
       <w:pgMar w:top="1440" w:right="1440" w:bottom="1440" w:left="1440" w:header="708" w:footer="708" w:gutter="0"/>
       <w:cols w:space="720"/>
@@ -14434,45 +15608,6 @@
     </w:sectPr>
   </w:body>
 </w:document>
-</file>
-
-<file path=word/comments.xml><?xml version="1.0" encoding="utf-8"?>
-<w:comments xmlns:wpc="http://schemas.microsoft.com/office/word/2010/wordprocessingCanvas" xmlns:cx="http://schemas.microsoft.com/office/drawing/2014/chartex" xmlns:cx1="http://schemas.microsoft.com/office/drawing/2015/9/8/chartex" xmlns:cx2="http://schemas.microsoft.com/office/drawing/2015/10/21/chartex" xmlns:cx3="http://schemas.microsoft.com/office/drawing/2016/5/9/chartex" xmlns:cx4="http://schemas.microsoft.com/office/drawing/2016/5/10/chartex" xmlns:cx5="http://schemas.microsoft.com/office/drawing/2016/5/11/chartex" xmlns:cx6="http://schemas.microsoft.com/office/drawing/2016/5/12/chartex" xmlns:cx7="http://schemas.microsoft.com/office/drawing/2016/5/13/chartex" xmlns:cx8="http://schemas.microsoft.com/office/drawing/2016/5/14/chartex" xmlns:mc="http://schemas.openxmlformats.org/markup-compatibility/2006" xmlns:aink="http://schemas.microsoft.com/office/drawing/2016/ink" xmlns:am3d="http://schemas.microsoft.com/office/drawing/2017/model3d" xmlns:o="urn:schemas-microsoft-com:office:office" xmlns:oel="http://schemas.microsoft.com/office/2019/extlst" xmlns:r="http://schemas.openxmlformats.org/officeDocument/2006/relationships" xmlns:m="http://schemas.openxmlformats.org/officeDocument/2006/math" xmlns:v="urn:schemas-microsoft-com:vml" xmlns:wp14="http://schemas.microsoft.com/office/word/2010/wordprocessingDrawing" xmlns:wp="http://schemas.openxmlformats.org/drawingml/2006/wordprocessingDrawing" xmlns:w10="urn:schemas-microsoft-com:office:word" xmlns:w="http://schemas.openxmlformats.org/wordprocessingml/2006/main" xmlns:w14="http://schemas.microsoft.com/office/word/2010/wordml" xmlns:w15="http://schemas.microsoft.com/office/word/2012/wordml" xmlns:w16cex="http://schemas.microsoft.com/office/word/2018/wordml/cex" xmlns:w16cid="http://schemas.microsoft.com/office/word/2016/wordml/cid" xmlns:w16="http://schemas.microsoft.com/office/word/2018/wordml" xmlns:w16du="http://schemas.microsoft.com/office/word/2023/wordml/word16du" xmlns:w16sdtdh="http://schemas.microsoft.com/office/word/2020/wordml/sdtdatahash" xmlns:w16sdtfl="http://schemas.microsoft.com/office/word/2024/wordml/sdtformatlock" xmlns:w16se="http://schemas.microsoft.com/office/word/2015/wordml/symex" xmlns:wpg="http://schemas.microsoft.com/office/word/2010/wordprocessingGroup" xmlns:wpi="http://schemas.microsoft.com/office/word/2010/wordprocessingInk" xmlns:wne="http://schemas.microsoft.com/office/word/2006/wordml" xmlns:wps="http://schemas.microsoft.com/office/word/2010/wordprocessingShape" mc:Ignorable="w14 w15 w16se w16cid w16 w16cex w16sdtdh w16sdtfl w16du wp14">
-  <w:comment w:id="12" w:author="William Harford" w:date="2026-10-16T11:17:00Z" w:initials="WH">
-    <w:p>
-      <w:pPr>
-        <w:pStyle w:val="CommentText"/>
-      </w:pPr>
-      <w:r>
-        <w:rPr>
-          <w:rStyle w:val="CommentReference"/>
-        </w:rPr>
-        <w:annotationRef/>
-      </w:r>
-      <w:r>
-        <w:t>Add a third dataset with aggregation as per Beth’s email</w:t>
-      </w:r>
-    </w:p>
-  </w:comment>
-</w:comments>
-</file>
-
-<file path=word/commentsExtended.xml><?xml version="1.0" encoding="utf-8"?>
-<w15:commentsEx xmlns:wpc="http://schemas.microsoft.com/office/word/2010/wordprocessingCanvas" xmlns:cx="http://schemas.microsoft.com/office/drawing/2014/chartex" xmlns:cx1="http://schemas.microsoft.com/office/drawing/2015/9/8/chartex" xmlns:cx2="http://schemas.microsoft.com/office/drawing/2015/10/21/chartex" xmlns:cx3="http://schemas.microsoft.com/office/drawing/2016/5/9/chartex" xmlns:cx4="http://schemas.microsoft.com/office/drawing/2016/5/10/chartex" xmlns:cx5="http://schemas.microsoft.com/office/drawing/2016/5/11/chartex" xmlns:cx6="http://schemas.microsoft.com/office/drawing/2016/5/12/chartex" xmlns:cx7="http://schemas.microsoft.com/office/drawing/2016/5/13/chartex" xmlns:cx8="http://schemas.microsoft.com/office/drawing/2016/5/14/chartex" xmlns:mc="http://schemas.openxmlformats.org/markup-compatibility/2006" xmlns:aink="http://schemas.microsoft.com/office/drawing/2016/ink" xmlns:am3d="http://schemas.microsoft.com/office/drawing/2017/model3d" xmlns:o="urn:schemas-microsoft-com:office:office" xmlns:oel="http://schemas.microsoft.com/office/2019/extlst" xmlns:r="http://schemas.openxmlformats.org/officeDocument/2006/relationships" xmlns:m="http://schemas.openxmlformats.org/officeDocument/2006/math" xmlns:v="urn:schemas-microsoft-com:vml" xmlns:wp14="http://schemas.microsoft.com/office/word/2010/wordprocessingDrawing" xmlns:wp="http://schemas.openxmlformats.org/drawingml/2006/wordprocessingDrawing" xmlns:w10="urn:schemas-microsoft-com:office:word" xmlns:w="http://schemas.openxmlformats.org/wordprocessingml/2006/main" xmlns:w14="http://schemas.microsoft.com/office/word/2010/wordml" xmlns:w15="http://schemas.microsoft.com/office/word/2012/wordml" xmlns:w16cex="http://schemas.microsoft.com/office/word/2018/wordml/cex" xmlns:w16cid="http://schemas.microsoft.com/office/word/2016/wordml/cid" xmlns:w16="http://schemas.microsoft.com/office/word/2018/wordml" xmlns:w16du="http://schemas.microsoft.com/office/word/2023/wordml/word16du" xmlns:w16sdtdh="http://schemas.microsoft.com/office/word/2020/wordml/sdtdatahash" xmlns:w16sdtfl="http://schemas.microsoft.com/office/word/2024/wordml/sdtformatlock" xmlns:w16se="http://schemas.microsoft.com/office/word/2015/wordml/symex" xmlns:wpg="http://schemas.microsoft.com/office/word/2010/wordprocessingGroup" xmlns:wpi="http://schemas.microsoft.com/office/word/2010/wordprocessingInk" xmlns:wne="http://schemas.microsoft.com/office/word/2006/wordml" xmlns:wps="http://schemas.microsoft.com/office/word/2010/wordprocessingShape" mc:Ignorable="w14 w15 w16se w16cid w16 w16cex w16sdtdh w16sdtfl w16du wp14">
-  <w15:commentEx w15:paraId="50F2BBC9" w15:done="0"/>
-</w15:commentsEx>
-</file>
-
-<file path=word/commentsExtensible.xml><?xml version="1.0" encoding="utf-8"?>
-<w16cex:commentsExtensible xmlns:wpc="http://schemas.microsoft.com/office/word/2010/wordprocessingCanvas" xmlns:cx="http://schemas.microsoft.com/office/drawing/2014/chartex" xmlns:cx1="http://schemas.microsoft.com/office/drawing/2015/9/8/chartex" xmlns:cx2="http://schemas.microsoft.com/office/drawing/2015/10/21/chartex" xmlns:cx3="http://schemas.microsoft.com/office/drawing/2016/5/9/chartex" xmlns:cx4="http://schemas.microsoft.com/office/drawing/2016/5/10/chartex" xmlns:cx5="http://schemas.microsoft.com/office/drawing/2016/5/11/chartex" xmlns:cx6="http://schemas.microsoft.com/office/drawing/2016/5/12/chartex" xmlns:cx7="http://schemas.microsoft.com/office/drawing/2016/5/13/chartex" xmlns:cx8="http://schemas.microsoft.com/office/drawing/2016/5/14/chartex" xmlns:cr="http://schemas.microsoft.com/office/comments/2020/reactions" xmlns:mc="http://schemas.openxmlformats.org/markup-compatibility/2006" xmlns:aink="http://schemas.microsoft.com/office/drawing/2016/ink" xmlns:am3d="http://schemas.microsoft.com/office/drawing/2017/model3d" xmlns:o="urn:schemas-microsoft-com:office:office" xmlns:oel="http://schemas.microsoft.com/office/2019/extlst" xmlns:r="http://schemas.openxmlformats.org/officeDocument/2006/relationships" xmlns:m="http://schemas.openxmlformats.org/officeDocument/2006/math" xmlns:rd="http://schemas.microsoft.com/office/reactions/2026/reactionDetails" xmlns:v="urn:schemas-microsoft-com:vml" xmlns:wp14="http://schemas.microsoft.com/office/word/2010/wordprocessingDrawing" xmlns:wp="http://schemas.openxmlformats.org/drawingml/2006/wordprocessingDrawing" xmlns:w10="urn:schemas-microsoft-com:office:word" xmlns:w="http://schemas.openxmlformats.org/wordprocessingml/2006/main" xmlns:w14="http://schemas.microsoft.com/office/word/2010/wordml" xmlns:w15="http://schemas.microsoft.com/office/word/2012/wordml" xmlns:w16cei="http://schemas.microsoft.com/office/word/2026/wordml/cei" xmlns:w16cex="http://schemas.microsoft.com/office/word/2018/wordml/cex" xmlns:w16cid="http://schemas.microsoft.com/office/word/2016/wordml/cid" xmlns:w16="http://schemas.microsoft.com/office/word/2018/wordml" xmlns:w16du="http://schemas.microsoft.com/office/word/2023/wordml/word16du" xmlns:w16sdtdh="http://schemas.microsoft.com/office/word/2020/wordml/sdtdatahash" xmlns:w16sdtfl="http://schemas.microsoft.com/office/word/2024/wordml/sdtformatlock" xmlns:w16se="http://schemas.microsoft.com/office/word/2015/wordml/symex" xmlns:wpg="http://schemas.microsoft.com/office/word/2010/wordprocessingGroup" xmlns:wpi="http://schemas.microsoft.com/office/word/2010/wordprocessingInk" xmlns:wne="http://schemas.microsoft.com/office/word/2006/wordml" xmlns:wps="http://schemas.microsoft.com/office/word/2010/wordprocessingShape" mc:Ignorable="w14 w15 w16se w16cid w16 w16cex w16sdtdh w16sdtfl cr w16cei rd w16du wp14">
-  <w16cex:commentExtensible w16cex:durableId="08111F17" w16cex:dateUtc="2026-10-16T15:17:00Z"/>
-</w16cex:commentsExtensible>
-</file>
-
-<file path=word/commentsIds.xml><?xml version="1.0" encoding="utf-8"?>
-<w16cid:commentsIds xmlns:wpc="http://schemas.microsoft.com/office/word/2010/wordprocessingCanvas" xmlns:cx="http://schemas.microsoft.com/office/drawing/2014/chartex" xmlns:cx1="http://schemas.microsoft.com/office/drawing/2015/9/8/chartex" xmlns:cx2="http://schemas.microsoft.com/office/drawing/2015/10/21/chartex" xmlns:cx3="http://schemas.microsoft.com/office/drawing/2016/5/9/chartex" xmlns:cx4="http://schemas.microsoft.com/office/drawing/2016/5/10/chartex" xmlns:cx5="http://schemas.microsoft.com/office/drawing/2016/5/11/chartex" xmlns:cx6="http://schemas.microsoft.com/office/drawing/2016/5/12/chartex" xmlns:cx7="http://schemas.microsoft.com/office/drawing/2016/5/13/chartex" xmlns:cx8="http://schemas.microsoft.com/office/drawing/2016/5/14/chartex" xmlns:mc="http://schemas.openxmlformats.org/markup-compatibility/2006" xmlns:aink="http://schemas.microsoft.com/office/drawing/2016/ink" xmlns:am3d="http://schemas.microsoft.com/office/drawing/2017/model3d" xmlns:o="urn:schemas-microsoft-com:office:office" xmlns:oel="http://schemas.microsoft.com/office/2019/extlst" xmlns:r="http://schemas.openxmlformats.org/officeDocument/2006/relationships" xmlns:m="http://schemas.openxmlformats.org/officeDocument/2006/math" xmlns:v="urn:schemas-microsoft-com:vml" xmlns:wp14="http://schemas.microsoft.com/office/word/2010/wordprocessingDrawing" xmlns:wp="http://schemas.openxmlformats.org/drawingml/2006/wordprocessingDrawing" xmlns:w10="urn:schemas-microsoft-com:office:word" xmlns:w="http://schemas.openxmlformats.org/wordprocessingml/2006/main" xmlns:w14="http://schemas.microsoft.com/office/word/2010/wordml" xmlns:w15="http://schemas.microsoft.com/office/word/2012/wordml" xmlns:w16cex="http://schemas.microsoft.com/office/word/2018/wordml/cex" xmlns:w16cid="http://schemas.microsoft.com/office/word/2016/wordml/cid" xmlns:w16="http://schemas.microsoft.com/office/word/2018/wordml" xmlns:w16du="http://schemas.microsoft.com/office/word/2023/wordml/word16du" xmlns:w16sdtdh="http://schemas.microsoft.com/office/word/2020/wordml/sdtdatahash" xmlns:w16sdtfl="http://schemas.microsoft.com/office/word/2024/wordml/sdtformatlock" xmlns:w16se="http://schemas.microsoft.com/office/word/2015/wordml/symex" xmlns:wpg="http://schemas.microsoft.com/office/word/2010/wordprocessingGroup" xmlns:wpi="http://schemas.microsoft.com/office/word/2010/wordprocessingInk" xmlns:wne="http://schemas.microsoft.com/office/word/2006/wordml" xmlns:wps="http://schemas.microsoft.com/office/word/2010/wordprocessingShape" mc:Ignorable="w14 w15 w16se w16cid w16 w16cex w16sdtdh w16sdtfl w16du wp14">
-  <w16cid:commentId w16cid:paraId="50F2BBC9" w16cid:durableId="08111F17"/>
-</w16cid:commentsIds>
 </file>
 
 <file path=word/endnotes.xml><?xml version="1.0" encoding="utf-8"?>
@@ -14578,13 +15713,23 @@
     <w:pPr>
       <w:jc w:val="right"/>
     </w:pPr>
+    <w:proofErr w:type="spellStart"/>
     <w:r>
       <w:rPr>
         <w:color w:val="7F7F7F"/>
         <w:sz w:val="18"/>
         <w:szCs w:val="18"/>
       </w:rPr>
-      <w:t>BycatchEstimator App User Guide</w:t>
+      <w:t>BycatchEstimator</w:t>
+    </w:r>
+    <w:proofErr w:type="spellEnd"/>
+    <w:r>
+      <w:rPr>
+        <w:color w:val="7F7F7F"/>
+        <w:sz w:val="18"/>
+        <w:szCs w:val="18"/>
+      </w:rPr>
+      <w:t xml:space="preserve"> App User Guide</w:t>
     </w:r>
   </w:p>
 </w:hdr>
@@ -14647,6 +15792,119 @@
     </w:lvl>
   </w:abstractNum>
   <w:abstractNum w:abstractNumId="1" w15:restartNumberingAfterBreak="0">
+    <w:nsid w:val="183145F2"/>
+    <w:multiLevelType w:val="hybridMultilevel"/>
+    <w:tmpl w:val="2AC40B26"/>
+    <w:lvl w:ilvl="0" w:tplc="10090001">
+      <w:start w:val="1"/>
+      <w:numFmt w:val="bullet"/>
+      <w:lvlText w:val=""/>
+      <w:lvlJc w:val="left"/>
+      <w:pPr>
+        <w:ind w:left="720" w:hanging="360"/>
+      </w:pPr>
+      <w:rPr>
+        <w:rFonts w:ascii="Symbol" w:hAnsi="Symbol" w:hint="default"/>
+      </w:rPr>
+    </w:lvl>
+    <w:lvl w:ilvl="1" w:tplc="10090003">
+      <w:start w:val="1"/>
+      <w:numFmt w:val="bullet"/>
+      <w:lvlText w:val="o"/>
+      <w:lvlJc w:val="left"/>
+      <w:pPr>
+        <w:ind w:left="1440" w:hanging="360"/>
+      </w:pPr>
+      <w:rPr>
+        <w:rFonts w:ascii="Courier New" w:hAnsi="Courier New" w:cs="Courier New" w:hint="default"/>
+      </w:rPr>
+    </w:lvl>
+    <w:lvl w:ilvl="2" w:tplc="10090005" w:tentative="1">
+      <w:start w:val="1"/>
+      <w:numFmt w:val="bullet"/>
+      <w:lvlText w:val=""/>
+      <w:lvlJc w:val="left"/>
+      <w:pPr>
+        <w:ind w:left="2160" w:hanging="360"/>
+      </w:pPr>
+      <w:rPr>
+        <w:rFonts w:ascii="Wingdings" w:hAnsi="Wingdings" w:hint="default"/>
+      </w:rPr>
+    </w:lvl>
+    <w:lvl w:ilvl="3" w:tplc="10090001" w:tentative="1">
+      <w:start w:val="1"/>
+      <w:numFmt w:val="bullet"/>
+      <w:lvlText w:val=""/>
+      <w:lvlJc w:val="left"/>
+      <w:pPr>
+        <w:ind w:left="2880" w:hanging="360"/>
+      </w:pPr>
+      <w:rPr>
+        <w:rFonts w:ascii="Symbol" w:hAnsi="Symbol" w:hint="default"/>
+      </w:rPr>
+    </w:lvl>
+    <w:lvl w:ilvl="4" w:tplc="10090003" w:tentative="1">
+      <w:start w:val="1"/>
+      <w:numFmt w:val="bullet"/>
+      <w:lvlText w:val="o"/>
+      <w:lvlJc w:val="left"/>
+      <w:pPr>
+        <w:ind w:left="3600" w:hanging="360"/>
+      </w:pPr>
+      <w:rPr>
+        <w:rFonts w:ascii="Courier New" w:hAnsi="Courier New" w:cs="Courier New" w:hint="default"/>
+      </w:rPr>
+    </w:lvl>
+    <w:lvl w:ilvl="5" w:tplc="10090005" w:tentative="1">
+      <w:start w:val="1"/>
+      <w:numFmt w:val="bullet"/>
+      <w:lvlText w:val=""/>
+      <w:lvlJc w:val="left"/>
+      <w:pPr>
+        <w:ind w:left="4320" w:hanging="360"/>
+      </w:pPr>
+      <w:rPr>
+        <w:rFonts w:ascii="Wingdings" w:hAnsi="Wingdings" w:hint="default"/>
+      </w:rPr>
+    </w:lvl>
+    <w:lvl w:ilvl="6" w:tplc="10090001" w:tentative="1">
+      <w:start w:val="1"/>
+      <w:numFmt w:val="bullet"/>
+      <w:lvlText w:val=""/>
+      <w:lvlJc w:val="left"/>
+      <w:pPr>
+        <w:ind w:left="5040" w:hanging="360"/>
+      </w:pPr>
+      <w:rPr>
+        <w:rFonts w:ascii="Symbol" w:hAnsi="Symbol" w:hint="default"/>
+      </w:rPr>
+    </w:lvl>
+    <w:lvl w:ilvl="7" w:tplc="10090003" w:tentative="1">
+      <w:start w:val="1"/>
+      <w:numFmt w:val="bullet"/>
+      <w:lvlText w:val="o"/>
+      <w:lvlJc w:val="left"/>
+      <w:pPr>
+        <w:ind w:left="5760" w:hanging="360"/>
+      </w:pPr>
+      <w:rPr>
+        <w:rFonts w:ascii="Courier New" w:hAnsi="Courier New" w:cs="Courier New" w:hint="default"/>
+      </w:rPr>
+    </w:lvl>
+    <w:lvl w:ilvl="8" w:tplc="10090005" w:tentative="1">
+      <w:start w:val="1"/>
+      <w:numFmt w:val="bullet"/>
+      <w:lvlText w:val=""/>
+      <w:lvlJc w:val="left"/>
+      <w:pPr>
+        <w:ind w:left="6480" w:hanging="360"/>
+      </w:pPr>
+      <w:rPr>
+        <w:rFonts w:ascii="Wingdings" w:hAnsi="Wingdings" w:hint="default"/>
+      </w:rPr>
+    </w:lvl>
+  </w:abstractNum>
+  <w:abstractNum w:abstractNumId="2" w15:restartNumberingAfterBreak="0">
     <w:nsid w:val="1D2B3A73"/>
     <w:multiLevelType w:val="hybridMultilevel"/>
     <w:tmpl w:val="326817AC"/>
@@ -14700,7 +15958,7 @@
       <w:lvlJc w:val="left"/>
     </w:lvl>
   </w:abstractNum>
-  <w:abstractNum w:abstractNumId="2" w15:restartNumberingAfterBreak="0">
+  <w:abstractNum w:abstractNumId="3" w15:restartNumberingAfterBreak="0">
     <w:nsid w:val="1DA85A1C"/>
     <w:multiLevelType w:val="hybridMultilevel"/>
     <w:tmpl w:val="3E50F4AE"/>
@@ -14754,7 +16012,7 @@
       <w:lvlJc w:val="left"/>
     </w:lvl>
   </w:abstractNum>
-  <w:abstractNum w:abstractNumId="3" w15:restartNumberingAfterBreak="0">
+  <w:abstractNum w:abstractNumId="4" w15:restartNumberingAfterBreak="0">
     <w:nsid w:val="1E0F6CBE"/>
     <w:multiLevelType w:val="hybridMultilevel"/>
     <w:tmpl w:val="EFFADB86"/>
@@ -14808,7 +16066,7 @@
       <w:lvlJc w:val="left"/>
     </w:lvl>
   </w:abstractNum>
-  <w:abstractNum w:abstractNumId="4" w15:restartNumberingAfterBreak="0">
+  <w:abstractNum w:abstractNumId="5" w15:restartNumberingAfterBreak="0">
     <w:nsid w:val="2E3843B3"/>
     <w:multiLevelType w:val="hybridMultilevel"/>
     <w:tmpl w:val="70C0D4F4"/>
@@ -14894,7 +16152,7 @@
       </w:pPr>
     </w:lvl>
   </w:abstractNum>
-  <w:abstractNum w:abstractNumId="5" w15:restartNumberingAfterBreak="0">
+  <w:abstractNum w:abstractNumId="6" w15:restartNumberingAfterBreak="0">
     <w:nsid w:val="2F771872"/>
     <w:multiLevelType w:val="hybridMultilevel"/>
     <w:tmpl w:val="AEEAD6EE"/>
@@ -14951,7 +16209,7 @@
       <w:lvlJc w:val="left"/>
     </w:lvl>
   </w:abstractNum>
-  <w:abstractNum w:abstractNumId="6" w15:restartNumberingAfterBreak="0">
+  <w:abstractNum w:abstractNumId="7" w15:restartNumberingAfterBreak="0">
     <w:nsid w:val="322A294A"/>
     <w:multiLevelType w:val="hybridMultilevel"/>
     <w:tmpl w:val="8898C1E6"/>
@@ -15064,7 +16322,7 @@
       </w:rPr>
     </w:lvl>
   </w:abstractNum>
-  <w:abstractNum w:abstractNumId="7" w15:restartNumberingAfterBreak="0">
+  <w:abstractNum w:abstractNumId="8" w15:restartNumberingAfterBreak="0">
     <w:nsid w:val="324A0808"/>
     <w:multiLevelType w:val="hybridMultilevel"/>
     <w:tmpl w:val="394204C6"/>
@@ -15118,7 +16376,7 @@
       <w:lvlJc w:val="left"/>
     </w:lvl>
   </w:abstractNum>
-  <w:abstractNum w:abstractNumId="8" w15:restartNumberingAfterBreak="0">
+  <w:abstractNum w:abstractNumId="9" w15:restartNumberingAfterBreak="0">
     <w:nsid w:val="3E6F65A7"/>
     <w:multiLevelType w:val="hybridMultilevel"/>
     <w:tmpl w:val="0420A596"/>
@@ -15172,7 +16430,233 @@
       <w:lvlJc w:val="left"/>
     </w:lvl>
   </w:abstractNum>
-  <w:abstractNum w:abstractNumId="9" w15:restartNumberingAfterBreak="0">
+  <w:abstractNum w:abstractNumId="10" w15:restartNumberingAfterBreak="0">
+    <w:nsid w:val="45080AE2"/>
+    <w:multiLevelType w:val="hybridMultilevel"/>
+    <w:tmpl w:val="84B0E2D0"/>
+    <w:lvl w:ilvl="0" w:tplc="10090001">
+      <w:start w:val="1"/>
+      <w:numFmt w:val="bullet"/>
+      <w:lvlText w:val=""/>
+      <w:lvlJc w:val="left"/>
+      <w:pPr>
+        <w:ind w:left="720" w:hanging="360"/>
+      </w:pPr>
+      <w:rPr>
+        <w:rFonts w:ascii="Symbol" w:hAnsi="Symbol" w:hint="default"/>
+      </w:rPr>
+    </w:lvl>
+    <w:lvl w:ilvl="1" w:tplc="10090003">
+      <w:start w:val="1"/>
+      <w:numFmt w:val="bullet"/>
+      <w:lvlText w:val="o"/>
+      <w:lvlJc w:val="left"/>
+      <w:pPr>
+        <w:ind w:left="1440" w:hanging="360"/>
+      </w:pPr>
+      <w:rPr>
+        <w:rFonts w:ascii="Courier New" w:hAnsi="Courier New" w:cs="Courier New" w:hint="default"/>
+      </w:rPr>
+    </w:lvl>
+    <w:lvl w:ilvl="2" w:tplc="10090005" w:tentative="1">
+      <w:start w:val="1"/>
+      <w:numFmt w:val="bullet"/>
+      <w:lvlText w:val=""/>
+      <w:lvlJc w:val="left"/>
+      <w:pPr>
+        <w:ind w:left="2160" w:hanging="360"/>
+      </w:pPr>
+      <w:rPr>
+        <w:rFonts w:ascii="Wingdings" w:hAnsi="Wingdings" w:hint="default"/>
+      </w:rPr>
+    </w:lvl>
+    <w:lvl w:ilvl="3" w:tplc="10090001" w:tentative="1">
+      <w:start w:val="1"/>
+      <w:numFmt w:val="bullet"/>
+      <w:lvlText w:val=""/>
+      <w:lvlJc w:val="left"/>
+      <w:pPr>
+        <w:ind w:left="2880" w:hanging="360"/>
+      </w:pPr>
+      <w:rPr>
+        <w:rFonts w:ascii="Symbol" w:hAnsi="Symbol" w:hint="default"/>
+      </w:rPr>
+    </w:lvl>
+    <w:lvl w:ilvl="4" w:tplc="10090003" w:tentative="1">
+      <w:start w:val="1"/>
+      <w:numFmt w:val="bullet"/>
+      <w:lvlText w:val="o"/>
+      <w:lvlJc w:val="left"/>
+      <w:pPr>
+        <w:ind w:left="3600" w:hanging="360"/>
+      </w:pPr>
+      <w:rPr>
+        <w:rFonts w:ascii="Courier New" w:hAnsi="Courier New" w:cs="Courier New" w:hint="default"/>
+      </w:rPr>
+    </w:lvl>
+    <w:lvl w:ilvl="5" w:tplc="10090005" w:tentative="1">
+      <w:start w:val="1"/>
+      <w:numFmt w:val="bullet"/>
+      <w:lvlText w:val=""/>
+      <w:lvlJc w:val="left"/>
+      <w:pPr>
+        <w:ind w:left="4320" w:hanging="360"/>
+      </w:pPr>
+      <w:rPr>
+        <w:rFonts w:ascii="Wingdings" w:hAnsi="Wingdings" w:hint="default"/>
+      </w:rPr>
+    </w:lvl>
+    <w:lvl w:ilvl="6" w:tplc="10090001" w:tentative="1">
+      <w:start w:val="1"/>
+      <w:numFmt w:val="bullet"/>
+      <w:lvlText w:val=""/>
+      <w:lvlJc w:val="left"/>
+      <w:pPr>
+        <w:ind w:left="5040" w:hanging="360"/>
+      </w:pPr>
+      <w:rPr>
+        <w:rFonts w:ascii="Symbol" w:hAnsi="Symbol" w:hint="default"/>
+      </w:rPr>
+    </w:lvl>
+    <w:lvl w:ilvl="7" w:tplc="10090003" w:tentative="1">
+      <w:start w:val="1"/>
+      <w:numFmt w:val="bullet"/>
+      <w:lvlText w:val="o"/>
+      <w:lvlJc w:val="left"/>
+      <w:pPr>
+        <w:ind w:left="5760" w:hanging="360"/>
+      </w:pPr>
+      <w:rPr>
+        <w:rFonts w:ascii="Courier New" w:hAnsi="Courier New" w:cs="Courier New" w:hint="default"/>
+      </w:rPr>
+    </w:lvl>
+    <w:lvl w:ilvl="8" w:tplc="10090005" w:tentative="1">
+      <w:start w:val="1"/>
+      <w:numFmt w:val="bullet"/>
+      <w:lvlText w:val=""/>
+      <w:lvlJc w:val="left"/>
+      <w:pPr>
+        <w:ind w:left="6480" w:hanging="360"/>
+      </w:pPr>
+      <w:rPr>
+        <w:rFonts w:ascii="Wingdings" w:hAnsi="Wingdings" w:hint="default"/>
+      </w:rPr>
+    </w:lvl>
+  </w:abstractNum>
+  <w:abstractNum w:abstractNumId="11" w15:restartNumberingAfterBreak="0">
+    <w:nsid w:val="456505AF"/>
+    <w:multiLevelType w:val="hybridMultilevel"/>
+    <w:tmpl w:val="98A0AB34"/>
+    <w:lvl w:ilvl="0" w:tplc="10090001">
+      <w:start w:val="1"/>
+      <w:numFmt w:val="bullet"/>
+      <w:lvlText w:val=""/>
+      <w:lvlJc w:val="left"/>
+      <w:pPr>
+        <w:ind w:left="720" w:hanging="360"/>
+      </w:pPr>
+      <w:rPr>
+        <w:rFonts w:ascii="Symbol" w:hAnsi="Symbol" w:hint="default"/>
+      </w:rPr>
+    </w:lvl>
+    <w:lvl w:ilvl="1" w:tplc="10090003">
+      <w:start w:val="1"/>
+      <w:numFmt w:val="bullet"/>
+      <w:lvlText w:val="o"/>
+      <w:lvlJc w:val="left"/>
+      <w:pPr>
+        <w:ind w:left="1440" w:hanging="360"/>
+      </w:pPr>
+      <w:rPr>
+        <w:rFonts w:ascii="Courier New" w:hAnsi="Courier New" w:cs="Courier New" w:hint="default"/>
+      </w:rPr>
+    </w:lvl>
+    <w:lvl w:ilvl="2" w:tplc="10090005" w:tentative="1">
+      <w:start w:val="1"/>
+      <w:numFmt w:val="bullet"/>
+      <w:lvlText w:val=""/>
+      <w:lvlJc w:val="left"/>
+      <w:pPr>
+        <w:ind w:left="2160" w:hanging="360"/>
+      </w:pPr>
+      <w:rPr>
+        <w:rFonts w:ascii="Wingdings" w:hAnsi="Wingdings" w:hint="default"/>
+      </w:rPr>
+    </w:lvl>
+    <w:lvl w:ilvl="3" w:tplc="10090001" w:tentative="1">
+      <w:start w:val="1"/>
+      <w:numFmt w:val="bullet"/>
+      <w:lvlText w:val=""/>
+      <w:lvlJc w:val="left"/>
+      <w:pPr>
+        <w:ind w:left="2880" w:hanging="360"/>
+      </w:pPr>
+      <w:rPr>
+        <w:rFonts w:ascii="Symbol" w:hAnsi="Symbol" w:hint="default"/>
+      </w:rPr>
+    </w:lvl>
+    <w:lvl w:ilvl="4" w:tplc="10090003" w:tentative="1">
+      <w:start w:val="1"/>
+      <w:numFmt w:val="bullet"/>
+      <w:lvlText w:val="o"/>
+      <w:lvlJc w:val="left"/>
+      <w:pPr>
+        <w:ind w:left="3600" w:hanging="360"/>
+      </w:pPr>
+      <w:rPr>
+        <w:rFonts w:ascii="Courier New" w:hAnsi="Courier New" w:cs="Courier New" w:hint="default"/>
+      </w:rPr>
+    </w:lvl>
+    <w:lvl w:ilvl="5" w:tplc="10090005" w:tentative="1">
+      <w:start w:val="1"/>
+      <w:numFmt w:val="bullet"/>
+      <w:lvlText w:val=""/>
+      <w:lvlJc w:val="left"/>
+      <w:pPr>
+        <w:ind w:left="4320" w:hanging="360"/>
+      </w:pPr>
+      <w:rPr>
+        <w:rFonts w:ascii="Wingdings" w:hAnsi="Wingdings" w:hint="default"/>
+      </w:rPr>
+    </w:lvl>
+    <w:lvl w:ilvl="6" w:tplc="10090001" w:tentative="1">
+      <w:start w:val="1"/>
+      <w:numFmt w:val="bullet"/>
+      <w:lvlText w:val=""/>
+      <w:lvlJc w:val="left"/>
+      <w:pPr>
+        <w:ind w:left="5040" w:hanging="360"/>
+      </w:pPr>
+      <w:rPr>
+        <w:rFonts w:ascii="Symbol" w:hAnsi="Symbol" w:hint="default"/>
+      </w:rPr>
+    </w:lvl>
+    <w:lvl w:ilvl="7" w:tplc="10090003" w:tentative="1">
+      <w:start w:val="1"/>
+      <w:numFmt w:val="bullet"/>
+      <w:lvlText w:val="o"/>
+      <w:lvlJc w:val="left"/>
+      <w:pPr>
+        <w:ind w:left="5760" w:hanging="360"/>
+      </w:pPr>
+      <w:rPr>
+        <w:rFonts w:ascii="Courier New" w:hAnsi="Courier New" w:cs="Courier New" w:hint="default"/>
+      </w:rPr>
+    </w:lvl>
+    <w:lvl w:ilvl="8" w:tplc="10090005" w:tentative="1">
+      <w:start w:val="1"/>
+      <w:numFmt w:val="bullet"/>
+      <w:lvlText w:val=""/>
+      <w:lvlJc w:val="left"/>
+      <w:pPr>
+        <w:ind w:left="6480" w:hanging="360"/>
+      </w:pPr>
+      <w:rPr>
+        <w:rFonts w:ascii="Wingdings" w:hAnsi="Wingdings" w:hint="default"/>
+      </w:rPr>
+    </w:lvl>
+  </w:abstractNum>
+  <w:abstractNum w:abstractNumId="12" w15:restartNumberingAfterBreak="0">
     <w:nsid w:val="491F65D5"/>
     <w:multiLevelType w:val="hybridMultilevel"/>
     <w:tmpl w:val="F7A657A2"/>
@@ -15226,7 +16710,7 @@
       <w:lvlJc w:val="left"/>
     </w:lvl>
   </w:abstractNum>
-  <w:abstractNum w:abstractNumId="10" w15:restartNumberingAfterBreak="0">
+  <w:abstractNum w:abstractNumId="13" w15:restartNumberingAfterBreak="0">
     <w:nsid w:val="4FE66614"/>
     <w:multiLevelType w:val="hybridMultilevel"/>
     <w:tmpl w:val="D228CB58"/>
@@ -15280,7 +16764,7 @@
       <w:lvlJc w:val="left"/>
     </w:lvl>
   </w:abstractNum>
-  <w:abstractNum w:abstractNumId="11" w15:restartNumberingAfterBreak="0">
+  <w:abstractNum w:abstractNumId="14" w15:restartNumberingAfterBreak="0">
     <w:nsid w:val="56BD566A"/>
     <w:multiLevelType w:val="hybridMultilevel"/>
     <w:tmpl w:val="B2CCDF4E"/>
@@ -15337,7 +16821,7 @@
       <w:lvlJc w:val="left"/>
     </w:lvl>
   </w:abstractNum>
-  <w:abstractNum w:abstractNumId="12" w15:restartNumberingAfterBreak="0">
+  <w:abstractNum w:abstractNumId="15" w15:restartNumberingAfterBreak="0">
     <w:nsid w:val="66284918"/>
     <w:multiLevelType w:val="hybridMultilevel"/>
     <w:tmpl w:val="3F948174"/>
@@ -15394,7 +16878,7 @@
       <w:lvlJc w:val="left"/>
     </w:lvl>
   </w:abstractNum>
-  <w:abstractNum w:abstractNumId="13" w15:restartNumberingAfterBreak="0">
+  <w:abstractNum w:abstractNumId="16" w15:restartNumberingAfterBreak="0">
     <w:nsid w:val="66A508F9"/>
     <w:multiLevelType w:val="hybridMultilevel"/>
     <w:tmpl w:val="EF08CD04"/>
@@ -15448,7 +16932,7 @@
       <w:lvlJc w:val="left"/>
     </w:lvl>
   </w:abstractNum>
-  <w:abstractNum w:abstractNumId="14" w15:restartNumberingAfterBreak="0">
+  <w:abstractNum w:abstractNumId="17" w15:restartNumberingAfterBreak="0">
     <w:nsid w:val="6EE16C95"/>
     <w:multiLevelType w:val="hybridMultilevel"/>
     <w:tmpl w:val="A9023AFE"/>
@@ -15502,7 +16986,7 @@
       <w:lvlJc w:val="left"/>
     </w:lvl>
   </w:abstractNum>
-  <w:abstractNum w:abstractNumId="15" w15:restartNumberingAfterBreak="0">
+  <w:abstractNum w:abstractNumId="18" w15:restartNumberingAfterBreak="0">
     <w:nsid w:val="6F001C5E"/>
     <w:multiLevelType w:val="multilevel"/>
     <w:tmpl w:val="1194CC5A"/>
@@ -15615,7 +17099,7 @@
       </w:rPr>
     </w:lvl>
   </w:abstractNum>
-  <w:abstractNum w:abstractNumId="16" w15:restartNumberingAfterBreak="0">
+  <w:abstractNum w:abstractNumId="19" w15:restartNumberingAfterBreak="0">
     <w:nsid w:val="73C63637"/>
     <w:multiLevelType w:val="hybridMultilevel"/>
     <w:tmpl w:val="25768528"/>
@@ -15669,7 +17153,7 @@
       <w:lvlJc w:val="left"/>
     </w:lvl>
   </w:abstractNum>
-  <w:abstractNum w:abstractNumId="17" w15:restartNumberingAfterBreak="0">
+  <w:abstractNum w:abstractNumId="20" w15:restartNumberingAfterBreak="0">
     <w:nsid w:val="771B0606"/>
     <w:multiLevelType w:val="hybridMultilevel"/>
     <w:tmpl w:val="7E7E213A"/>
@@ -15723,7 +17207,7 @@
       <w:lvlJc w:val="left"/>
     </w:lvl>
   </w:abstractNum>
-  <w:abstractNum w:abstractNumId="18" w15:restartNumberingAfterBreak="0">
+  <w:abstractNum w:abstractNumId="21" w15:restartNumberingAfterBreak="0">
     <w:nsid w:val="77E25B7F"/>
     <w:multiLevelType w:val="multilevel"/>
     <w:tmpl w:val="B4944164"/>
@@ -15872,7 +17356,7 @@
       </w:rPr>
     </w:lvl>
   </w:abstractNum>
-  <w:abstractNum w:abstractNumId="19" w15:restartNumberingAfterBreak="0">
+  <w:abstractNum w:abstractNumId="22" w15:restartNumberingAfterBreak="0">
     <w:nsid w:val="79D526B7"/>
     <w:multiLevelType w:val="hybridMultilevel"/>
     <w:tmpl w:val="CBC6272A"/>
@@ -15927,55 +17411,55 @@
     </w:lvl>
   </w:abstractNum>
   <w:num w:numId="1" w16cid:durableId="190918051">
+    <w:abstractNumId w:val="5"/>
+    <w:lvlOverride w:ilvl="0">
+      <w:startOverride w:val="1"/>
+    </w:lvlOverride>
+  </w:num>
+  <w:num w:numId="2" w16cid:durableId="2099518897">
+    <w:abstractNumId w:val="13"/>
+    <w:lvlOverride w:ilvl="0">
+      <w:startOverride w:val="1"/>
+    </w:lvlOverride>
+  </w:num>
+  <w:num w:numId="3" w16cid:durableId="1766463078">
+    <w:abstractNumId w:val="2"/>
+    <w:lvlOverride w:ilvl="0">
+      <w:startOverride w:val="1"/>
+    </w:lvlOverride>
+  </w:num>
+  <w:num w:numId="4" w16cid:durableId="1541046227">
+    <w:abstractNumId w:val="9"/>
+    <w:lvlOverride w:ilvl="0">
+      <w:startOverride w:val="1"/>
+    </w:lvlOverride>
+  </w:num>
+  <w:num w:numId="5" w16cid:durableId="1268074818">
+    <w:abstractNumId w:val="3"/>
+    <w:lvlOverride w:ilvl="0">
+      <w:startOverride w:val="1"/>
+    </w:lvlOverride>
+  </w:num>
+  <w:num w:numId="6" w16cid:durableId="44567721">
+    <w:abstractNumId w:val="22"/>
+    <w:lvlOverride w:ilvl="0">
+      <w:startOverride w:val="1"/>
+    </w:lvlOverride>
+  </w:num>
+  <w:num w:numId="7" w16cid:durableId="1223709923">
     <w:abstractNumId w:val="4"/>
     <w:lvlOverride w:ilvl="0">
       <w:startOverride w:val="1"/>
     </w:lvlOverride>
   </w:num>
-  <w:num w:numId="2" w16cid:durableId="2099518897">
-    <w:abstractNumId w:val="10"/>
-    <w:lvlOverride w:ilvl="0">
-      <w:startOverride w:val="1"/>
-    </w:lvlOverride>
-  </w:num>
-  <w:num w:numId="3" w16cid:durableId="1766463078">
-    <w:abstractNumId w:val="1"/>
-    <w:lvlOverride w:ilvl="0">
-      <w:startOverride w:val="1"/>
-    </w:lvlOverride>
-  </w:num>
-  <w:num w:numId="4" w16cid:durableId="1541046227">
-    <w:abstractNumId w:val="8"/>
-    <w:lvlOverride w:ilvl="0">
-      <w:startOverride w:val="1"/>
-    </w:lvlOverride>
-  </w:num>
-  <w:num w:numId="5" w16cid:durableId="1268074818">
-    <w:abstractNumId w:val="2"/>
-    <w:lvlOverride w:ilvl="0">
-      <w:startOverride w:val="1"/>
-    </w:lvlOverride>
-  </w:num>
-  <w:num w:numId="6" w16cid:durableId="44567721">
-    <w:abstractNumId w:val="19"/>
-    <w:lvlOverride w:ilvl="0">
-      <w:startOverride w:val="1"/>
-    </w:lvlOverride>
-  </w:num>
-  <w:num w:numId="7" w16cid:durableId="1223709923">
-    <w:abstractNumId w:val="3"/>
-    <w:lvlOverride w:ilvl="0">
-      <w:startOverride w:val="1"/>
-    </w:lvlOverride>
-  </w:num>
   <w:num w:numId="8" w16cid:durableId="1264802898">
-    <w:abstractNumId w:val="13"/>
+    <w:abstractNumId w:val="16"/>
     <w:lvlOverride w:ilvl="0">
       <w:startOverride w:val="1"/>
     </w:lvlOverride>
   </w:num>
   <w:num w:numId="9" w16cid:durableId="1574655646">
-    <w:abstractNumId w:val="7"/>
+    <w:abstractNumId w:val="8"/>
   </w:num>
   <w:num w:numId="10" w16cid:durableId="93134052">
     <w:abstractNumId w:val="0"/>
@@ -15984,65 +17468,66 @@
     </w:lvlOverride>
   </w:num>
   <w:num w:numId="11" w16cid:durableId="2037345596">
+    <w:abstractNumId w:val="20"/>
+    <w:lvlOverride w:ilvl="0">
+      <w:startOverride w:val="1"/>
+    </w:lvlOverride>
+  </w:num>
+  <w:num w:numId="12" w16cid:durableId="756754956">
+    <w:abstractNumId w:val="12"/>
+    <w:lvlOverride w:ilvl="0">
+      <w:startOverride w:val="1"/>
+    </w:lvlOverride>
+  </w:num>
+  <w:num w:numId="13" w16cid:durableId="1503011814">
     <w:abstractNumId w:val="17"/>
     <w:lvlOverride w:ilvl="0">
       <w:startOverride w:val="1"/>
     </w:lvlOverride>
   </w:num>
-  <w:num w:numId="12" w16cid:durableId="756754956">
-    <w:abstractNumId w:val="9"/>
-    <w:lvlOverride w:ilvl="0">
-      <w:startOverride w:val="1"/>
-    </w:lvlOverride>
-  </w:num>
-  <w:num w:numId="13" w16cid:durableId="1503011814">
-    <w:abstractNumId w:val="14"/>
-    <w:lvlOverride w:ilvl="0">
-      <w:startOverride w:val="1"/>
-    </w:lvlOverride>
-  </w:num>
   <w:num w:numId="14" w16cid:durableId="222638778">
-    <w:abstractNumId w:val="16"/>
+    <w:abstractNumId w:val="19"/>
     <w:lvlOverride w:ilvl="0">
       <w:startOverride w:val="1"/>
     </w:lvlOverride>
   </w:num>
   <w:num w:numId="15" w16cid:durableId="314146798">
-    <w:abstractNumId w:val="7"/>
+    <w:abstractNumId w:val="8"/>
   </w:num>
   <w:num w:numId="16" w16cid:durableId="1662932008">
-    <w:abstractNumId w:val="11"/>
+    <w:abstractNumId w:val="14"/>
   </w:num>
   <w:num w:numId="17" w16cid:durableId="1662655430">
-    <w:abstractNumId w:val="6"/>
+    <w:abstractNumId w:val="7"/>
   </w:num>
   <w:num w:numId="18" w16cid:durableId="168835459">
     <w:abstractNumId w:val="0"/>
   </w:num>
   <w:num w:numId="19" w16cid:durableId="1441103040">
-    <w:abstractNumId w:val="12"/>
+    <w:abstractNumId w:val="15"/>
   </w:num>
   <w:num w:numId="20" w16cid:durableId="644547121">
-    <w:abstractNumId w:val="15"/>
+    <w:abstractNumId w:val="18"/>
   </w:num>
   <w:num w:numId="21" w16cid:durableId="1762095117">
-    <w:abstractNumId w:val="16"/>
+    <w:abstractNumId w:val="19"/>
   </w:num>
   <w:num w:numId="22" w16cid:durableId="2054887457">
-    <w:abstractNumId w:val="5"/>
+    <w:abstractNumId w:val="6"/>
   </w:num>
   <w:num w:numId="23" w16cid:durableId="1940288997">
-    <w:abstractNumId w:val="18"/>
+    <w:abstractNumId w:val="21"/>
+  </w:num>
+  <w:num w:numId="24" w16cid:durableId="511265677">
+    <w:abstractNumId w:val="1"/>
+  </w:num>
+  <w:num w:numId="25" w16cid:durableId="132454976">
+    <w:abstractNumId w:val="10"/>
+  </w:num>
+  <w:num w:numId="26" w16cid:durableId="642393441">
+    <w:abstractNumId w:val="11"/>
   </w:num>
 </w:numbering>
-</file>
-
-<file path=word/people.xml><?xml version="1.0" encoding="utf-8"?>
-<w15:people xmlns:wpc="http://schemas.microsoft.com/office/word/2010/wordprocessingCanvas" xmlns:cx="http://schemas.microsoft.com/office/drawing/2014/chartex" xmlns:cx1="http://schemas.microsoft.com/office/drawing/2015/9/8/chartex" xmlns:cx2="http://schemas.microsoft.com/office/drawing/2015/10/21/chartex" xmlns:cx3="http://schemas.microsoft.com/office/drawing/2016/5/9/chartex" xmlns:cx4="http://schemas.microsoft.com/office/drawing/2016/5/10/chartex" xmlns:cx5="http://schemas.microsoft.com/office/drawing/2016/5/11/chartex" xmlns:cx6="http://schemas.microsoft.com/office/drawing/2016/5/12/chartex" xmlns:cx7="http://schemas.microsoft.com/office/drawing/2016/5/13/chartex" xmlns:cx8="http://schemas.microsoft.com/office/drawing/2016/5/14/chartex" xmlns:mc="http://schemas.openxmlformats.org/markup-compatibility/2006" xmlns:aink="http://schemas.microsoft.com/office/drawing/2016/ink" xmlns:am3d="http://schemas.microsoft.com/office/drawing/2017/model3d" xmlns:o="urn:schemas-microsoft-com:office:office" xmlns:oel="http://schemas.microsoft.com/office/2019/extlst" xmlns:r="http://schemas.openxmlformats.org/officeDocument/2006/relationships" xmlns:m="http://schemas.openxmlformats.org/officeDocument/2006/math" xmlns:v="urn:schemas-microsoft-com:vml" xmlns:wp14="http://schemas.microsoft.com/office/word/2010/wordprocessingDrawing" xmlns:wp="http://schemas.openxmlformats.org/drawingml/2006/wordprocessingDrawing" xmlns:w10="urn:schemas-microsoft-com:office:word" xmlns:w="http://schemas.openxmlformats.org/wordprocessingml/2006/main" xmlns:w14="http://schemas.microsoft.com/office/word/2010/wordml" xmlns:w15="http://schemas.microsoft.com/office/word/2012/wordml" xmlns:w16cex="http://schemas.microsoft.com/office/word/2018/wordml/cex" xmlns:w16cid="http://schemas.microsoft.com/office/word/2016/wordml/cid" xmlns:w16="http://schemas.microsoft.com/office/word/2018/wordml" xmlns:w16du="http://schemas.microsoft.com/office/word/2023/wordml/word16du" xmlns:w16sdtdh="http://schemas.microsoft.com/office/word/2020/wordml/sdtdatahash" xmlns:w16sdtfl="http://schemas.microsoft.com/office/word/2024/wordml/sdtformatlock" xmlns:w16se="http://schemas.microsoft.com/office/word/2015/wordml/symex" xmlns:wpg="http://schemas.microsoft.com/office/word/2010/wordprocessingGroup" xmlns:wpi="http://schemas.microsoft.com/office/word/2010/wordprocessingInk" xmlns:wne="http://schemas.microsoft.com/office/word/2006/wordml" xmlns:wps="http://schemas.microsoft.com/office/word/2010/wordprocessingShape" mc:Ignorable="w14 w15 w16se w16cid w16 w16cex w16sdtdh w16sdtfl w16du wp14">
-  <w15:person w15:author="William Harford">
-    <w15:presenceInfo w15:providerId="AD" w15:userId="S::bill@natureanalytics.onmicrosoft.com::e591495c-2990-47e9-a470-9add08f6f9bd"/>
-  </w15:person>
-</w15:people>
 </file>
 
 <file path=word/styles.xml><?xml version="1.0" encoding="utf-8"?>
@@ -16537,6 +18022,7 @@
   <w:style w:type="character" w:default="1" w:styleId="DefaultParagraphFont">
     <w:name w:val="Default Paragraph Font"/>
     <w:uiPriority w:val="1"/>
+    <w:semiHidden/>
     <w:unhideWhenUsed/>
   </w:style>
   <w:style w:type="table" w:default="1" w:styleId="TableNormal">

</xml_diff>